<commit_message>
Merge Claude resume rewrite with grokbot project additions.
Bring Claude's PR number, Expedia metrics, paired courses, and skills onto the site, and add the six featured projects to the one-page Word resume.
</commit_message>
<xml_diff>
--- a/NAVEEN US Resume 2026.docx
+++ b/NAVEEN US Resume 2026.docx
@@ -4,7 +4,7 @@
   <w:body>
     <w:p>
       <w:pPr>
-        <w:spacing w:before="0" w:after="20" w:line="240" w:lineRule="auto"/>
+        <w:spacing w:before="0" w:after="8" w:line="230" w:lineRule="auto"/>
         <w:ind w:left="0" w:right="0" w:firstLine="0"/>
         <w:rPr>
           <w:rFonts w:ascii="Calibri" w:cs="Calibri" w:eastAsia="Calibri" w:hAnsi="Calibri"/>
@@ -135,10 +135,10 @@
         </w:tblBorders>
         <w:tblLayout w:type="fixed"/>
         <w:tblCellMar>
-          <w:top w:w="30" w:type="dxa"/>
-          <w:left w:w="72" w:type="dxa"/>
-          <w:bottom w:w="30" w:type="dxa"/>
-          <w:right w:w="72" w:type="dxa"/>
+          <w:top w:w="10" w:type="dxa"/>
+          <w:left w:w="56" w:type="dxa"/>
+          <w:bottom w:w="10" w:type="dxa"/>
+          <w:right w:w="56" w:type="dxa"/>
         </w:tblCellMar>
         <w:tblLook w:val="0600"/>
       </w:tblPr>
@@ -182,7 +182,7 @@
           </w:tcPr>
           <w:p>
             <w:pPr>
-              <w:spacing w:before="0" w:after="8" w:line="240" w:lineRule="auto"/>
+              <w:spacing w:before="0" w:after="2" w:line="220" w:lineRule="auto"/>
               <w:ind w:left="0" w:right="0" w:hanging="0"/>
               <w:contextualSpacing w:val="1"/>
               <w:jc w:val="center"/>
@@ -224,7 +224,7 @@
           </w:tcPr>
           <w:p>
             <w:pPr>
-              <w:spacing w:before="0" w:after="8" w:line="240" w:lineRule="auto"/>
+              <w:spacing w:before="0" w:after="2" w:line="220" w:lineRule="auto"/>
               <w:ind w:left="0" w:right="0" w:hanging="0"/>
               <w:contextualSpacing w:val="1"/>
               <w:jc w:val="center"/>
@@ -258,7 +258,7 @@
           </w:tcPr>
           <w:p>
             <w:pPr>
-              <w:spacing w:before="0" w:after="8" w:line="240" w:lineRule="auto"/>
+              <w:spacing w:before="0" w:after="2" w:line="220" w:lineRule="auto"/>
               <w:ind w:left="0" w:right="0" w:hanging="0"/>
               <w:contextualSpacing w:val="1"/>
               <w:jc w:val="center"/>
@@ -292,7 +292,7 @@
           </w:tcPr>
           <w:p>
             <w:pPr>
-              <w:spacing w:before="0" w:after="8" w:line="240" w:lineRule="auto"/>
+              <w:spacing w:before="0" w:after="2" w:line="220" w:lineRule="auto"/>
               <w:ind w:left="0" w:right="0" w:hanging="0"/>
               <w:contextualSpacing w:val="1"/>
               <w:jc w:val="center"/>
@@ -326,7 +326,7 @@
           </w:tcPr>
           <w:p>
             <w:pPr>
-              <w:spacing w:before="0" w:after="8" w:line="240" w:lineRule="auto"/>
+              <w:spacing w:before="0" w:after="2" w:line="220" w:lineRule="auto"/>
               <w:ind w:left="0" w:right="0" w:hanging="0"/>
               <w:contextualSpacing w:val="1"/>
               <w:jc w:val="center"/>
@@ -365,7 +365,7 @@
           </w:tcPr>
           <w:p>
             <w:pPr>
-              <w:spacing w:before="0" w:after="8" w:line="240" w:lineRule="auto"/>
+              <w:spacing w:before="0" w:after="2" w:line="220" w:lineRule="auto"/>
               <w:ind w:left="0" w:right="0" w:hanging="0"/>
               <w:contextualSpacing w:val="1"/>
               <w:jc w:val="center"/>
@@ -394,7 +394,7 @@
           </w:tcPr>
           <w:p>
             <w:pPr>
-              <w:spacing w:before="0" w:after="8" w:line="240" w:lineRule="auto"/>
+              <w:spacing w:before="0" w:after="2" w:line="220" w:lineRule="auto"/>
               <w:ind w:left="0" w:right="0" w:hanging="0"/>
               <w:contextualSpacing w:val="1"/>
               <w:jc w:val="center"/>
@@ -423,7 +423,7 @@
           </w:tcPr>
           <w:p>
             <w:pPr>
-              <w:spacing w:before="0" w:after="8" w:line="240" w:lineRule="auto"/>
+              <w:spacing w:before="0" w:after="2" w:line="220" w:lineRule="auto"/>
               <w:ind w:left="0" w:right="0" w:hanging="0"/>
               <w:contextualSpacing w:val="1"/>
               <w:jc w:val="center"/>
@@ -452,7 +452,7 @@
           </w:tcPr>
           <w:p>
             <w:pPr>
-              <w:spacing w:before="0" w:after="8" w:line="240" w:lineRule="auto"/>
+              <w:spacing w:before="0" w:after="2" w:line="220" w:lineRule="auto"/>
               <w:ind w:left="0" w:right="0" w:hanging="0"/>
               <w:contextualSpacing w:val="1"/>
               <w:jc w:val="center"/>
@@ -487,7 +487,7 @@
           </w:tcPr>
           <w:p>
             <w:pPr>
-              <w:spacing w:before="0" w:after="8" w:line="240" w:lineRule="auto"/>
+              <w:spacing w:before="0" w:after="2" w:line="220" w:lineRule="auto"/>
               <w:ind w:left="0" w:right="0" w:hanging="0"/>
               <w:contextualSpacing w:val="1"/>
               <w:jc w:val="center"/>
@@ -538,7 +538,7 @@
           </w:tcPr>
           <w:p>
             <w:pPr>
-              <w:spacing w:before="0" w:after="8" w:line="240" w:lineRule="auto"/>
+              <w:spacing w:before="0" w:after="2" w:line="220" w:lineRule="auto"/>
               <w:ind w:left="0" w:right="0" w:hanging="0"/>
               <w:contextualSpacing w:val="1"/>
               <w:jc w:val="center"/>
@@ -567,7 +567,7 @@
           </w:tcPr>
           <w:p>
             <w:pPr>
-              <w:spacing w:before="0" w:after="8" w:line="240" w:lineRule="auto"/>
+              <w:spacing w:before="0" w:after="2" w:line="220" w:lineRule="auto"/>
               <w:ind w:left="0" w:right="0" w:hanging="0"/>
               <w:contextualSpacing w:val="1"/>
               <w:jc w:val="center"/>
@@ -596,7 +596,7 @@
           </w:tcPr>
           <w:p>
             <w:pPr>
-              <w:spacing w:before="0" w:after="8" w:line="240" w:lineRule="auto"/>
+              <w:spacing w:before="0" w:after="2" w:line="220" w:lineRule="auto"/>
               <w:ind w:left="0" w:right="0" w:hanging="0"/>
               <w:contextualSpacing w:val="1"/>
               <w:jc w:val="center"/>
@@ -631,7 +631,7 @@
           </w:tcPr>
           <w:p>
             <w:pPr>
-              <w:spacing w:before="0" w:after="8" w:line="240" w:lineRule="auto"/>
+              <w:spacing w:before="0" w:after="2" w:line="220" w:lineRule="auto"/>
               <w:ind w:left="0" w:right="0" w:hanging="0"/>
               <w:contextualSpacing w:val="1"/>
               <w:jc w:val="center"/>
@@ -682,7 +682,7 @@
           </w:tcPr>
           <w:p>
             <w:pPr>
-              <w:spacing w:before="0" w:after="8" w:line="240" w:lineRule="auto"/>
+              <w:spacing w:before="0" w:after="2" w:line="220" w:lineRule="auto"/>
               <w:ind w:left="0" w:right="0" w:hanging="0"/>
               <w:contextualSpacing w:val="1"/>
               <w:jc w:val="center"/>
@@ -711,7 +711,7 @@
           </w:tcPr>
           <w:p>
             <w:pPr>
-              <w:spacing w:before="0" w:after="8" w:line="240" w:lineRule="auto"/>
+              <w:spacing w:before="0" w:after="2" w:line="220" w:lineRule="auto"/>
               <w:ind w:left="0" w:right="0" w:hanging="0"/>
               <w:contextualSpacing w:val="1"/>
               <w:jc w:val="center"/>
@@ -740,7 +740,7 @@
           </w:tcPr>
           <w:p>
             <w:pPr>
-              <w:spacing w:before="0" w:after="8" w:line="240" w:lineRule="auto"/>
+              <w:spacing w:before="0" w:after="2" w:line="220" w:lineRule="auto"/>
               <w:ind w:left="0" w:right="0" w:hanging="0"/>
               <w:contextualSpacing w:val="1"/>
               <w:jc w:val="center"/>
@@ -775,7 +775,7 @@
           </w:tcPr>
           <w:p>
             <w:pPr>
-              <w:spacing w:before="0" w:after="8" w:line="240" w:lineRule="auto"/>
+              <w:spacing w:before="0" w:after="2" w:line="220" w:lineRule="auto"/>
               <w:ind w:left="0" w:right="0" w:hanging="0"/>
               <w:contextualSpacing w:val="1"/>
               <w:jc w:val="center"/>
@@ -826,7 +826,7 @@
           </w:tcPr>
           <w:p>
             <w:pPr>
-              <w:spacing w:before="0" w:after="8" w:line="240" w:lineRule="auto"/>
+              <w:spacing w:before="0" w:after="2" w:line="220" w:lineRule="auto"/>
               <w:ind w:left="0" w:right="0" w:hanging="0"/>
               <w:contextualSpacing w:val="1"/>
               <w:jc w:val="center"/>
@@ -855,7 +855,7 @@
           </w:tcPr>
           <w:p>
             <w:pPr>
-              <w:spacing w:before="0" w:after="8" w:line="240" w:lineRule="auto"/>
+              <w:spacing w:before="0" w:after="2" w:line="220" w:lineRule="auto"/>
               <w:ind w:left="0" w:right="0" w:hanging="0"/>
               <w:contextualSpacing w:val="1"/>
               <w:jc w:val="center"/>
@@ -884,7 +884,7 @@
           </w:tcPr>
           <w:p>
             <w:pPr>
-              <w:spacing w:before="0" w:after="8" w:line="240" w:lineRule="auto"/>
+              <w:spacing w:before="0" w:after="2" w:line="220" w:lineRule="auto"/>
               <w:ind w:left="0" w:right="0" w:hanging="0"/>
               <w:contextualSpacing w:val="1"/>
               <w:jc w:val="center"/>
@@ -920,7 +920,7 @@
           </w:tcPr>
           <w:p>
             <w:pPr>
-              <w:spacing w:before="0" w:after="8" w:line="240" w:lineRule="auto"/>
+              <w:spacing w:before="0" w:after="2" w:line="220" w:lineRule="auto"/>
               <w:ind w:left="0" w:right="0" w:hanging="0"/>
               <w:contextualSpacing w:val="1"/>
               <w:jc w:val="center"/>
@@ -946,7 +946,7 @@
           </w:p>
           <w:p>
             <w:pPr>
-              <w:spacing w:before="0" w:after="8" w:line="240" w:lineRule="auto"/>
+              <w:spacing w:before="0" w:after="2" w:line="220" w:lineRule="auto"/>
               <w:ind w:left="0" w:right="0" w:hanging="0"/>
               <w:contextualSpacing w:val="1"/>
               <w:jc w:val="center"/>
@@ -983,7 +983,7 @@
                 <w:ilvl w:val="0"/>
                 <w:numId w:val="3"/>
               </w:numPr>
-              <w:spacing w:before="0" w:after="8" w:line="240" w:lineRule="auto"/>
+              <w:spacing w:before="0" w:after="2" w:line="220" w:lineRule="auto"/>
               <w:ind w:left="158" w:right="0" w:hanging="158"/>
               <w:contextualSpacing w:val="1"/>
               <w:rPr>
@@ -1041,7 +1041,7 @@
                 <w:ilvl w:val="0"/>
                 <w:numId w:val="3"/>
               </w:numPr>
-              <w:spacing w:before="0" w:after="8" w:line="240" w:lineRule="auto"/>
+              <w:spacing w:before="0" w:after="2" w:line="220" w:lineRule="auto"/>
               <w:ind w:left="158" w:right="0" w:hanging="158"/>
               <w:contextualSpacing w:val="1"/>
               <w:rPr>
@@ -1069,71 +1069,6 @@
                 <w:rtl w:val="0"/>
               </w:rPr>
               <w:t xml:space="preserve"> – YouTube productivity monitor on the OpenAI API</w:t>
-            </w:r>
-          </w:p>
-          <w:p>
-            <w:pPr>
-              <w:numPr>
-                <w:ilvl w:val="0"/>
-                <w:numId w:val="3"/>
-              </w:numPr>
-              <w:spacing w:before="0" w:after="8" w:line="240" w:lineRule="auto"/>
-              <w:ind w:left="158" w:right="0" w:hanging="158"/>
-              <w:contextualSpacing w:val="1"/>
-              <w:rPr>
-                <w:rFonts w:ascii="Calibri" w:cs="Calibri" w:eastAsia="Calibri" w:hAnsi="Calibri"/>
-                <w:sz w:val="20"/>
-                <w:szCs w:val="20"/>
-              </w:rPr>
-            </w:pPr>
-            <w:r>
-              <w:rPr>
-                <w:rFonts w:ascii="Calibri" w:cs="Calibri" w:eastAsia="Calibri" w:hAnsi="Calibri"/>
-                <w:sz w:val="20"/>
-                <w:szCs w:val="20"/>
-                <w:rtl w:val="0"/>
-              </w:rPr>
-              <w:t xml:space="preserve">Scored a perfect </w:t>
-            </w:r>
-            <w:r>
-              <w:rPr>
-                <w:rFonts w:ascii="Calibri" w:cs="Calibri" w:eastAsia="Calibri" w:hAnsi="Calibri"/>
-                <w:b w:val="1"/>
-                <w:bCs w:val="1"/>
-                <w:sz w:val="20"/>
-                <w:szCs w:val="20"/>
-                <w:rtl w:val="0"/>
-              </w:rPr>
-              <w:t xml:space="preserve">10.00 CGPA</w:t>
-            </w:r>
-            <w:r>
-              <w:rPr>
-                <w:rFonts w:ascii="Calibri" w:cs="Calibri" w:eastAsia="Calibri" w:hAnsi="Calibri"/>
-                <w:sz w:val="20"/>
-                <w:szCs w:val="20"/>
-                <w:rtl w:val="0"/>
-              </w:rPr>
-              <w:t xml:space="preserve"> in Class X (CBSE) and </w:t>
-            </w:r>
-            <w:r>
-              <w:rPr>
-                <w:rFonts w:ascii="Calibri" w:cs="Calibri" w:eastAsia="Calibri" w:hAnsi="Calibri"/>
-                <w:b w:val="1"/>
-                <w:bCs w:val="1"/>
-                <w:sz w:val="20"/>
-                <w:szCs w:val="20"/>
-                <w:rtl w:val="0"/>
-              </w:rPr>
-              <w:t xml:space="preserve">83.5%</w:t>
-            </w:r>
-            <w:r>
-              <w:rPr>
-                <w:rFonts w:ascii="Calibri" w:cs="Calibri" w:eastAsia="Calibri" w:hAnsi="Calibri"/>
-                <w:sz w:val="20"/>
-                <w:szCs w:val="20"/>
-                <w:rtl w:val="0"/>
-              </w:rPr>
-              <w:t xml:space="preserve"> in Class XII</w:t>
             </w:r>
           </w:p>
         </w:tc>
@@ -1145,7 +1080,7 @@
           </w:tcPr>
           <w:p>
             <w:pPr>
-              <w:spacing w:before="0" w:after="8" w:line="240" w:lineRule="auto"/>
+              <w:spacing w:before="0" w:after="2" w:line="220" w:lineRule="auto"/>
               <w:ind w:left="0" w:right="0" w:hanging="0"/>
               <w:contextualSpacing w:val="1"/>
               <w:jc w:val="center"/>
@@ -1167,7 +1102,7 @@
           </w:p>
           <w:p>
             <w:pPr>
-              <w:spacing w:before="0" w:after="8" w:line="240" w:lineRule="auto"/>
+              <w:spacing w:before="0" w:after="2" w:line="220" w:lineRule="auto"/>
               <w:ind w:left="0" w:right="0" w:hanging="0"/>
               <w:contextualSpacing w:val="1"/>
               <w:jc w:val="center"/>
@@ -1185,28 +1120,6 @@
                 <w:rtl w:val="0"/>
               </w:rPr>
               <w:t xml:space="preserve">2024</w:t>
-            </w:r>
-          </w:p>
-          <w:p>
-            <w:pPr>
-              <w:spacing w:before="0" w:after="8" w:line="240" w:lineRule="auto"/>
-              <w:ind w:left="0" w:right="0" w:hanging="0"/>
-              <w:contextualSpacing w:val="1"/>
-              <w:jc w:val="center"/>
-              <w:rPr>
-                <w:rFonts w:ascii="Calibri" w:cs="Calibri" w:eastAsia="Calibri" w:hAnsi="Calibri"/>
-                <w:sz w:val="20"/>
-                <w:szCs w:val="20"/>
-              </w:rPr>
-            </w:pPr>
-            <w:r>
-              <w:rPr>
-                <w:rFonts w:ascii="Calibri" w:cs="Calibri" w:eastAsia="Calibri" w:hAnsi="Calibri"/>
-                <w:sz w:val="20"/>
-                <w:szCs w:val="20"/>
-                <w:rtl w:val="0"/>
-              </w:rPr>
-              <w:t xml:space="preserve">2017</w:t>
             </w:r>
           </w:p>
         </w:tc>
@@ -1225,7 +1138,7 @@
           </w:tcPr>
           <w:p>
             <w:pPr>
-              <w:spacing w:before="0" w:after="8" w:line="240" w:lineRule="auto"/>
+              <w:spacing w:before="0" w:after="2" w:line="220" w:lineRule="auto"/>
               <w:ind w:left="0" w:right="0" w:hanging="0"/>
               <w:contextualSpacing w:val="1"/>
               <w:jc w:val="center"/>
@@ -1267,7 +1180,7 @@
           </w:tcPr>
           <w:p>
             <w:pPr>
-              <w:spacing w:before="0" w:after="8" w:line="240" w:lineRule="auto"/>
+              <w:spacing w:before="0" w:after="2" w:line="220" w:lineRule="auto"/>
               <w:ind w:left="0" w:right="0" w:hanging="0"/>
               <w:contextualSpacing w:val="1"/>
               <w:jc w:val="center"/>
@@ -1300,7 +1213,7 @@
           </w:tcPr>
           <w:p>
             <w:pPr>
-              <w:spacing w:before="0" w:after="8" w:line="240" w:lineRule="auto"/>
+              <w:spacing w:before="0" w:after="2" w:line="220" w:lineRule="auto"/>
               <w:ind w:left="0" w:right="0" w:hanging="0"/>
               <w:contextualSpacing w:val="1"/>
               <w:jc w:val="center"/>
@@ -1333,7 +1246,7 @@
           </w:tcPr>
           <w:p>
             <w:pPr>
-              <w:spacing w:before="0" w:after="8" w:line="240" w:lineRule="auto"/>
+              <w:spacing w:before="0" w:after="2" w:line="220" w:lineRule="auto"/>
               <w:ind w:left="0" w:right="0" w:hanging="0"/>
               <w:contextualSpacing w:val="1"/>
               <w:jc w:val="center"/>
@@ -1366,7 +1279,7 @@
           </w:tcPr>
           <w:p>
             <w:pPr>
-              <w:spacing w:before="0" w:after="8" w:line="240" w:lineRule="auto"/>
+              <w:spacing w:before="0" w:after="2" w:line="220" w:lineRule="auto"/>
               <w:ind w:left="0" w:right="0" w:hanging="0"/>
               <w:contextualSpacing w:val="1"/>
               <w:jc w:val="center"/>
@@ -1399,7 +1312,7 @@
           </w:tcPr>
           <w:p>
             <w:pPr>
-              <w:spacing w:before="0" w:after="8" w:line="240" w:lineRule="auto"/>
+              <w:spacing w:before="0" w:after="2" w:line="220" w:lineRule="auto"/>
               <w:ind w:left="0" w:right="0" w:hanging="0"/>
               <w:contextualSpacing w:val="1"/>
               <w:jc w:val="center"/>
@@ -1432,7 +1345,7 @@
           </w:tcPr>
           <w:p>
             <w:pPr>
-              <w:spacing w:before="0" w:after="8" w:line="240" w:lineRule="auto"/>
+              <w:spacing w:before="0" w:after="2" w:line="220" w:lineRule="auto"/>
               <w:ind w:left="0" w:right="0" w:hanging="0"/>
               <w:contextualSpacing w:val="1"/>
               <w:jc w:val="center"/>
@@ -1472,7 +1385,7 @@
           </w:tcPr>
           <w:p>
             <w:pPr>
-              <w:spacing w:before="0" w:after="8" w:line="240" w:lineRule="auto"/>
+              <w:spacing w:before="0" w:after="2" w:line="220" w:lineRule="auto"/>
               <w:ind w:left="0" w:right="0" w:hanging="0"/>
               <w:contextualSpacing w:val="1"/>
               <w:jc w:val="center"/>
@@ -1506,7 +1419,7 @@
           </w:tcPr>
           <w:p>
             <w:pPr>
-              <w:spacing w:before="0" w:after="8" w:line="240" w:lineRule="auto"/>
+              <w:spacing w:before="0" w:after="2" w:line="220" w:lineRule="auto"/>
               <w:ind w:left="0" w:right="0" w:hanging="0"/>
               <w:contextualSpacing w:val="1"/>
               <w:jc w:val="center"/>
@@ -1540,7 +1453,7 @@
           </w:tcPr>
           <w:p>
             <w:pPr>
-              <w:spacing w:before="0" w:after="8" w:line="240" w:lineRule="auto"/>
+              <w:spacing w:before="0" w:after="2" w:line="220" w:lineRule="auto"/>
               <w:ind w:left="0" w:right="0" w:hanging="0"/>
               <w:contextualSpacing w:val="1"/>
               <w:jc w:val="center"/>
@@ -1574,7 +1487,7 @@
           </w:tcPr>
           <w:p>
             <w:pPr>
-              <w:spacing w:before="0" w:after="8" w:line="240" w:lineRule="auto"/>
+              <w:spacing w:before="0" w:after="2" w:line="220" w:lineRule="auto"/>
               <w:ind w:left="0" w:right="0" w:hanging="0"/>
               <w:contextualSpacing w:val="1"/>
               <w:jc w:val="center"/>
@@ -1620,7 +1533,7 @@
           </w:tcPr>
           <w:p>
             <w:pPr>
-              <w:spacing w:before="0" w:after="8" w:line="240" w:lineRule="auto"/>
+              <w:spacing w:before="0" w:after="2" w:line="220" w:lineRule="auto"/>
               <w:ind w:left="0" w:right="0" w:hanging="0"/>
               <w:contextualSpacing w:val="1"/>
               <w:jc w:val="center"/>
@@ -1666,7 +1579,7 @@
           </w:tcPr>
           <w:p>
             <w:pPr>
-              <w:spacing w:before="0" w:after="8" w:line="240" w:lineRule="auto"/>
+              <w:spacing w:before="0" w:after="2" w:line="220" w:lineRule="auto"/>
               <w:ind w:left="0" w:right="0" w:hanging="0"/>
               <w:contextualSpacing w:val="1"/>
               <w:jc w:val="center"/>
@@ -1706,7 +1619,7 @@
           </w:tcPr>
           <w:p>
             <w:pPr>
-              <w:spacing w:before="0" w:after="8" w:line="240" w:lineRule="auto"/>
+              <w:spacing w:before="0" w:after="2" w:line="220" w:lineRule="auto"/>
               <w:ind w:left="0" w:right="0" w:hanging="0"/>
               <w:contextualSpacing w:val="1"/>
               <w:jc w:val="center"/>
@@ -1739,7 +1652,7 @@
           </w:tcPr>
           <w:p>
             <w:pPr>
-              <w:spacing w:before="0" w:after="8" w:line="240" w:lineRule="auto"/>
+              <w:spacing w:before="0" w:after="2" w:line="220" w:lineRule="auto"/>
               <w:ind w:left="0" w:right="0" w:hanging="0"/>
               <w:contextualSpacing w:val="1"/>
               <w:jc w:val="center"/>
@@ -1772,7 +1685,7 @@
           </w:tcPr>
           <w:p>
             <w:pPr>
-              <w:spacing w:before="0" w:after="8" w:line="240" w:lineRule="auto"/>
+              <w:spacing w:before="0" w:after="2" w:line="220" w:lineRule="auto"/>
               <w:ind w:left="0" w:right="0" w:hanging="0"/>
               <w:contextualSpacing w:val="1"/>
               <w:jc w:val="center"/>
@@ -1805,7 +1718,7 @@
           </w:tcPr>
           <w:p>
             <w:pPr>
-              <w:spacing w:before="0" w:after="8" w:line="240" w:lineRule="auto"/>
+              <w:spacing w:before="0" w:after="2" w:line="220" w:lineRule="auto"/>
               <w:ind w:left="0" w:right="0" w:hanging="0"/>
               <w:contextualSpacing w:val="1"/>
               <w:jc w:val="center"/>
@@ -1838,7 +1751,7 @@
           </w:tcPr>
           <w:p>
             <w:pPr>
-              <w:spacing w:before="0" w:after="8" w:line="240" w:lineRule="auto"/>
+              <w:spacing w:before="0" w:after="2" w:line="220" w:lineRule="auto"/>
               <w:ind w:left="0" w:right="0" w:hanging="0"/>
               <w:contextualSpacing w:val="1"/>
               <w:jc w:val="center"/>
@@ -1871,7 +1784,7 @@
           </w:tcPr>
           <w:p>
             <w:pPr>
-              <w:spacing w:before="0" w:after="8" w:line="240" w:lineRule="auto"/>
+              <w:spacing w:before="0" w:after="2" w:line="220" w:lineRule="auto"/>
               <w:ind w:left="0" w:right="0" w:hanging="0"/>
               <w:contextualSpacing w:val="1"/>
               <w:jc w:val="center"/>
@@ -1911,7 +1824,7 @@
           </w:tcPr>
           <w:p>
             <w:pPr>
-              <w:spacing w:before="0" w:after="8" w:line="240" w:lineRule="auto"/>
+              <w:spacing w:before="0" w:after="2" w:line="220" w:lineRule="auto"/>
               <w:ind w:left="0" w:right="0" w:hanging="0"/>
               <w:contextualSpacing w:val="1"/>
               <w:jc w:val="center"/>
@@ -1945,7 +1858,7 @@
           </w:tcPr>
           <w:p>
             <w:pPr>
-              <w:spacing w:before="0" w:after="8" w:line="240" w:lineRule="auto"/>
+              <w:spacing w:before="0" w:after="2" w:line="220" w:lineRule="auto"/>
               <w:ind w:left="0" w:right="0" w:hanging="0"/>
               <w:contextualSpacing w:val="1"/>
               <w:jc w:val="center"/>
@@ -1979,7 +1892,7 @@
           </w:tcPr>
           <w:p>
             <w:pPr>
-              <w:spacing w:before="0" w:after="8" w:line="240" w:lineRule="auto"/>
+              <w:spacing w:before="0" w:after="2" w:line="220" w:lineRule="auto"/>
               <w:ind w:left="0" w:right="0" w:hanging="0"/>
               <w:contextualSpacing w:val="1"/>
               <w:jc w:val="center"/>
@@ -2013,7 +1926,7 @@
           </w:tcPr>
           <w:p>
             <w:pPr>
-              <w:spacing w:before="0" w:after="8" w:line="240" w:lineRule="auto"/>
+              <w:spacing w:before="0" w:after="2" w:line="220" w:lineRule="auto"/>
               <w:ind w:left="0" w:right="0" w:hanging="0"/>
               <w:contextualSpacing w:val="1"/>
               <w:jc w:val="center"/>
@@ -2047,7 +1960,7 @@
           </w:tcPr>
           <w:p>
             <w:pPr>
-              <w:spacing w:before="0" w:after="8" w:line="240" w:lineRule="auto"/>
+              <w:spacing w:before="0" w:after="2" w:line="220" w:lineRule="auto"/>
               <w:ind w:left="0" w:right="0" w:hanging="0"/>
               <w:contextualSpacing w:val="1"/>
               <w:jc w:val="center"/>
@@ -2081,7 +1994,7 @@
           </w:tcPr>
           <w:p>
             <w:pPr>
-              <w:spacing w:before="0" w:after="8" w:line="240" w:lineRule="auto"/>
+              <w:spacing w:before="0" w:after="2" w:line="220" w:lineRule="auto"/>
               <w:ind w:left="0" w:right="0" w:hanging="0"/>
               <w:contextualSpacing w:val="1"/>
               <w:jc w:val="center"/>
@@ -2121,7 +2034,7 @@
           </w:tcPr>
           <w:p>
             <w:pPr>
-              <w:spacing w:before="0" w:after="8" w:line="240" w:lineRule="auto"/>
+              <w:spacing w:before="0" w:after="2" w:line="220" w:lineRule="auto"/>
               <w:ind w:left="0" w:right="0" w:hanging="0"/>
               <w:contextualSpacing w:val="1"/>
               <w:jc w:val="center"/>
@@ -2154,7 +2067,7 @@
           </w:tcPr>
           <w:p>
             <w:pPr>
-              <w:spacing w:before="0" w:after="8" w:line="240" w:lineRule="auto"/>
+              <w:spacing w:before="0" w:after="2" w:line="220" w:lineRule="auto"/>
               <w:ind w:left="0" w:right="0" w:hanging="0"/>
               <w:contextualSpacing w:val="1"/>
               <w:jc w:val="center"/>
@@ -2187,7 +2100,7 @@
           </w:tcPr>
           <w:p>
             <w:pPr>
-              <w:spacing w:before="0" w:after="8" w:line="240" w:lineRule="auto"/>
+              <w:spacing w:before="0" w:after="2" w:line="220" w:lineRule="auto"/>
               <w:ind w:left="0" w:right="0" w:hanging="0"/>
               <w:contextualSpacing w:val="1"/>
               <w:jc w:val="center"/>
@@ -2220,7 +2133,7 @@
           </w:tcPr>
           <w:p>
             <w:pPr>
-              <w:spacing w:before="0" w:after="8" w:line="240" w:lineRule="auto"/>
+              <w:spacing w:before="0" w:after="2" w:line="220" w:lineRule="auto"/>
               <w:ind w:left="0" w:right="0" w:hanging="0"/>
               <w:contextualSpacing w:val="1"/>
               <w:jc w:val="center"/>
@@ -2253,7 +2166,7 @@
           </w:tcPr>
           <w:p>
             <w:pPr>
-              <w:spacing w:before="0" w:after="8" w:line="240" w:lineRule="auto"/>
+              <w:spacing w:before="0" w:after="2" w:line="220" w:lineRule="auto"/>
               <w:ind w:left="0" w:right="0" w:hanging="0"/>
               <w:contextualSpacing w:val="1"/>
               <w:jc w:val="center"/>
@@ -2286,7 +2199,7 @@
           </w:tcPr>
           <w:p>
             <w:pPr>
-              <w:spacing w:before="0" w:after="8" w:line="240" w:lineRule="auto"/>
+              <w:spacing w:before="0" w:after="2" w:line="220" w:lineRule="auto"/>
               <w:ind w:left="0" w:right="0" w:hanging="0"/>
               <w:contextualSpacing w:val="1"/>
               <w:jc w:val="center"/>
@@ -2326,7 +2239,7 @@
           </w:tcPr>
           <w:p>
             <w:pPr>
-              <w:spacing w:before="0" w:after="8" w:line="240" w:lineRule="auto"/>
+              <w:spacing w:before="0" w:after="2" w:line="220" w:lineRule="auto"/>
               <w:ind w:left="0" w:right="0" w:hanging="0"/>
               <w:contextualSpacing w:val="1"/>
               <w:jc w:val="center"/>
@@ -2368,7 +2281,7 @@
           </w:tcPr>
           <w:p>
             <w:pPr>
-              <w:spacing w:before="0" w:after="8" w:line="240" w:lineRule="auto"/>
+              <w:spacing w:before="0" w:after="2" w:line="220" w:lineRule="auto"/>
               <w:ind w:left="0" w:right="0" w:hanging="0"/>
               <w:contextualSpacing w:val="1"/>
               <w:jc w:val="center"/>
@@ -2420,7 +2333,7 @@
           </w:p>
           <w:p>
             <w:pPr>
-              <w:spacing w:before="0" w:after="8" w:line="240" w:lineRule="auto"/>
+              <w:spacing w:before="0" w:after="2" w:line="220" w:lineRule="auto"/>
               <w:ind w:left="0" w:right="0" w:hanging="0"/>
               <w:contextualSpacing w:val="1"/>
               <w:jc w:val="center"/>
@@ -2446,7 +2359,7 @@
           </w:p>
           <w:p>
             <w:pPr>
-              <w:spacing w:before="0" w:after="8" w:line="240" w:lineRule="auto"/>
+              <w:spacing w:before="0" w:after="2" w:line="220" w:lineRule="auto"/>
               <w:ind w:left="0" w:right="0" w:hanging="0"/>
               <w:contextualSpacing w:val="1"/>
               <w:jc w:val="center"/>
@@ -2479,7 +2392,7 @@
           </w:tcPr>
           <w:p>
             <w:pPr>
-              <w:spacing w:before="0" w:after="8" w:line="240" w:lineRule="auto"/>
+              <w:spacing w:before="0" w:after="2" w:line="220" w:lineRule="auto"/>
               <w:ind w:left="0" w:right="0" w:hanging="0"/>
               <w:contextualSpacing w:val="1"/>
               <w:rPr>
@@ -2539,7 +2452,7 @@
                 <w:ilvl w:val="0"/>
                 <w:numId w:val="3"/>
               </w:numPr>
-              <w:spacing w:before="0" w:after="8" w:line="240" w:lineRule="auto"/>
+              <w:spacing w:before="0" w:after="2" w:line="220" w:lineRule="auto"/>
               <w:ind w:left="158" w:right="0" w:hanging="158"/>
               <w:contextualSpacing w:val="1"/>
               <w:rPr>
@@ -2616,7 +2529,7 @@
                 <w:ilvl w:val="0"/>
                 <w:numId w:val="3"/>
               </w:numPr>
-              <w:spacing w:before="0" w:after="8" w:line="240" w:lineRule="auto"/>
+              <w:spacing w:before="0" w:after="2" w:line="220" w:lineRule="auto"/>
               <w:ind w:left="158" w:right="0" w:hanging="158"/>
               <w:contextualSpacing w:val="1"/>
               <w:rPr>
@@ -2662,7 +2575,7 @@
           </w:tcPr>
           <w:p>
             <w:pPr>
-              <w:spacing w:before="0" w:after="8" w:line="240" w:lineRule="auto"/>
+              <w:spacing w:before="0" w:after="2" w:line="220" w:lineRule="auto"/>
               <w:ind w:left="0" w:right="0" w:hanging="0"/>
               <w:contextualSpacing w:val="1"/>
               <w:jc w:val="center"/>
@@ -2714,7 +2627,7 @@
           </w:p>
           <w:p>
             <w:pPr>
-              <w:spacing w:before="0" w:after="8" w:line="240" w:lineRule="auto"/>
+              <w:spacing w:before="0" w:after="2" w:line="220" w:lineRule="auto"/>
               <w:ind w:left="0" w:right="0" w:hanging="0"/>
               <w:contextualSpacing w:val="1"/>
               <w:jc w:val="center"/>
@@ -2740,7 +2653,7 @@
           </w:p>
           <w:p>
             <w:pPr>
-              <w:spacing w:before="0" w:after="8" w:line="240" w:lineRule="auto"/>
+              <w:spacing w:before="0" w:after="2" w:line="220" w:lineRule="auto"/>
               <w:ind w:left="0" w:right="0" w:hanging="0"/>
               <w:contextualSpacing w:val="1"/>
               <w:jc w:val="center"/>
@@ -2774,7 +2687,7 @@
           </w:tcPr>
           <w:p>
             <w:pPr>
-              <w:spacing w:before="0" w:after="8" w:line="240" w:lineRule="auto"/>
+              <w:spacing w:before="0" w:after="2" w:line="220" w:lineRule="auto"/>
               <w:ind w:left="0" w:right="0" w:hanging="0"/>
               <w:contextualSpacing w:val="1"/>
               <w:rPr>
@@ -2807,7 +2720,7 @@
                 <w:ilvl w:val="0"/>
                 <w:numId w:val="3"/>
               </w:numPr>
-              <w:spacing w:before="0" w:after="8" w:line="240" w:lineRule="auto"/>
+              <w:spacing w:before="0" w:after="2" w:line="220" w:lineRule="auto"/>
               <w:ind w:left="158" w:right="0" w:hanging="158"/>
               <w:contextualSpacing w:val="1"/>
               <w:rPr>
@@ -2875,7 +2788,7 @@
                 <w:ilvl w:val="0"/>
                 <w:numId w:val="3"/>
               </w:numPr>
-              <w:spacing w:before="0" w:after="8" w:line="240" w:lineRule="auto"/>
+              <w:spacing w:before="0" w:after="2" w:line="220" w:lineRule="auto"/>
               <w:ind w:left="158" w:right="0" w:hanging="158"/>
               <w:contextualSpacing w:val="1"/>
               <w:rPr>
@@ -2972,7 +2885,7 @@
                 <w:ilvl w:val="0"/>
                 <w:numId w:val="3"/>
               </w:numPr>
-              <w:spacing w:before="0" w:after="8" w:line="240" w:lineRule="auto"/>
+              <w:spacing w:before="0" w:after="2" w:line="220" w:lineRule="auto"/>
               <w:ind w:left="158" w:right="0" w:hanging="158"/>
               <w:contextualSpacing w:val="1"/>
               <w:rPr>
@@ -3009,116 +2922,6 @@
                 <w:rtl w:val="0"/>
               </w:rPr>
               <w:t xml:space="preserve"> learning one scalar intercept, not a full product head</w:t>
-            </w:r>
-          </w:p>
-          <w:p>
-            <w:pPr>
-              <w:numPr>
-                <w:ilvl w:val="0"/>
-                <w:numId w:val="3"/>
-              </w:numPr>
-              <w:spacing w:before="0" w:after="8" w:line="240" w:lineRule="auto"/>
-              <w:ind w:left="158" w:right="0" w:hanging="158"/>
-              <w:contextualSpacing w:val="1"/>
-              <w:rPr>
-                <w:rFonts w:ascii="Calibri" w:cs="Calibri" w:eastAsia="Calibri" w:hAnsi="Calibri"/>
-                <w:sz w:val="20"/>
-                <w:szCs w:val="20"/>
-              </w:rPr>
-            </w:pPr>
-            <w:r>
-              <w:rPr>
-                <w:rFonts w:ascii="Calibri" w:cs="Calibri" w:eastAsia="Calibri" w:hAnsi="Calibri"/>
-                <w:sz w:val="20"/>
-                <w:szCs w:val="20"/>
-                <w:rtl w:val="0"/>
-              </w:rPr>
-              <w:t xml:space="preserve">Replayed </w:t>
-            </w:r>
-            <w:r>
-              <w:rPr>
-                <w:rFonts w:ascii="Calibri" w:cs="Calibri" w:eastAsia="Calibri" w:hAnsi="Calibri"/>
-                <w:b w:val="1"/>
-                <w:bCs w:val="1"/>
-                <w:sz w:val="20"/>
-                <w:szCs w:val="20"/>
-                <w:rtl w:val="0"/>
-              </w:rPr>
-              <w:t xml:space="preserve">48.8K</w:t>
-            </w:r>
-            <w:r>
-              <w:rPr>
-                <w:rFonts w:ascii="Calibri" w:cs="Calibri" w:eastAsia="Calibri" w:hAnsi="Calibri"/>
-                <w:sz w:val="20"/>
-                <w:szCs w:val="20"/>
-                <w:rtl w:val="0"/>
-              </w:rPr>
-              <w:t xml:space="preserve"> rows strictly forward; </w:t>
-            </w:r>
-            <w:r>
-              <w:rPr>
-                <w:rFonts w:ascii="Calibri" w:cs="Calibri" w:eastAsia="Calibri" w:hAnsi="Calibri"/>
-                <w:b w:val="1"/>
-                <w:bCs w:val="1"/>
-                <w:sz w:val="20"/>
-                <w:szCs w:val="20"/>
-                <w:rtl w:val="0"/>
-              </w:rPr>
-              <w:t xml:space="preserve">1K</w:t>
-            </w:r>
-            <w:r>
-              <w:rPr>
-                <w:rFonts w:ascii="Calibri" w:cs="Calibri" w:eastAsia="Calibri" w:hAnsi="Calibri"/>
-                <w:sz w:val="20"/>
-                <w:szCs w:val="20"/>
-                <w:rtl w:val="0"/>
-              </w:rPr>
-              <w:t xml:space="preserve"> labelled rows erased the prior gap on a </w:t>
-            </w:r>
-            <w:r>
-              <w:rPr>
-                <w:rFonts w:ascii="Calibri" w:cs="Calibri" w:eastAsia="Calibri" w:hAnsi="Calibri"/>
-                <w:b w:val="1"/>
-                <w:bCs w:val="1"/>
-                <w:sz w:val="20"/>
-                <w:szCs w:val="20"/>
-                <w:rtl w:val="0"/>
-              </w:rPr>
-              <w:t xml:space="preserve">12.2K</w:t>
-            </w:r>
-            <w:r>
-              <w:rPr>
-                <w:rFonts w:ascii="Calibri" w:cs="Calibri" w:eastAsia="Calibri" w:hAnsi="Calibri"/>
-                <w:sz w:val="20"/>
-                <w:szCs w:val="20"/>
-                <w:rtl w:val="0"/>
-              </w:rPr>
-              <w:t xml:space="preserve"> tail</w:t>
-            </w:r>
-          </w:p>
-          <w:p>
-            <w:pPr>
-              <w:numPr>
-                <w:ilvl w:val="0"/>
-                <w:numId w:val="3"/>
-              </w:numPr>
-              <w:spacing w:before="0" w:after="8" w:line="240" w:lineRule="auto"/>
-              <w:ind w:left="158" w:right="0" w:hanging="158"/>
-              <w:contextualSpacing w:val="1"/>
-              <w:rPr>
-                <w:rFonts w:ascii="Calibri" w:cs="Calibri" w:eastAsia="Calibri" w:hAnsi="Calibri"/>
-                <w:sz w:val="20"/>
-                <w:szCs w:val="20"/>
-              </w:rPr>
-            </w:pPr>
-            <w:r>
-              <w:rPr>
-                <w:rFonts w:ascii="Calibri" w:cs="Calibri" w:eastAsia="Calibri" w:hAnsi="Calibri"/>
-                <w:sz w:val="20"/>
-                <w:szCs w:val="20"/>
-                <w:rtl w:val="0"/>
-              </w:rPr>
-              <w:t xml:space="preserve">Delivered an evidence-frozen handoff specifying the serving state and monitoring gates for launch day</w:t>
             </w:r>
           </w:p>
         </w:tc>
@@ -3137,7 +2940,7 @@
           </w:tcPr>
           <w:p>
             <w:pPr>
-              <w:spacing w:before="0" w:after="8" w:line="240" w:lineRule="auto"/>
+              <w:spacing w:before="0" w:after="2" w:line="220" w:lineRule="auto"/>
               <w:ind w:left="0" w:right="0" w:hanging="0"/>
               <w:contextualSpacing w:val="1"/>
               <w:jc w:val="center"/>
@@ -3189,7 +2992,7 @@
           </w:p>
           <w:p>
             <w:pPr>
-              <w:spacing w:before="0" w:after="8" w:line="240" w:lineRule="auto"/>
+              <w:spacing w:before="0" w:after="2" w:line="220" w:lineRule="auto"/>
               <w:ind w:left="0" w:right="0" w:hanging="0"/>
               <w:contextualSpacing w:val="1"/>
               <w:jc w:val="center"/>
@@ -3215,7 +3018,7 @@
           </w:p>
           <w:p>
             <w:pPr>
-              <w:spacing w:before="0" w:after="8" w:line="240" w:lineRule="auto"/>
+              <w:spacing w:before="0" w:after="2" w:line="220" w:lineRule="auto"/>
               <w:ind w:left="0" w:right="0" w:hanging="0"/>
               <w:contextualSpacing w:val="1"/>
               <w:jc w:val="center"/>
@@ -3248,7 +3051,7 @@
           </w:tcPr>
           <w:p>
             <w:pPr>
-              <w:spacing w:before="0" w:after="8" w:line="240" w:lineRule="auto"/>
+              <w:spacing w:before="0" w:after="2" w:line="220" w:lineRule="auto"/>
               <w:ind w:left="0" w:right="0" w:hanging="0"/>
               <w:contextualSpacing w:val="1"/>
               <w:rPr>
@@ -3335,7 +3138,7 @@
                 <w:ilvl w:val="0"/>
                 <w:numId w:val="3"/>
               </w:numPr>
-              <w:spacing w:before="0" w:after="8" w:line="240" w:lineRule="auto"/>
+              <w:spacing w:before="0" w:after="2" w:line="220" w:lineRule="auto"/>
               <w:ind w:left="158" w:right="0" w:hanging="158"/>
               <w:contextualSpacing w:val="1"/>
               <w:rPr>
@@ -3380,7 +3183,7 @@
                 <w:ilvl w:val="0"/>
                 <w:numId w:val="3"/>
               </w:numPr>
-              <w:spacing w:before="0" w:after="8" w:line="240" w:lineRule="auto"/>
+              <w:spacing w:before="0" w:after="2" w:line="220" w:lineRule="auto"/>
               <w:ind w:left="158" w:right="0" w:hanging="158"/>
               <w:contextualSpacing w:val="1"/>
               <w:rPr>
@@ -3437,31 +3240,6 @@
                 <w:rtl w:val="0"/>
               </w:rPr>
               <w:t xml:space="preserve"> on BMW builds</w:t>
-            </w:r>
-          </w:p>
-          <w:p>
-            <w:pPr>
-              <w:numPr>
-                <w:ilvl w:val="0"/>
-                <w:numId w:val="3"/>
-              </w:numPr>
-              <w:spacing w:before="0" w:after="8" w:line="240" w:lineRule="auto"/>
-              <w:ind w:left="158" w:right="0" w:hanging="158"/>
-              <w:contextualSpacing w:val="1"/>
-              <w:rPr>
-                <w:rFonts w:ascii="Calibri" w:cs="Calibri" w:eastAsia="Calibri" w:hAnsi="Calibri"/>
-                <w:sz w:val="20"/>
-                <w:szCs w:val="20"/>
-              </w:rPr>
-            </w:pPr>
-            <w:r>
-              <w:rPr>
-                <w:rFonts w:ascii="Calibri" w:cs="Calibri" w:eastAsia="Calibri" w:hAnsi="Calibri"/>
-                <w:sz w:val="20"/>
-                <w:szCs w:val="20"/>
-                <w:rtl w:val="0"/>
-              </w:rPr>
-              <w:t xml:space="preserve">Used Git, Doxygen and AI-assisted coding tools to raise development throughput</w:t>
             </w:r>
           </w:p>
         </w:tc>
@@ -3480,7 +3258,7 @@
           </w:tcPr>
           <w:p>
             <w:pPr>
-              <w:spacing w:before="0" w:after="8" w:line="240" w:lineRule="auto"/>
+              <w:spacing w:before="0" w:after="2" w:line="220" w:lineRule="auto"/>
               <w:ind w:left="0" w:right="0" w:hanging="0"/>
               <w:contextualSpacing w:val="1"/>
               <w:jc w:val="center"/>
@@ -3522,7 +3300,271 @@
           </w:tcPr>
           <w:p>
             <w:pPr>
-              <w:spacing w:before="0" w:after="8" w:line="240" w:lineRule="auto"/>
+              <w:spacing w:before="0" w:after="2" w:line="220" w:lineRule="auto"/>
+              <w:ind w:left="0" w:right="0" w:hanging="0"/>
+              <w:contextualSpacing w:val="1"/>
+              <w:jc w:val="center"/>
+              <w:rPr>
+                <w:rFonts w:ascii="Calibri" w:cs="Calibri" w:eastAsia="Calibri" w:hAnsi="Calibri"/>
+                <w:b w:val="1"/>
+                <w:bCs w:val="1"/>
+                <w:sz w:val="20"/>
+                <w:szCs w:val="20"/>
+              </w:rPr>
+            </w:pPr>
+            <w:r>
+              <w:rPr>
+                <w:rFonts w:ascii="Calibri" w:cs="Calibri" w:eastAsia="Calibri" w:hAnsi="Calibri"/>
+                <w:b w:val="1"/>
+                <w:bCs w:val="1"/>
+                <w:sz w:val="20"/>
+                <w:szCs w:val="20"/>
+                <w:rtl w:val="0"/>
+              </w:rPr>
+              <w:t xml:space="preserve">MRHA (</w:t>
+            </w:r>
+            <w:hyperlink r:id="rId31">
+              <w:r>
+                <w:rPr>
+                  <w:rFonts w:ascii="Calibri" w:cs="Calibri" w:eastAsia="Calibri" w:hAnsi="Calibri"/>
+                  <w:b w:val="1"/>
+                  <w:bCs w:val="1"/>
+                  <w:color w:val="2F5496"/>
+                  <w:sz w:val="20"/>
+                  <w:szCs w:val="20"/>
+                  <w:u w:val="single"/>
+                  <w:rtl w:val="0"/>
+                </w:rPr>
+                <w:t xml:space="preserve">Github</w:t>
+              </w:r>
+            </w:hyperlink>
+            <w:r>
+              <w:rPr>
+                <w:rFonts w:ascii="Calibri" w:cs="Calibri" w:eastAsia="Calibri" w:hAnsi="Calibri"/>
+                <w:b w:val="1"/>
+                <w:bCs w:val="1"/>
+                <w:sz w:val="20"/>
+                <w:szCs w:val="20"/>
+                <w:rtl w:val="0"/>
+              </w:rPr>
+              <w:t xml:space="preserve">)</w:t>
+            </w:r>
+          </w:p>
+          <w:p>
+            <w:pPr>
+              <w:spacing w:before="0" w:after="2" w:line="220" w:lineRule="auto"/>
+              <w:ind w:left="0" w:right="0" w:hanging="0"/>
+              <w:contextualSpacing w:val="1"/>
+              <w:jc w:val="center"/>
+              <w:rPr>
+                <w:rFonts w:ascii="Calibri" w:cs="Calibri" w:eastAsia="Calibri" w:hAnsi="Calibri"/>
+                <w:i w:val="1"/>
+                <w:iCs w:val="1"/>
+                <w:sz w:val="20"/>
+                <w:szCs w:val="20"/>
+              </w:rPr>
+            </w:pPr>
+            <w:r>
+              <w:rPr>
+                <w:rFonts w:ascii="Calibri" w:cs="Calibri" w:eastAsia="Calibri" w:hAnsi="Calibri"/>
+                <w:i w:val="1"/>
+                <w:iCs w:val="1"/>
+                <w:sz w:val="20"/>
+                <w:szCs w:val="20"/>
+                <w:rtl w:val="0"/>
+              </w:rPr>
+              <w:t xml:space="preserve">Research Harness</w:t>
+            </w:r>
+          </w:p>
+          <w:p>
+            <w:pPr>
+              <w:spacing w:before="0" w:after="2" w:line="220" w:lineRule="auto"/>
+              <w:ind w:left="0" w:right="0" w:hanging="0"/>
+              <w:contextualSpacing w:val="1"/>
+              <w:jc w:val="center"/>
+              <w:rPr>
+                <w:rFonts w:ascii="Calibri" w:cs="Calibri" w:eastAsia="Calibri" w:hAnsi="Calibri"/>
+                <w:i w:val="1"/>
+                <w:iCs w:val="1"/>
+                <w:sz w:val="20"/>
+                <w:szCs w:val="20"/>
+              </w:rPr>
+            </w:pPr>
+            <w:r>
+              <w:rPr>
+                <w:rFonts w:ascii="Calibri" w:cs="Calibri" w:eastAsia="Calibri" w:hAnsi="Calibri"/>
+                <w:i w:val="1"/>
+                <w:iCs w:val="1"/>
+                <w:sz w:val="20"/>
+                <w:szCs w:val="20"/>
+                <w:rtl w:val="0"/>
+              </w:rPr>
+              <w:t xml:space="preserve">(Sep'26 – Present)</w:t>
+            </w:r>
+          </w:p>
+        </w:tc>
+        <w:tc>
+          <w:tcPr>
+            <w:tcW w:w="9200" w:type="dxa"/>
+            <w:gridSpan w:val="20"/>
+            <w:vAlign w:val="top"/>
+          </w:tcPr>
+          <w:p>
+            <w:pPr>
+              <w:spacing w:before="0" w:after="2" w:line="220" w:lineRule="auto"/>
+              <w:ind w:left="0" w:right="0" w:hanging="0"/>
+              <w:contextualSpacing w:val="1"/>
+              <w:rPr>
+                <w:rFonts w:ascii="Calibri" w:cs="Calibri" w:eastAsia="Calibri" w:hAnsi="Calibri"/>
+                <w:b w:val="1"/>
+                <w:bCs w:val="1"/>
+                <w:i w:val="1"/>
+                <w:iCs w:val="1"/>
+                <w:sz w:val="20"/>
+                <w:szCs w:val="20"/>
+              </w:rPr>
+            </w:pPr>
+            <w:r>
+              <w:rPr>
+                <w:rFonts w:ascii="Calibri" w:cs="Calibri" w:eastAsia="Calibri" w:hAnsi="Calibri"/>
+                <w:b w:val="1"/>
+                <w:bCs w:val="1"/>
+                <w:i w:val="1"/>
+                <w:iCs w:val="1"/>
+                <w:sz w:val="20"/>
+                <w:szCs w:val="20"/>
+                <w:rtl w:val="0"/>
+              </w:rPr>
+              <w:t xml:space="preserve">Open chart-VQA stress harness for multimodal reward hacking / proxy–true divergence</w:t>
+            </w:r>
+          </w:p>
+          <w:p>
+            <w:pPr>
+              <w:numPr>
+                <w:ilvl w:val="0"/>
+                <w:numId w:val="3"/>
+              </w:numPr>
+              <w:spacing w:before="0" w:after="2" w:line="220" w:lineRule="auto"/>
+              <w:ind w:left="158" w:right="0" w:hanging="158"/>
+              <w:contextualSpacing w:val="1"/>
+              <w:rPr>
+                <w:rFonts w:ascii="Calibri" w:cs="Calibri" w:eastAsia="Calibri" w:hAnsi="Calibri"/>
+                <w:sz w:val="20"/>
+                <w:szCs w:val="20"/>
+              </w:rPr>
+            </w:pPr>
+            <w:r>
+              <w:rPr>
+                <w:rFonts w:ascii="Calibri" w:cs="Calibri" w:eastAsia="Calibri" w:hAnsi="Calibri"/>
+                <w:sz w:val="20"/>
+                <w:szCs w:val="20"/>
+                <w:rtl w:val="0"/>
+              </w:rPr>
+              <w:t xml:space="preserve">Built executable-oracle attacks (evidence and judge-bait) with dual </w:t>
+            </w:r>
+            <w:r>
+              <w:rPr>
+                <w:rFonts w:ascii="Calibri" w:cs="Calibri" w:eastAsia="Calibri" w:hAnsi="Calibri"/>
+                <w:b w:val="1"/>
+                <w:bCs w:val="1"/>
+                <w:sz w:val="20"/>
+                <w:szCs w:val="20"/>
+                <w:rtl w:val="0"/>
+              </w:rPr>
+              <w:t xml:space="preserve">invariance / re-answer</w:t>
+            </w:r>
+            <w:r>
+              <w:rPr>
+                <w:rFonts w:ascii="Calibri" w:cs="Calibri" w:eastAsia="Calibri" w:hAnsi="Calibri"/>
+                <w:sz w:val="20"/>
+                <w:szCs w:val="20"/>
+                <w:rtl w:val="0"/>
+              </w:rPr>
+              <w:t xml:space="preserve"> protocols</w:t>
+            </w:r>
+          </w:p>
+          <w:p>
+            <w:pPr>
+              <w:numPr>
+                <w:ilvl w:val="0"/>
+                <w:numId w:val="3"/>
+              </w:numPr>
+              <w:spacing w:before="0" w:after="2" w:line="220" w:lineRule="auto"/>
+              <w:ind w:left="158" w:right="0" w:hanging="158"/>
+              <w:contextualSpacing w:val="1"/>
+              <w:rPr>
+                <w:rFonts w:ascii="Calibri" w:cs="Calibri" w:eastAsia="Calibri" w:hAnsi="Calibri"/>
+                <w:sz w:val="20"/>
+                <w:szCs w:val="20"/>
+              </w:rPr>
+            </w:pPr>
+            <w:r>
+              <w:rPr>
+                <w:rFonts w:ascii="Calibri" w:cs="Calibri" w:eastAsia="Calibri" w:hAnsi="Calibri"/>
+                <w:sz w:val="20"/>
+                <w:szCs w:val="20"/>
+                <w:rtl w:val="0"/>
+              </w:rPr>
+              <w:t xml:space="preserve">Implements </w:t>
+            </w:r>
+            <w:r>
+              <w:rPr>
+                <w:rFonts w:ascii="Calibri" w:cs="Calibri" w:eastAsia="Calibri" w:hAnsi="Calibri"/>
+                <w:b w:val="1"/>
+                <w:bCs w:val="1"/>
+                <w:sz w:val="20"/>
+                <w:szCs w:val="20"/>
+                <w:rtl w:val="0"/>
+              </w:rPr>
+              <w:t xml:space="preserve">RHR / blind-spot</w:t>
+            </w:r>
+            <w:r>
+              <w:rPr>
+                <w:rFonts w:ascii="Calibri" w:cs="Calibri" w:eastAsia="Calibri" w:hAnsi="Calibri"/>
+                <w:sz w:val="20"/>
+                <w:szCs w:val="20"/>
+                <w:rtl w:val="0"/>
+              </w:rPr>
+              <w:t xml:space="preserve"> metrics and an </w:t>
+            </w:r>
+            <w:r>
+              <w:rPr>
+                <w:rFonts w:ascii="Calibri" w:cs="Calibri" w:eastAsia="Calibri" w:hAnsi="Calibri"/>
+                <w:b w:val="1"/>
+                <w:bCs w:val="1"/>
+                <w:sz w:val="20"/>
+                <w:szCs w:val="20"/>
+                <w:rtl w:val="0"/>
+              </w:rPr>
+              <w:t xml:space="preserve">MLX</w:t>
+            </w:r>
+            <w:r>
+              <w:rPr>
+                <w:rFonts w:ascii="Calibri" w:cs="Calibri" w:eastAsia="Calibri" w:hAnsi="Calibri"/>
+                <w:sz w:val="20"/>
+                <w:szCs w:val="20"/>
+                <w:rtl w:val="0"/>
+              </w:rPr>
+              <w:t xml:space="preserve"> runner for local VLMs</w:t>
+            </w:r>
+          </w:p>
+        </w:tc>
+      </w:tr>
+      <w:tr>
+        <w:trPr>
+          <w:cantSplit w:val="1"/>
+          <w:tblHeader w:val="0"/>
+        </w:trPr>
+        <w:tc>
+          <w:tcPr>
+            <w:tcW w:w="1840" w:type="dxa"/>
+            <w:gridSpan w:val="4"/>
+            <w:shd w:fill="D9E2F3" w:val="clear"/>
+            <w:vAlign w:val="center"/>
+          </w:tcPr>
+          <w:p>
+            <w:pPr>
+              <w:spacing w:before="0" w:after="2" w:line="220" w:lineRule="auto"/>
               <w:ind w:left="0" w:right="0" w:hanging="0"/>
               <w:contextualSpacing w:val="1"/>
               <w:jc w:val="center"/>
@@ -3574,7 +3616,7 @@
           </w:p>
           <w:p>
             <w:pPr>
-              <w:spacing w:before="0" w:after="8" w:line="240" w:lineRule="auto"/>
+              <w:spacing w:before="0" w:after="2" w:line="220" w:lineRule="auto"/>
               <w:ind w:left="0" w:right="0" w:hanging="0"/>
               <w:contextualSpacing w:val="1"/>
               <w:jc w:val="center"/>
@@ -3600,7 +3642,7 @@
           </w:p>
           <w:p>
             <w:pPr>
-              <w:spacing w:before="0" w:after="8" w:line="240" w:lineRule="auto"/>
+              <w:spacing w:before="0" w:after="2" w:line="220" w:lineRule="auto"/>
               <w:ind w:left="0" w:right="0" w:hanging="0"/>
               <w:contextualSpacing w:val="1"/>
               <w:jc w:val="center"/>
@@ -3629,11 +3671,12 @@
           <w:tcPr>
             <w:tcW w:w="9200" w:type="dxa"/>
             <w:gridSpan w:val="20"/>
+            <w:shd w:fill="EDF2FA" w:val="clear"/>
             <w:vAlign w:val="top"/>
           </w:tcPr>
           <w:p>
             <w:pPr>
-              <w:spacing w:before="0" w:after="8" w:line="240" w:lineRule="auto"/>
+              <w:spacing w:before="0" w:after="2" w:line="220" w:lineRule="auto"/>
               <w:ind w:left="0" w:right="0" w:hanging="0"/>
               <w:contextualSpacing w:val="1"/>
               <w:rPr>
@@ -3666,7 +3709,7 @@
                 <w:ilvl w:val="0"/>
                 <w:numId w:val="3"/>
               </w:numPr>
-              <w:spacing w:before="0" w:after="8" w:line="240" w:lineRule="auto"/>
+              <w:spacing w:before="0" w:after="2" w:line="220" w:lineRule="auto"/>
               <w:ind w:left="158" w:right="0" w:hanging="158"/>
               <w:contextualSpacing w:val="1"/>
               <w:rPr>
@@ -3714,6 +3757,26 @@
                 <w:rtl w:val="0"/>
               </w:rPr>
               <w:t xml:space="preserve">Gemini 2.0 Flash</w:t>
+            </w:r>
+            <w:r>
+              <w:rPr>
+                <w:rFonts w:ascii="Calibri" w:cs="Calibri" w:eastAsia="Calibri" w:hAnsi="Calibri"/>
+                <w:sz w:val="20"/>
+                <w:szCs w:val="20"/>
+                <w:rtl w:val="0"/>
+              </w:rPr>
+              <w:t xml:space="preserve">; UI in </w:t>
+            </w:r>
+            <w:r>
+              <w:rPr>
+                <w:rFonts w:ascii="Calibri" w:cs="Calibri" w:eastAsia="Calibri" w:hAnsi="Calibri"/>
+                <w:b w:val="1"/>
+                <w:bCs w:val="1"/>
+                <w:sz w:val="20"/>
+                <w:szCs w:val="20"/>
+                <w:rtl w:val="0"/>
+              </w:rPr>
+              <w:t xml:space="preserve">&lt;400 ms</w:t>
             </w:r>
           </w:p>
           <w:p>
@@ -3722,7 +3785,7 @@
                 <w:ilvl w:val="0"/>
                 <w:numId w:val="3"/>
               </w:numPr>
-              <w:spacing w:before="0" w:after="8" w:line="240" w:lineRule="auto"/>
+              <w:spacing w:before="0" w:after="2" w:line="220" w:lineRule="auto"/>
               <w:ind w:left="158" w:right="0" w:hanging="158"/>
               <w:contextualSpacing w:val="1"/>
               <w:rPr>
@@ -3734,60 +3797,6 @@
             <w:r>
               <w:rPr>
                 <w:rFonts w:ascii="Calibri" w:cs="Calibri" w:eastAsia="Calibri" w:hAnsi="Calibri"/>
-                <w:sz w:val="20"/>
-                <w:szCs w:val="20"/>
-                <w:rtl w:val="0"/>
-              </w:rPr>
-              <w:t xml:space="preserve">Triggered real-time UI interventions in </w:t>
-            </w:r>
-            <w:r>
-              <w:rPr>
-                <w:rFonts w:ascii="Calibri" w:cs="Calibri" w:eastAsia="Calibri" w:hAnsi="Calibri"/>
-                <w:b w:val="1"/>
-                <w:bCs w:val="1"/>
-                <w:sz w:val="20"/>
-                <w:szCs w:val="20"/>
-                <w:rtl w:val="0"/>
-              </w:rPr>
-              <w:t xml:space="preserve">under 400 ms</w:t>
-            </w:r>
-            <w:r>
-              <w:rPr>
-                <w:rFonts w:ascii="Calibri" w:cs="Calibri" w:eastAsia="Calibri" w:hAnsi="Calibri"/>
-                <w:sz w:val="20"/>
-                <w:szCs w:val="20"/>
-                <w:rtl w:val="0"/>
-              </w:rPr>
-              <w:t xml:space="preserve"> from live video-context relevance scores</w:t>
-            </w:r>
-          </w:p>
-          <w:p>
-            <w:pPr>
-              <w:numPr>
-                <w:ilvl w:val="0"/>
-                <w:numId w:val="3"/>
-              </w:numPr>
-              <w:spacing w:before="0" w:after="8" w:line="240" w:lineRule="auto"/>
-              <w:ind w:left="158" w:right="0" w:hanging="158"/>
-              <w:contextualSpacing w:val="1"/>
-              <w:rPr>
-                <w:rFonts w:ascii="Calibri" w:cs="Calibri" w:eastAsia="Calibri" w:hAnsi="Calibri"/>
-                <w:sz w:val="20"/>
-                <w:szCs w:val="20"/>
-              </w:rPr>
-            </w:pPr>
-            <w:r>
-              <w:rPr>
-                <w:rFonts w:ascii="Calibri" w:cs="Calibri" w:eastAsia="Calibri" w:hAnsi="Calibri"/>
-                <w:sz w:val="20"/>
-                <w:szCs w:val="20"/>
-                <w:rtl w:val="0"/>
-              </w:rPr>
-              <w:t xml:space="preserve">Implemented </w:t>
-            </w:r>
-            <w:r>
-              <w:rPr>
-                <w:rFonts w:ascii="Calibri" w:cs="Calibri" w:eastAsia="Calibri" w:hAnsi="Calibri"/>
                 <w:b w:val="1"/>
                 <w:bCs w:val="1"/>
                 <w:sz w:val="20"/>
@@ -3815,7 +3824,7 @@
                 <w:szCs w:val="20"/>
                 <w:rtl w:val="0"/>
               </w:rPr>
-              <w:t xml:space="preserve"> over transcripts in </w:t>
+              <w:t xml:space="preserve"> over watch-history transcripts in </w:t>
             </w:r>
             <w:r>
               <w:rPr>
@@ -3835,32 +3844,7 @@
                 <w:szCs w:val="20"/>
                 <w:rtl w:val="0"/>
               </w:rPr>
-              <w:t xml:space="preserve"> for watch-history queries</w:t>
-            </w:r>
-          </w:p>
-          <w:p>
-            <w:pPr>
-              <w:numPr>
-                <w:ilvl w:val="0"/>
-                <w:numId w:val="3"/>
-              </w:numPr>
-              <w:spacing w:before="0" w:after="8" w:line="240" w:lineRule="auto"/>
-              <w:ind w:left="158" w:right="0" w:hanging="158"/>
-              <w:contextualSpacing w:val="1"/>
-              <w:rPr>
-                <w:rFonts w:ascii="Calibri" w:cs="Calibri" w:eastAsia="Calibri" w:hAnsi="Calibri"/>
-                <w:sz w:val="20"/>
-                <w:szCs w:val="20"/>
-              </w:rPr>
-            </w:pPr>
-            <w:r>
-              <w:rPr>
-                <w:rFonts w:ascii="Calibri" w:cs="Calibri" w:eastAsia="Calibri" w:hAnsi="Calibri"/>
-                <w:sz w:val="20"/>
-                <w:szCs w:val="20"/>
-                <w:rtl w:val="0"/>
-              </w:rPr>
-              <w:t xml:space="preserve">Shipped a </w:t>
+              <w:t xml:space="preserve">; </w:t>
             </w:r>
             <w:r>
               <w:rPr>
@@ -3880,7 +3864,7 @@
                 <w:szCs w:val="20"/>
                 <w:rtl w:val="0"/>
               </w:rPr>
-              <w:t xml:space="preserve"> extension blurring YouTube by relevance without </w:t>
+              <w:t xml:space="preserve"> avoids </w:t>
             </w:r>
             <w:r>
               <w:rPr>
@@ -3904,15 +3888,6 @@
                 <w:rtl w:val="0"/>
               </w:rPr>
               <w:t xml:space="preserve">8</w:t>
-            </w:r>
-            <w:r>
-              <w:rPr>
-                <w:rFonts w:ascii="Calibri" w:cs="Calibri" w:eastAsia="Calibri" w:hAnsi="Calibri"/>
-                <w:sz w:val="20"/>
-                <w:szCs w:val="20"/>
-                <w:rtl w:val="0"/>
-              </w:rPr>
-              <w:t xml:space="preserve"> violations</w:t>
             </w:r>
           </w:p>
         </w:tc>
@@ -3931,7 +3906,7 @@
           </w:tcPr>
           <w:p>
             <w:pPr>
-              <w:spacing w:before="0" w:after="8" w:line="240" w:lineRule="auto"/>
+              <w:spacing w:before="0" w:after="2" w:line="220" w:lineRule="auto"/>
               <w:ind w:left="0" w:right="0" w:hanging="0"/>
               <w:contextualSpacing w:val="1"/>
               <w:jc w:val="center"/>
@@ -3983,7 +3958,7 @@
           </w:p>
           <w:p>
             <w:pPr>
-              <w:spacing w:before="0" w:after="8" w:line="240" w:lineRule="auto"/>
+              <w:spacing w:before="0" w:after="2" w:line="220" w:lineRule="auto"/>
               <w:ind w:left="0" w:right="0" w:hanging="0"/>
               <w:contextualSpacing w:val="1"/>
               <w:jc w:val="center"/>
@@ -4009,7 +3984,7 @@
           </w:p>
           <w:p>
             <w:pPr>
-              <w:spacing w:before="0" w:after="8" w:line="240" w:lineRule="auto"/>
+              <w:spacing w:before="0" w:after="2" w:line="220" w:lineRule="auto"/>
               <w:ind w:left="0" w:right="0" w:hanging="0"/>
               <w:contextualSpacing w:val="1"/>
               <w:jc w:val="center"/>
@@ -4038,12 +4013,11 @@
           <w:tcPr>
             <w:tcW w:w="9200" w:type="dxa"/>
             <w:gridSpan w:val="20"/>
-            <w:shd w:fill="EDF2FA" w:val="clear"/>
             <w:vAlign w:val="top"/>
           </w:tcPr>
           <w:p>
             <w:pPr>
-              <w:spacing w:before="0" w:after="8" w:line="240" w:lineRule="auto"/>
+              <w:spacing w:before="0" w:after="2" w:line="220" w:lineRule="auto"/>
               <w:ind w:left="0" w:right="0" w:hanging="0"/>
               <w:contextualSpacing w:val="1"/>
               <w:rPr>
@@ -4076,7 +4050,7 @@
                 <w:ilvl w:val="0"/>
                 <w:numId w:val="3"/>
               </w:numPr>
-              <w:spacing w:before="0" w:after="8" w:line="240" w:lineRule="auto"/>
+              <w:spacing w:before="0" w:after="2" w:line="220" w:lineRule="auto"/>
               <w:ind w:left="158" w:right="0" w:hanging="158"/>
               <w:contextualSpacing w:val="1"/>
               <w:rPr>
@@ -4112,7 +4086,7 @@
                 <w:szCs w:val="20"/>
                 <w:rtl w:val="0"/>
               </w:rPr>
-              <w:t xml:space="preserve"> with Supervisor routing and </w:t>
+              <w:t xml:space="preserve"> (Supervisor + </w:t>
             </w:r>
             <w:r>
               <w:rPr>
@@ -4144,7 +4118,18 @@
                 <w:szCs w:val="20"/>
                 <w:rtl w:val="0"/>
               </w:rPr>
-              <w:t xml:space="preserve"> over unstructured notes</w:t>
+              <w:t xml:space="preserve">) into an interactive </w:t>
+            </w:r>
+            <w:r>
+              <w:rPr>
+                <w:rFonts w:ascii="Calibri" w:cs="Calibri" w:eastAsia="Calibri" w:hAnsi="Calibri"/>
+                <w:b w:val="1"/>
+                <w:bCs w:val="1"/>
+                <w:sz w:val="20"/>
+                <w:szCs w:val="20"/>
+                <w:rtl w:val="0"/>
+              </w:rPr>
+              <w:t xml:space="preserve">3D knowledge graph</w:t>
             </w:r>
           </w:p>
           <w:p>
@@ -4153,7 +4138,7 @@
                 <w:ilvl w:val="0"/>
                 <w:numId w:val="3"/>
               </w:numPr>
-              <w:spacing w:before="0" w:after="8" w:line="240" w:lineRule="auto"/>
+              <w:spacing w:before="0" w:after="2" w:line="220" w:lineRule="auto"/>
               <w:ind w:left="158" w:right="0" w:hanging="158"/>
               <w:contextualSpacing w:val="1"/>
               <w:rPr>
@@ -4165,15 +4150,6 @@
             <w:r>
               <w:rPr>
                 <w:rFonts w:ascii="Calibri" w:cs="Calibri" w:eastAsia="Calibri" w:hAnsi="Calibri"/>
-                <w:sz w:val="20"/>
-                <w:szCs w:val="20"/>
-                <w:rtl w:val="0"/>
-              </w:rPr>
-              <w:t xml:space="preserve">Engineered </w:t>
-            </w:r>
-            <w:r>
-              <w:rPr>
-                <w:rFonts w:ascii="Calibri" w:cs="Calibri" w:eastAsia="Calibri" w:hAnsi="Calibri"/>
                 <w:b w:val="1"/>
                 <w:bCs w:val="1"/>
                 <w:sz w:val="20"/>
@@ -4200,126 +4176,16 @@
                 <w:szCs w:val="20"/>
                 <w:rtl w:val="0"/>
               </w:rPr>
-              <w:t xml:space="preserve">Neo4j</w:t>
-            </w:r>
-            <w:r>
-              <w:rPr>
-                <w:rFonts w:ascii="Calibri" w:cs="Calibri" w:eastAsia="Calibri" w:hAnsi="Calibri"/>
-                <w:sz w:val="20"/>
-                <w:szCs w:val="20"/>
-                <w:rtl w:val="0"/>
-              </w:rPr>
-              <w:t xml:space="preserve"> and </w:t>
-            </w:r>
-            <w:r>
-              <w:rPr>
-                <w:rFonts w:ascii="Calibri" w:cs="Calibri" w:eastAsia="Calibri" w:hAnsi="Calibri"/>
-                <w:b w:val="1"/>
-                <w:bCs w:val="1"/>
-                <w:sz w:val="20"/>
-                <w:szCs w:val="20"/>
-                <w:rtl w:val="0"/>
-              </w:rPr>
-              <w:t xml:space="preserve">PostgreSQL (pgvector)</w:t>
-            </w:r>
-            <w:r>
-              <w:rPr>
-                <w:rFonts w:ascii="Calibri" w:cs="Calibri" w:eastAsia="Calibri" w:hAnsi="Calibri"/>
-                <w:sz w:val="20"/>
-                <w:szCs w:val="20"/>
-                <w:rtl w:val="0"/>
-              </w:rPr>
-              <w:t xml:space="preserve"> with checkpointed agent state</w:t>
-            </w:r>
-          </w:p>
-          <w:p>
-            <w:pPr>
-              <w:numPr>
-                <w:ilvl w:val="0"/>
-                <w:numId w:val="3"/>
-              </w:numPr>
-              <w:spacing w:before="0" w:after="8" w:line="240" w:lineRule="auto"/>
-              <w:ind w:left="158" w:right="0" w:hanging="158"/>
-              <w:contextualSpacing w:val="1"/>
-              <w:rPr>
-                <w:rFonts w:ascii="Calibri" w:cs="Calibri" w:eastAsia="Calibri" w:hAnsi="Calibri"/>
-                <w:sz w:val="20"/>
-                <w:szCs w:val="20"/>
-              </w:rPr>
-            </w:pPr>
-            <w:r>
-              <w:rPr>
-                <w:rFonts w:ascii="Calibri" w:cs="Calibri" w:eastAsia="Calibri" w:hAnsi="Calibri"/>
-                <w:sz w:val="20"/>
-                <w:szCs w:val="20"/>
-                <w:rtl w:val="0"/>
-              </w:rPr>
-              <w:t xml:space="preserve">Grounded a chat agent through </w:t>
-            </w:r>
-            <w:r>
-              <w:rPr>
-                <w:rFonts w:ascii="Calibri" w:cs="Calibri" w:eastAsia="Calibri" w:hAnsi="Calibri"/>
-                <w:b w:val="1"/>
-                <w:bCs w:val="1"/>
-                <w:sz w:val="20"/>
-                <w:szCs w:val="20"/>
-                <w:rtl w:val="0"/>
-              </w:rPr>
-              <w:t xml:space="preserve">multi-hop reasoning</w:t>
-            </w:r>
-            <w:r>
-              <w:rPr>
-                <w:rFonts w:ascii="Calibri" w:cs="Calibri" w:eastAsia="Calibri" w:hAnsi="Calibri"/>
-                <w:sz w:val="20"/>
-                <w:szCs w:val="20"/>
-                <w:rtl w:val="0"/>
-              </w:rPr>
-              <w:t xml:space="preserve"> and map-reduce parallelism to cut hallucinations</w:t>
-            </w:r>
-          </w:p>
-          <w:p>
-            <w:pPr>
-              <w:numPr>
-                <w:ilvl w:val="0"/>
-                <w:numId w:val="3"/>
-              </w:numPr>
-              <w:spacing w:before="0" w:after="8" w:line="240" w:lineRule="auto"/>
-              <w:ind w:left="158" w:right="0" w:hanging="158"/>
-              <w:contextualSpacing w:val="1"/>
-              <w:rPr>
-                <w:rFonts w:ascii="Calibri" w:cs="Calibri" w:eastAsia="Calibri" w:hAnsi="Calibri"/>
-                <w:sz w:val="20"/>
-                <w:szCs w:val="20"/>
-              </w:rPr>
-            </w:pPr>
-            <w:r>
-              <w:rPr>
-                <w:rFonts w:ascii="Calibri" w:cs="Calibri" w:eastAsia="Calibri" w:hAnsi="Calibri"/>
-                <w:sz w:val="20"/>
-                <w:szCs w:val="20"/>
-                <w:rtl w:val="0"/>
-              </w:rPr>
-              <w:t xml:space="preserve">Added </w:t>
-            </w:r>
-            <w:r>
-              <w:rPr>
-                <w:rFonts w:ascii="Calibri" w:cs="Calibri" w:eastAsia="Calibri" w:hAnsi="Calibri"/>
-                <w:b w:val="1"/>
-                <w:bCs w:val="1"/>
-                <w:sz w:val="20"/>
-                <w:szCs w:val="20"/>
-                <w:rtl w:val="0"/>
-              </w:rPr>
-              <w:t xml:space="preserve">human-in-the-loop</w:t>
-            </w:r>
-            <w:r>
-              <w:rPr>
-                <w:rFonts w:ascii="Calibri" w:cs="Calibri" w:eastAsia="Calibri" w:hAnsi="Calibri"/>
-                <w:sz w:val="20"/>
-                <w:szCs w:val="20"/>
-                <w:rtl w:val="0"/>
-              </w:rPr>
-              <w:t xml:space="preserve"> concept review to keep extracted entities and relationships accurate</w:t>
+              <w:t xml:space="preserve">Neo4j + pgvector</w:t>
+            </w:r>
+            <w:r>
+              <w:rPr>
+                <w:rFonts w:ascii="Calibri" w:cs="Calibri" w:eastAsia="Calibri" w:hAnsi="Calibri"/>
+                <w:sz w:val="20"/>
+                <w:szCs w:val="20"/>
+                <w:rtl w:val="0"/>
+              </w:rPr>
+              <w:t xml:space="preserve"> with checkpointers, map-reduce, and human-in-the-loop review</w:t>
             </w:r>
           </w:p>
         </w:tc>
@@ -4331,186 +4197,271 @@
         </w:trPr>
         <w:tc>
           <w:tcPr>
-            <w:tcW w:w="1380" w:type="dxa"/>
-            <w:gridSpan w:val="3"/>
-            <w:vMerge w:val="restart"/>
-            <w:shd w:fill="1F3864" w:val="clear"/>
-            <w:vAlign w:val="center"/>
-          </w:tcPr>
-          <w:p>
-            <w:pPr>
-              <w:spacing w:before="0" w:after="8" w:line="240" w:lineRule="auto"/>
-              <w:ind w:left="0" w:right="0" w:hanging="0"/>
-              <w:contextualSpacing w:val="1"/>
-              <w:jc w:val="center"/>
-              <w:rPr>
-                <w:rFonts w:ascii="Calibri" w:cs="Calibri" w:eastAsia="Calibri" w:hAnsi="Calibri"/>
-                <w:b w:val="1"/>
-                <w:bCs w:val="1"/>
-                <w:color w:val="ffffff"/>
-                <w:sz w:val="24"/>
-                <w:szCs w:val="24"/>
-              </w:rPr>
-            </w:pPr>
-            <w:r>
-              <w:rPr>
-                <w:rFonts w:ascii="Calibri" w:cs="Calibri" w:eastAsia="Calibri" w:hAnsi="Calibri"/>
-                <w:b w:val="1"/>
-                <w:bCs w:val="1"/>
-                <w:color w:val="ffffff"/>
-                <w:sz w:val="24"/>
-                <w:szCs w:val="24"/>
-                <w:rtl w:val="0"/>
-              </w:rPr>
-              <w:t xml:space="preserve">COURSES</w:t>
-            </w:r>
-          </w:p>
-        </w:tc>
-        <w:tc>
-          <w:tcPr>
-            <w:tcW w:w="3680" w:type="dxa"/>
-            <w:gridSpan w:val="8"/>
-            <w:vAlign w:val="center"/>
-          </w:tcPr>
-          <w:p>
-            <w:pPr>
-              <w:spacing w:before="0" w:after="8" w:line="240" w:lineRule="auto"/>
-              <w:ind w:left="0" w:right="0" w:hanging="0"/>
-              <w:contextualSpacing w:val="1"/>
-              <w:jc w:val="center"/>
-              <w:rPr>
-                <w:rFonts w:ascii="Calibri" w:cs="Calibri" w:eastAsia="Calibri" w:hAnsi="Calibri"/>
-                <w:b w:val="1"/>
-                <w:bCs w:val="1"/>
-                <w:i w:val="1"/>
-                <w:iCs w:val="1"/>
-                <w:sz w:val="20"/>
-                <w:szCs w:val="20"/>
-              </w:rPr>
-            </w:pPr>
-            <w:r>
-              <w:rPr>
-                <w:rFonts w:ascii="Calibri" w:cs="Calibri" w:eastAsia="Calibri" w:hAnsi="Calibri"/>
-                <w:b w:val="1"/>
-                <w:bCs w:val="1"/>
-                <w:i w:val="1"/>
-                <w:iCs w:val="1"/>
-                <w:sz w:val="20"/>
-                <w:szCs w:val="20"/>
-                <w:rtl w:val="0"/>
-              </w:rPr>
-              <w:t xml:space="preserve">Linear Algebra, Probability &amp; Statistics</w:t>
-            </w:r>
-          </w:p>
-        </w:tc>
-        <w:tc>
-          <w:tcPr>
-            <w:tcW w:w="3220" w:type="dxa"/>
-            <w:gridSpan w:val="7"/>
-            <w:vAlign w:val="center"/>
-          </w:tcPr>
-          <w:p>
-            <w:pPr>
-              <w:spacing w:before="0" w:after="8" w:line="240" w:lineRule="auto"/>
-              <w:ind w:left="0" w:right="0" w:hanging="0"/>
-              <w:contextualSpacing w:val="1"/>
-              <w:jc w:val="center"/>
-              <w:rPr>
-                <w:rFonts w:ascii="Calibri" w:cs="Calibri" w:eastAsia="Calibri" w:hAnsi="Calibri"/>
-                <w:b w:val="1"/>
-                <w:bCs w:val="1"/>
-                <w:i w:val="1"/>
-                <w:iCs w:val="1"/>
-                <w:sz w:val="20"/>
-                <w:szCs w:val="20"/>
-              </w:rPr>
-            </w:pPr>
-            <w:r>
-              <w:rPr>
-                <w:rFonts w:ascii="Calibri" w:cs="Calibri" w:eastAsia="Calibri" w:hAnsi="Calibri"/>
-                <w:b w:val="1"/>
-                <w:bCs w:val="1"/>
-                <w:i w:val="1"/>
-                <w:iCs w:val="1"/>
-                <w:sz w:val="20"/>
-                <w:szCs w:val="20"/>
-                <w:rtl w:val="0"/>
-              </w:rPr>
-              <w:t xml:space="preserve">Machine Learning &amp; Deep Learning</w:t>
-            </w:r>
-          </w:p>
-        </w:tc>
-        <w:tc>
-          <w:tcPr>
             <w:tcW w:w="1840" w:type="dxa"/>
             <w:gridSpan w:val="4"/>
-            <w:vAlign w:val="center"/>
-          </w:tcPr>
-          <w:p>
-            <w:pPr>
-              <w:spacing w:before="0" w:after="8" w:line="240" w:lineRule="auto"/>
-              <w:ind w:left="0" w:right="0" w:hanging="0"/>
-              <w:contextualSpacing w:val="1"/>
-              <w:jc w:val="center"/>
-              <w:rPr>
-                <w:rFonts w:ascii="Calibri" w:cs="Calibri" w:eastAsia="Calibri" w:hAnsi="Calibri"/>
-                <w:b w:val="1"/>
-                <w:bCs w:val="1"/>
-                <w:i w:val="1"/>
-                <w:iCs w:val="1"/>
-                <w:sz w:val="20"/>
-                <w:szCs w:val="20"/>
-              </w:rPr>
-            </w:pPr>
-            <w:r>
-              <w:rPr>
-                <w:rFonts w:ascii="Calibri" w:cs="Calibri" w:eastAsia="Calibri" w:hAnsi="Calibri"/>
-                <w:b w:val="1"/>
-                <w:bCs w:val="1"/>
-                <w:i w:val="1"/>
-                <w:iCs w:val="1"/>
-                <w:sz w:val="20"/>
-                <w:szCs w:val="20"/>
-                <w:rtl w:val="0"/>
-              </w:rPr>
-              <w:t xml:space="preserve">Data Analytics Lab</w:t>
-            </w:r>
-          </w:p>
-        </w:tc>
-        <w:tc>
-          <w:tcPr>
-            <w:tcW w:w="920" w:type="dxa"/>
-            <w:gridSpan w:val="2"/>
-            <w:vAlign w:val="center"/>
-          </w:tcPr>
-          <w:p>
-            <w:pPr>
-              <w:spacing w:before="0" w:after="8" w:line="240" w:lineRule="auto"/>
-              <w:ind w:left="0" w:right="0" w:hanging="0"/>
-              <w:contextualSpacing w:val="1"/>
-              <w:jc w:val="center"/>
-              <w:rPr>
-                <w:rFonts w:ascii="Calibri" w:cs="Calibri" w:eastAsia="Calibri" w:hAnsi="Calibri"/>
-                <w:b w:val="1"/>
-                <w:bCs w:val="1"/>
-                <w:i w:val="1"/>
-                <w:iCs w:val="1"/>
-                <w:sz w:val="20"/>
-                <w:szCs w:val="20"/>
-              </w:rPr>
-            </w:pPr>
-            <w:r>
-              <w:rPr>
-                <w:rFonts w:ascii="Calibri" w:cs="Calibri" w:eastAsia="Calibri" w:hAnsi="Calibri"/>
-                <w:b w:val="1"/>
-                <w:bCs w:val="1"/>
-                <w:i w:val="1"/>
-                <w:iCs w:val="1"/>
-                <w:sz w:val="20"/>
-                <w:szCs w:val="20"/>
-                <w:rtl w:val="0"/>
-              </w:rPr>
-              <w:t xml:space="preserve">MLOps</w:t>
+            <w:shd w:fill="D9E2F3" w:val="clear"/>
+            <w:vAlign w:val="center"/>
+          </w:tcPr>
+          <w:p>
+            <w:pPr>
+              <w:spacing w:before="0" w:after="2" w:line="220" w:lineRule="auto"/>
+              <w:ind w:left="0" w:right="0" w:hanging="0"/>
+              <w:contextualSpacing w:val="1"/>
+              <w:jc w:val="center"/>
+              <w:rPr>
+                <w:rFonts w:ascii="Calibri" w:cs="Calibri" w:eastAsia="Calibri" w:hAnsi="Calibri"/>
+                <w:b w:val="1"/>
+                <w:bCs w:val="1"/>
+                <w:sz w:val="20"/>
+                <w:szCs w:val="20"/>
+              </w:rPr>
+            </w:pPr>
+            <w:r>
+              <w:rPr>
+                <w:rFonts w:ascii="Calibri" w:cs="Calibri" w:eastAsia="Calibri" w:hAnsi="Calibri"/>
+                <w:b w:val="1"/>
+                <w:bCs w:val="1"/>
+                <w:sz w:val="20"/>
+                <w:szCs w:val="20"/>
+                <w:rtl w:val="0"/>
+              </w:rPr>
+              <w:t xml:space="preserve">Na'vi Translator (</w:t>
+            </w:r>
+            <w:hyperlink r:id="rId32">
+              <w:r>
+                <w:rPr>
+                  <w:rFonts w:ascii="Calibri" w:cs="Calibri" w:eastAsia="Calibri" w:hAnsi="Calibri"/>
+                  <w:b w:val="1"/>
+                  <w:bCs w:val="1"/>
+                  <w:color w:val="2F5496"/>
+                  <w:sz w:val="20"/>
+                  <w:szCs w:val="20"/>
+                  <w:u w:val="single"/>
+                  <w:rtl w:val="0"/>
+                </w:rPr>
+                <w:t xml:space="preserve">Github</w:t>
+              </w:r>
+            </w:hyperlink>
+            <w:r>
+              <w:rPr>
+                <w:rFonts w:ascii="Calibri" w:cs="Calibri" w:eastAsia="Calibri" w:hAnsi="Calibri"/>
+                <w:b w:val="1"/>
+                <w:bCs w:val="1"/>
+                <w:sz w:val="20"/>
+                <w:szCs w:val="20"/>
+                <w:rtl w:val="0"/>
+              </w:rPr>
+              <w:t xml:space="preserve">)</w:t>
+            </w:r>
+          </w:p>
+          <w:p>
+            <w:pPr>
+              <w:spacing w:before="0" w:after="2" w:line="220" w:lineRule="auto"/>
+              <w:ind w:left="0" w:right="0" w:hanging="0"/>
+              <w:contextualSpacing w:val="1"/>
+              <w:jc w:val="center"/>
+              <w:rPr>
+                <w:rFonts w:ascii="Calibri" w:cs="Calibri" w:eastAsia="Calibri" w:hAnsi="Calibri"/>
+                <w:i w:val="1"/>
+                <w:iCs w:val="1"/>
+                <w:sz w:val="20"/>
+                <w:szCs w:val="20"/>
+              </w:rPr>
+            </w:pPr>
+            <w:r>
+              <w:rPr>
+                <w:rFonts w:ascii="Calibri" w:cs="Calibri" w:eastAsia="Calibri" w:hAnsi="Calibri"/>
+                <w:i w:val="1"/>
+                <w:iCs w:val="1"/>
+                <w:sz w:val="20"/>
+                <w:szCs w:val="20"/>
+                <w:rtl w:val="0"/>
+              </w:rPr>
+              <w:t xml:space="preserve">Low-Resource MLOps</w:t>
+            </w:r>
+          </w:p>
+          <w:p>
+            <w:pPr>
+              <w:spacing w:before="0" w:after="2" w:line="220" w:lineRule="auto"/>
+              <w:ind w:left="0" w:right="0" w:hanging="0"/>
+              <w:contextualSpacing w:val="1"/>
+              <w:jc w:val="center"/>
+              <w:rPr>
+                <w:rFonts w:ascii="Calibri" w:cs="Calibri" w:eastAsia="Calibri" w:hAnsi="Calibri"/>
+                <w:i w:val="1"/>
+                <w:iCs w:val="1"/>
+                <w:sz w:val="20"/>
+                <w:szCs w:val="20"/>
+              </w:rPr>
+            </w:pPr>
+            <w:r>
+              <w:rPr>
+                <w:rFonts w:ascii="Calibri" w:cs="Calibri" w:eastAsia="Calibri" w:hAnsi="Calibri"/>
+                <w:i w:val="1"/>
+                <w:iCs w:val="1"/>
+                <w:sz w:val="20"/>
+                <w:szCs w:val="20"/>
+                <w:rtl w:val="0"/>
+              </w:rPr>
+              <w:t xml:space="preserve">(Apr'26)</w:t>
+            </w:r>
+          </w:p>
+        </w:tc>
+        <w:tc>
+          <w:tcPr>
+            <w:tcW w:w="9200" w:type="dxa"/>
+            <w:gridSpan w:val="20"/>
+            <w:shd w:fill="EDF2FA" w:val="clear"/>
+            <w:vAlign w:val="top"/>
+          </w:tcPr>
+          <w:p>
+            <w:pPr>
+              <w:spacing w:before="0" w:after="2" w:line="220" w:lineRule="auto"/>
+              <w:ind w:left="0" w:right="0" w:hanging="0"/>
+              <w:contextualSpacing w:val="1"/>
+              <w:rPr>
+                <w:rFonts w:ascii="Calibri" w:cs="Calibri" w:eastAsia="Calibri" w:hAnsi="Calibri"/>
+                <w:b w:val="1"/>
+                <w:bCs w:val="1"/>
+                <w:i w:val="1"/>
+                <w:iCs w:val="1"/>
+                <w:sz w:val="20"/>
+                <w:szCs w:val="20"/>
+              </w:rPr>
+            </w:pPr>
+            <w:r>
+              <w:rPr>
+                <w:rFonts w:ascii="Calibri" w:cs="Calibri" w:eastAsia="Calibri" w:hAnsi="Calibri"/>
+                <w:b w:val="1"/>
+                <w:bCs w:val="1"/>
+                <w:i w:val="1"/>
+                <w:iCs w:val="1"/>
+                <w:sz w:val="20"/>
+                <w:szCs w:val="20"/>
+                <w:rtl w:val="0"/>
+              </w:rPr>
+              <w:t xml:space="preserve">End-to-end Na'vi→English translation with speech, text, and a full MLOps path</w:t>
+            </w:r>
+          </w:p>
+          <w:p>
+            <w:pPr>
+              <w:numPr>
+                <w:ilvl w:val="0"/>
+                <w:numId w:val="3"/>
+              </w:numPr>
+              <w:spacing w:before="0" w:after="2" w:line="220" w:lineRule="auto"/>
+              <w:ind w:left="158" w:right="0" w:hanging="158"/>
+              <w:contextualSpacing w:val="1"/>
+              <w:rPr>
+                <w:rFonts w:ascii="Calibri" w:cs="Calibri" w:eastAsia="Calibri" w:hAnsi="Calibri"/>
+                <w:sz w:val="20"/>
+                <w:szCs w:val="20"/>
+              </w:rPr>
+            </w:pPr>
+            <w:r>
+              <w:rPr>
+                <w:rFonts w:ascii="Calibri" w:cs="Calibri" w:eastAsia="Calibri" w:hAnsi="Calibri"/>
+                <w:sz w:val="20"/>
+                <w:szCs w:val="20"/>
+                <w:rtl w:val="0"/>
+              </w:rPr>
+              <w:t xml:space="preserve">Fine-tuned </w:t>
+            </w:r>
+            <w:r>
+              <w:rPr>
+                <w:rFonts w:ascii="Calibri" w:cs="Calibri" w:eastAsia="Calibri" w:hAnsi="Calibri"/>
+                <w:b w:val="1"/>
+                <w:bCs w:val="1"/>
+                <w:sz w:val="20"/>
+                <w:szCs w:val="20"/>
+                <w:rtl w:val="0"/>
+              </w:rPr>
+              <w:t xml:space="preserve">MarianMT</w:t>
+            </w:r>
+            <w:r>
+              <w:rPr>
+                <w:rFonts w:ascii="Calibri" w:cs="Calibri" w:eastAsia="Calibri" w:hAnsi="Calibri"/>
+                <w:sz w:val="20"/>
+                <w:szCs w:val="20"/>
+                <w:rtl w:val="0"/>
+              </w:rPr>
+              <w:t xml:space="preserve"> + </w:t>
+            </w:r>
+            <w:r>
+              <w:rPr>
+                <w:rFonts w:ascii="Calibri" w:cs="Calibri" w:eastAsia="Calibri" w:hAnsi="Calibri"/>
+                <w:b w:val="1"/>
+                <w:bCs w:val="1"/>
+                <w:sz w:val="20"/>
+                <w:szCs w:val="20"/>
+                <w:rtl w:val="0"/>
+              </w:rPr>
+              <w:t xml:space="preserve">Whisper-LoRA</w:t>
+            </w:r>
+            <w:r>
+              <w:rPr>
+                <w:rFonts w:ascii="Calibri" w:cs="Calibri" w:eastAsia="Calibri" w:hAnsi="Calibri"/>
+                <w:sz w:val="20"/>
+                <w:szCs w:val="20"/>
+                <w:rtl w:val="0"/>
+              </w:rPr>
+              <w:t xml:space="preserve"> ASR with dictionary fallback for a low-resource language</w:t>
+            </w:r>
+          </w:p>
+          <w:p>
+            <w:pPr>
+              <w:numPr>
+                <w:ilvl w:val="0"/>
+                <w:numId w:val="3"/>
+              </w:numPr>
+              <w:spacing w:before="0" w:after="2" w:line="220" w:lineRule="auto"/>
+              <w:ind w:left="158" w:right="0" w:hanging="158"/>
+              <w:contextualSpacing w:val="1"/>
+              <w:rPr>
+                <w:rFonts w:ascii="Calibri" w:cs="Calibri" w:eastAsia="Calibri" w:hAnsi="Calibri"/>
+                <w:sz w:val="20"/>
+                <w:szCs w:val="20"/>
+              </w:rPr>
+            </w:pPr>
+            <w:r>
+              <w:rPr>
+                <w:rFonts w:ascii="Calibri" w:cs="Calibri" w:eastAsia="Calibri" w:hAnsi="Calibri"/>
+                <w:b w:val="1"/>
+                <w:bCs w:val="1"/>
+                <w:sz w:val="20"/>
+                <w:szCs w:val="20"/>
+                <w:rtl w:val="0"/>
+              </w:rPr>
+              <w:t xml:space="preserve">DVC</w:t>
+            </w:r>
+            <w:r>
+              <w:rPr>
+                <w:rFonts w:ascii="Calibri" w:cs="Calibri" w:eastAsia="Calibri" w:hAnsi="Calibri"/>
+                <w:sz w:val="20"/>
+                <w:szCs w:val="20"/>
+                <w:rtl w:val="0"/>
+              </w:rPr>
+              <w:t xml:space="preserve">, </w:t>
+            </w:r>
+            <w:r>
+              <w:rPr>
+                <w:rFonts w:ascii="Calibri" w:cs="Calibri" w:eastAsia="Calibri" w:hAnsi="Calibri"/>
+                <w:b w:val="1"/>
+                <w:bCs w:val="1"/>
+                <w:sz w:val="20"/>
+                <w:szCs w:val="20"/>
+                <w:rtl w:val="0"/>
+              </w:rPr>
+              <w:t xml:space="preserve">MLflow</w:t>
+            </w:r>
+            <w:r>
+              <w:rPr>
+                <w:rFonts w:ascii="Calibri" w:cs="Calibri" w:eastAsia="Calibri" w:hAnsi="Calibri"/>
+                <w:sz w:val="20"/>
+                <w:szCs w:val="20"/>
+                <w:rtl w:val="0"/>
+              </w:rPr>
+              <w:t xml:space="preserve">, FastAPI, Docker Compose, Prometheus/Grafana, Airflow DAGs, GitHub Actions CI</w:t>
             </w:r>
           </w:p>
         </w:tc>
@@ -4522,178 +4473,290 @@
         </w:trPr>
         <w:tc>
           <w:tcPr>
-            <w:tcW w:w="1380" w:type="dxa"/>
-            <w:gridSpan w:val="3"/>
-            <w:vMerge w:val="continue"/>
-            <w:shd w:fill="1F3864" w:val="clear"/>
-            <w:vAlign w:val="center"/>
-          </w:tcPr>
-          <w:p>
-            <w:pPr>
-              <w:spacing w:before="0" w:after="8" w:line="240" w:lineRule="auto"/>
-              <w:ind w:left="0" w:right="0" w:hanging="0"/>
-              <w:contextualSpacing w:val="1"/>
-              <w:rPr>
-                <w:rFonts w:ascii="Calibri" w:cs="Calibri" w:eastAsia="Calibri" w:hAnsi="Calibri"/>
-                <w:sz w:val="20"/>
-                <w:szCs w:val="20"/>
-              </w:rPr>
-            </w:pPr>
-            <w:r>
-              <w:rPr>
-                <w:rFonts w:ascii="Calibri" w:cs="Calibri" w:eastAsia="Calibri" w:hAnsi="Calibri"/>
-                <w:sz w:val="20"/>
-                <w:szCs w:val="20"/>
-                <w:rtl w:val="0"/>
-              </w:rPr>
-            </w:r>
-          </w:p>
-        </w:tc>
-        <w:tc>
-          <w:tcPr>
-            <w:tcW w:w="2760" w:type="dxa"/>
-            <w:gridSpan w:val="6"/>
-            <w:vAlign w:val="center"/>
-          </w:tcPr>
-          <w:p>
-            <w:pPr>
-              <w:spacing w:before="0" w:after="8" w:line="240" w:lineRule="auto"/>
-              <w:ind w:left="0" w:right="0" w:hanging="0"/>
-              <w:contextualSpacing w:val="1"/>
-              <w:jc w:val="center"/>
-              <w:rPr>
-                <w:rFonts w:ascii="Calibri" w:cs="Calibri" w:eastAsia="Calibri" w:hAnsi="Calibri"/>
-                <w:b w:val="1"/>
-                <w:bCs w:val="1"/>
-                <w:i w:val="1"/>
-                <w:iCs w:val="1"/>
-                <w:sz w:val="20"/>
-                <w:szCs w:val="20"/>
-              </w:rPr>
-            </w:pPr>
-            <w:r>
-              <w:rPr>
-                <w:rFonts w:ascii="Calibri" w:cs="Calibri" w:eastAsia="Calibri" w:hAnsi="Calibri"/>
-                <w:b w:val="1"/>
-                <w:bCs w:val="1"/>
-                <w:i w:val="1"/>
-                <w:iCs w:val="1"/>
-                <w:sz w:val="20"/>
-                <w:szCs w:val="20"/>
-                <w:rtl w:val="0"/>
-              </w:rPr>
-              <w:t xml:space="preserve">Natural Language Processing</w:t>
-            </w:r>
-          </w:p>
-        </w:tc>
-        <w:tc>
-          <w:tcPr>
-            <w:tcW w:w="2300" w:type="dxa"/>
-            <w:gridSpan w:val="5"/>
-            <w:vAlign w:val="center"/>
-          </w:tcPr>
-          <w:p>
-            <w:pPr>
-              <w:spacing w:before="0" w:after="8" w:line="240" w:lineRule="auto"/>
-              <w:ind w:left="0" w:right="0" w:hanging="0"/>
-              <w:contextualSpacing w:val="1"/>
-              <w:jc w:val="center"/>
-              <w:rPr>
-                <w:rFonts w:ascii="Calibri" w:cs="Calibri" w:eastAsia="Calibri" w:hAnsi="Calibri"/>
-                <w:b w:val="1"/>
-                <w:bCs w:val="1"/>
-                <w:i w:val="1"/>
-                <w:iCs w:val="1"/>
-                <w:sz w:val="20"/>
-                <w:szCs w:val="20"/>
-              </w:rPr>
-            </w:pPr>
-            <w:r>
-              <w:rPr>
-                <w:rFonts w:ascii="Calibri" w:cs="Calibri" w:eastAsia="Calibri" w:hAnsi="Calibri"/>
-                <w:b w:val="1"/>
-                <w:bCs w:val="1"/>
-                <w:i w:val="1"/>
-                <w:iCs w:val="1"/>
-                <w:sz w:val="20"/>
-                <w:szCs w:val="20"/>
-                <w:rtl w:val="0"/>
-              </w:rPr>
-              <w:t xml:space="preserve">Modern Computer Vision</w:t>
-            </w:r>
-          </w:p>
-        </w:tc>
-        <w:tc>
-          <w:tcPr>
-            <w:tcW w:w="2300" w:type="dxa"/>
-            <w:gridSpan w:val="5"/>
-            <w:vAlign w:val="center"/>
-          </w:tcPr>
-          <w:p>
-            <w:pPr>
-              <w:spacing w:before="0" w:after="8" w:line="240" w:lineRule="auto"/>
-              <w:ind w:left="0" w:right="0" w:hanging="0"/>
-              <w:contextualSpacing w:val="1"/>
-              <w:jc w:val="center"/>
-              <w:rPr>
-                <w:rFonts w:ascii="Calibri" w:cs="Calibri" w:eastAsia="Calibri" w:hAnsi="Calibri"/>
-                <w:b w:val="1"/>
-                <w:bCs w:val="1"/>
-                <w:i w:val="1"/>
-                <w:iCs w:val="1"/>
-                <w:sz w:val="20"/>
-                <w:szCs w:val="20"/>
-              </w:rPr>
-            </w:pPr>
-            <w:r>
-              <w:rPr>
-                <w:rFonts w:ascii="Calibri" w:cs="Calibri" w:eastAsia="Calibri" w:hAnsi="Calibri"/>
-                <w:b w:val="1"/>
-                <w:bCs w:val="1"/>
-                <w:i w:val="1"/>
-                <w:iCs w:val="1"/>
-                <w:sz w:val="20"/>
-                <w:szCs w:val="20"/>
-                <w:rtl w:val="0"/>
-              </w:rPr>
-              <w:t xml:space="preserve">Data Science for Finance</w:t>
-            </w:r>
-          </w:p>
-        </w:tc>
-        <w:tc>
-          <w:tcPr>
-            <w:tcW w:w="2300" w:type="dxa"/>
-            <w:gridSpan w:val="5"/>
-            <w:vAlign w:val="center"/>
-          </w:tcPr>
-          <w:p>
-            <w:pPr>
-              <w:spacing w:before="0" w:after="8" w:line="240" w:lineRule="auto"/>
-              <w:ind w:left="0" w:right="0" w:hanging="0"/>
-              <w:contextualSpacing w:val="1"/>
-              <w:jc w:val="center"/>
-              <w:rPr>
-                <w:rFonts w:ascii="Calibri" w:cs="Calibri" w:eastAsia="Calibri" w:hAnsi="Calibri"/>
-                <w:b w:val="1"/>
-                <w:bCs w:val="1"/>
-                <w:i w:val="1"/>
-                <w:iCs w:val="1"/>
-                <w:sz w:val="20"/>
-                <w:szCs w:val="20"/>
-              </w:rPr>
-            </w:pPr>
-            <w:r>
-              <w:rPr>
-                <w:rFonts w:ascii="Calibri" w:cs="Calibri" w:eastAsia="Calibri" w:hAnsi="Calibri"/>
-                <w:b w:val="1"/>
-                <w:bCs w:val="1"/>
-                <w:i w:val="1"/>
-                <w:iCs w:val="1"/>
-                <w:sz w:val="20"/>
-                <w:szCs w:val="20"/>
-                <w:rtl w:val="0"/>
-              </w:rPr>
-              <w:t xml:space="preserve">Artificial Intelligence</w:t>
+            <w:tcW w:w="1840" w:type="dxa"/>
+            <w:gridSpan w:val="4"/>
+            <w:shd w:fill="D9E2F3" w:val="clear"/>
+            <w:vAlign w:val="center"/>
+          </w:tcPr>
+          <w:p>
+            <w:pPr>
+              <w:spacing w:before="0" w:after="2" w:line="220" w:lineRule="auto"/>
+              <w:ind w:left="0" w:right="0" w:hanging="0"/>
+              <w:contextualSpacing w:val="1"/>
+              <w:jc w:val="center"/>
+              <w:rPr>
+                <w:rFonts w:ascii="Calibri" w:cs="Calibri" w:eastAsia="Calibri" w:hAnsi="Calibri"/>
+                <w:b w:val="1"/>
+                <w:bCs w:val="1"/>
+                <w:sz w:val="20"/>
+                <w:szCs w:val="20"/>
+              </w:rPr>
+            </w:pPr>
+            <w:r>
+              <w:rPr>
+                <w:rFonts w:ascii="Calibri" w:cs="Calibri" w:eastAsia="Calibri" w:hAnsi="Calibri"/>
+                <w:b w:val="1"/>
+                <w:bCs w:val="1"/>
+                <w:sz w:val="20"/>
+                <w:szCs w:val="20"/>
+                <w:rtl w:val="0"/>
+              </w:rPr>
+              <w:t xml:space="preserve">LLM Metric Learning (</w:t>
+            </w:r>
+            <w:hyperlink r:id="rId33">
+              <w:r>
+                <w:rPr>
+                  <w:rFonts w:ascii="Calibri" w:cs="Calibri" w:eastAsia="Calibri" w:hAnsi="Calibri"/>
+                  <w:b w:val="1"/>
+                  <w:bCs w:val="1"/>
+                  <w:color w:val="2F5496"/>
+                  <w:sz w:val="20"/>
+                  <w:szCs w:val="20"/>
+                  <w:u w:val="single"/>
+                  <w:rtl w:val="0"/>
+                </w:rPr>
+                <w:t xml:space="preserve">Github</w:t>
+              </w:r>
+            </w:hyperlink>
+            <w:r>
+              <w:rPr>
+                <w:rFonts w:ascii="Calibri" w:cs="Calibri" w:eastAsia="Calibri" w:hAnsi="Calibri"/>
+                <w:b w:val="1"/>
+                <w:bCs w:val="1"/>
+                <w:sz w:val="20"/>
+                <w:szCs w:val="20"/>
+                <w:rtl w:val="0"/>
+              </w:rPr>
+              <w:t xml:space="preserve">)</w:t>
+            </w:r>
+          </w:p>
+          <w:p>
+            <w:pPr>
+              <w:spacing w:before="0" w:after="2" w:line="220" w:lineRule="auto"/>
+              <w:ind w:left="0" w:right="0" w:hanging="0"/>
+              <w:contextualSpacing w:val="1"/>
+              <w:jc w:val="center"/>
+              <w:rPr>
+                <w:rFonts w:ascii="Calibri" w:cs="Calibri" w:eastAsia="Calibri" w:hAnsi="Calibri"/>
+                <w:i w:val="1"/>
+                <w:iCs w:val="1"/>
+                <w:sz w:val="20"/>
+                <w:szCs w:val="20"/>
+              </w:rPr>
+            </w:pPr>
+            <w:r>
+              <w:rPr>
+                <w:rFonts w:ascii="Calibri" w:cs="Calibri" w:eastAsia="Calibri" w:hAnsi="Calibri"/>
+                <w:i w:val="1"/>
+                <w:iCs w:val="1"/>
+                <w:sz w:val="20"/>
+                <w:szCs w:val="20"/>
+                <w:rtl w:val="0"/>
+              </w:rPr>
+              <w:t xml:space="preserve">DA5401 Data Challenge</w:t>
+            </w:r>
+          </w:p>
+          <w:p>
+            <w:pPr>
+              <w:spacing w:before="0" w:after="2" w:line="220" w:lineRule="auto"/>
+              <w:ind w:left="0" w:right="0" w:hanging="0"/>
+              <w:contextualSpacing w:val="1"/>
+              <w:jc w:val="center"/>
+              <w:rPr>
+                <w:rFonts w:ascii="Calibri" w:cs="Calibri" w:eastAsia="Calibri" w:hAnsi="Calibri"/>
+                <w:i w:val="1"/>
+                <w:iCs w:val="1"/>
+                <w:sz w:val="20"/>
+                <w:szCs w:val="20"/>
+              </w:rPr>
+            </w:pPr>
+            <w:r>
+              <w:rPr>
+                <w:rFonts w:ascii="Calibri" w:cs="Calibri" w:eastAsia="Calibri" w:hAnsi="Calibri"/>
+                <w:i w:val="1"/>
+                <w:iCs w:val="1"/>
+                <w:sz w:val="20"/>
+                <w:szCs w:val="20"/>
+                <w:rtl w:val="0"/>
+              </w:rPr>
+              <w:t xml:space="preserve">(Nov'25)</w:t>
+            </w:r>
+          </w:p>
+        </w:tc>
+        <w:tc>
+          <w:tcPr>
+            <w:tcW w:w="9200" w:type="dxa"/>
+            <w:gridSpan w:val="20"/>
+            <w:vAlign w:val="top"/>
+          </w:tcPr>
+          <w:p>
+            <w:pPr>
+              <w:spacing w:before="0" w:after="2" w:line="220" w:lineRule="auto"/>
+              <w:ind w:left="0" w:right="0" w:hanging="0"/>
+              <w:contextualSpacing w:val="1"/>
+              <w:rPr>
+                <w:rFonts w:ascii="Calibri" w:cs="Calibri" w:eastAsia="Calibri" w:hAnsi="Calibri"/>
+                <w:b w:val="1"/>
+                <w:bCs w:val="1"/>
+                <w:i w:val="1"/>
+                <w:iCs w:val="1"/>
+                <w:sz w:val="20"/>
+                <w:szCs w:val="20"/>
+              </w:rPr>
+            </w:pPr>
+            <w:r>
+              <w:rPr>
+                <w:rFonts w:ascii="Calibri" w:cs="Calibri" w:eastAsia="Calibri" w:hAnsi="Calibri"/>
+                <w:b w:val="1"/>
+                <w:bCs w:val="1"/>
+                <w:i w:val="1"/>
+                <w:iCs w:val="1"/>
+                <w:sz w:val="20"/>
+                <w:szCs w:val="20"/>
+                <w:rtl w:val="0"/>
+              </w:rPr>
+              <w:t xml:space="preserve">Metric fitness scoring for multilingual LLM responses</w:t>
+            </w:r>
+          </w:p>
+          <w:p>
+            <w:pPr>
+              <w:numPr>
+                <w:ilvl w:val="0"/>
+                <w:numId w:val="3"/>
+              </w:numPr>
+              <w:spacing w:before="0" w:after="2" w:line="220" w:lineRule="auto"/>
+              <w:ind w:left="158" w:right="0" w:hanging="158"/>
+              <w:contextualSpacing w:val="1"/>
+              <w:rPr>
+                <w:rFonts w:ascii="Calibri" w:cs="Calibri" w:eastAsia="Calibri" w:hAnsi="Calibri"/>
+                <w:sz w:val="20"/>
+                <w:szCs w:val="20"/>
+              </w:rPr>
+            </w:pPr>
+            <w:r>
+              <w:rPr>
+                <w:rFonts w:ascii="Calibri" w:cs="Calibri" w:eastAsia="Calibri" w:hAnsi="Calibri"/>
+                <w:b w:val="1"/>
+                <w:bCs w:val="1"/>
+                <w:sz w:val="20"/>
+                <w:szCs w:val="20"/>
+                <w:rtl w:val="0"/>
+              </w:rPr>
+              <w:t xml:space="preserve">multilingual-e5-large</w:t>
+            </w:r>
+            <w:r>
+              <w:rPr>
+                <w:rFonts w:ascii="Calibri" w:cs="Calibri" w:eastAsia="Calibri" w:hAnsi="Calibri"/>
+                <w:sz w:val="20"/>
+                <w:szCs w:val="20"/>
+                <w:rtl w:val="0"/>
+              </w:rPr>
+              <w:t xml:space="preserve"> embeddings with a </w:t>
+            </w:r>
+            <w:r>
+              <w:rPr>
+                <w:rFonts w:ascii="Calibri" w:cs="Calibri" w:eastAsia="Calibri" w:hAnsi="Calibri"/>
+                <w:b w:val="1"/>
+                <w:bCs w:val="1"/>
+                <w:sz w:val="20"/>
+                <w:szCs w:val="20"/>
+                <w:rtl w:val="0"/>
+              </w:rPr>
+              <w:t xml:space="preserve">LightGBM/XGBoost</w:t>
+            </w:r>
+            <w:r>
+              <w:rPr>
+                <w:rFonts w:ascii="Calibri" w:cs="Calibri" w:eastAsia="Calibri" w:hAnsi="Calibri"/>
+                <w:sz w:val="20"/>
+                <w:szCs w:val="20"/>
+                <w:rtl w:val="0"/>
+              </w:rPr>
+              <w:t xml:space="preserve"> ensemble</w:t>
+            </w:r>
+          </w:p>
+          <w:p>
+            <w:pPr>
+              <w:numPr>
+                <w:ilvl w:val="0"/>
+                <w:numId w:val="3"/>
+              </w:numPr>
+              <w:spacing w:before="0" w:after="2" w:line="220" w:lineRule="auto"/>
+              <w:ind w:left="158" w:right="0" w:hanging="158"/>
+              <w:contextualSpacing w:val="1"/>
+              <w:rPr>
+                <w:rFonts w:ascii="Calibri" w:cs="Calibri" w:eastAsia="Calibri" w:hAnsi="Calibri"/>
+                <w:sz w:val="20"/>
+                <w:szCs w:val="20"/>
+              </w:rPr>
+            </w:pPr>
+            <w:r>
+              <w:rPr>
+                <w:rFonts w:ascii="Calibri" w:cs="Calibri" w:eastAsia="Calibri" w:hAnsi="Calibri"/>
+                <w:sz w:val="20"/>
+                <w:szCs w:val="20"/>
+                <w:rtl w:val="0"/>
+              </w:rPr>
+              <w:t xml:space="preserve">Synthetic negatives and </w:t>
+            </w:r>
+            <w:r>
+              <w:rPr>
+                <w:rFonts w:ascii="Calibri" w:cs="Calibri" w:eastAsia="Calibri" w:hAnsi="Calibri"/>
+                <w:b w:val="1"/>
+                <w:bCs w:val="1"/>
+                <w:sz w:val="20"/>
+                <w:szCs w:val="20"/>
+                <w:rtl w:val="0"/>
+              </w:rPr>
+              <w:t xml:space="preserve">quantile calibration</w:t>
+            </w:r>
+            <w:r>
+              <w:rPr>
+                <w:rFonts w:ascii="Calibri" w:cs="Calibri" w:eastAsia="Calibri" w:hAnsi="Calibri"/>
+                <w:sz w:val="20"/>
+                <w:szCs w:val="20"/>
+                <w:rtl w:val="0"/>
+              </w:rPr>
+              <w:t xml:space="preserve">; </w:t>
+            </w:r>
+            <w:r>
+              <w:rPr>
+                <w:rFonts w:ascii="Calibri" w:cs="Calibri" w:eastAsia="Calibri" w:hAnsi="Calibri"/>
+                <w:b w:val="1"/>
+                <w:bCs w:val="1"/>
+                <w:sz w:val="20"/>
+                <w:szCs w:val="20"/>
+                <w:rtl w:val="0"/>
+              </w:rPr>
+              <w:t xml:space="preserve">RMSE 0.82</w:t>
+            </w:r>
+            <w:r>
+              <w:rPr>
+                <w:rFonts w:ascii="Calibri" w:cs="Calibri" w:eastAsia="Calibri" w:hAnsi="Calibri"/>
+                <w:sz w:val="20"/>
+                <w:szCs w:val="20"/>
+                <w:rtl w:val="0"/>
+              </w:rPr>
+              <w:t xml:space="preserve"> (</w:t>
+            </w:r>
+            <w:r>
+              <w:rPr>
+                <w:rFonts w:ascii="Calibri" w:cs="Calibri" w:eastAsia="Calibri" w:hAnsi="Calibri"/>
+                <w:b w:val="1"/>
+                <w:bCs w:val="1"/>
+                <w:sz w:val="20"/>
+                <w:szCs w:val="20"/>
+                <w:rtl w:val="0"/>
+              </w:rPr>
+              <w:t xml:space="preserve">17.2%</w:t>
+            </w:r>
+            <w:r>
+              <w:rPr>
+                <w:rFonts w:ascii="Calibri" w:cs="Calibri" w:eastAsia="Calibri" w:hAnsi="Calibri"/>
+                <w:sz w:val="20"/>
+                <w:szCs w:val="20"/>
+                <w:rtl w:val="0"/>
+              </w:rPr>
+              <w:t xml:space="preserve"> vs mean baseline)</w:t>
             </w:r>
           </w:p>
         </w:tc>
@@ -4705,37 +4768,311 @@
         </w:trPr>
         <w:tc>
           <w:tcPr>
-            <w:tcW w:w="11040" w:type="dxa"/>
-            <w:gridSpan w:val="24"/>
-            <w:shd w:fill="1F3864" w:val="clear"/>
-            <w:vAlign w:val="center"/>
-          </w:tcPr>
-          <w:p>
-            <w:pPr>
-              <w:spacing w:before="0" w:after="8" w:line="240" w:lineRule="auto"/>
-              <w:ind w:left="0" w:right="0" w:hanging="0"/>
-              <w:contextualSpacing w:val="1"/>
-              <w:jc w:val="center"/>
-              <w:rPr>
-                <w:rFonts w:ascii="Calibri" w:cs="Calibri" w:eastAsia="Calibri" w:hAnsi="Calibri"/>
-                <w:b w:val="1"/>
-                <w:bCs w:val="1"/>
-                <w:color w:val="ffffff"/>
-                <w:sz w:val="24"/>
-                <w:szCs w:val="24"/>
-              </w:rPr>
-            </w:pPr>
-            <w:r>
-              <w:rPr>
-                <w:rFonts w:ascii="Calibri" w:cs="Calibri" w:eastAsia="Calibri" w:hAnsi="Calibri"/>
-                <w:b w:val="1"/>
-                <w:bCs w:val="1"/>
-                <w:color w:val="ffffff"/>
-                <w:sz w:val="24"/>
-                <w:szCs w:val="24"/>
-                <w:rtl w:val="0"/>
-              </w:rPr>
-              <w:t xml:space="preserve">PUBLICATION AND POSITIONS OF RESPONSIBILITY</w:t>
+            <w:tcW w:w="1840" w:type="dxa"/>
+            <w:gridSpan w:val="4"/>
+            <w:shd w:fill="D9E2F3" w:val="clear"/>
+            <w:vAlign w:val="center"/>
+          </w:tcPr>
+          <w:p>
+            <w:pPr>
+              <w:spacing w:before="0" w:after="2" w:line="220" w:lineRule="auto"/>
+              <w:ind w:left="0" w:right="0" w:hanging="0"/>
+              <w:contextualSpacing w:val="1"/>
+              <w:jc w:val="center"/>
+              <w:rPr>
+                <w:rFonts w:ascii="Calibri" w:cs="Calibri" w:eastAsia="Calibri" w:hAnsi="Calibri"/>
+                <w:b w:val="1"/>
+                <w:bCs w:val="1"/>
+                <w:sz w:val="20"/>
+                <w:szCs w:val="20"/>
+              </w:rPr>
+            </w:pPr>
+            <w:r>
+              <w:rPr>
+                <w:rFonts w:ascii="Calibri" w:cs="Calibri" w:eastAsia="Calibri" w:hAnsi="Calibri"/>
+                <w:b w:val="1"/>
+                <w:bCs w:val="1"/>
+                <w:sz w:val="20"/>
+                <w:szCs w:val="20"/>
+                <w:rtl w:val="0"/>
+              </w:rPr>
+              <w:t xml:space="preserve">Deep Learning Systems (</w:t>
+            </w:r>
+            <w:hyperlink r:id="rId34">
+              <w:r>
+                <w:rPr>
+                  <w:rFonts w:ascii="Calibri" w:cs="Calibri" w:eastAsia="Calibri" w:hAnsi="Calibri"/>
+                  <w:b w:val="1"/>
+                  <w:bCs w:val="1"/>
+                  <w:color w:val="2F5496"/>
+                  <w:sz w:val="20"/>
+                  <w:szCs w:val="20"/>
+                  <w:u w:val="single"/>
+                  <w:rtl w:val="0"/>
+                </w:rPr>
+                <w:t xml:space="preserve">Github</w:t>
+              </w:r>
+            </w:hyperlink>
+            <w:r>
+              <w:rPr>
+                <w:rFonts w:ascii="Calibri" w:cs="Calibri" w:eastAsia="Calibri" w:hAnsi="Calibri"/>
+                <w:b w:val="1"/>
+                <w:bCs w:val="1"/>
+                <w:sz w:val="20"/>
+                <w:szCs w:val="20"/>
+                <w:rtl w:val="0"/>
+              </w:rPr>
+              <w:t xml:space="preserve">)</w:t>
+            </w:r>
+          </w:p>
+          <w:p>
+            <w:pPr>
+              <w:spacing w:before="0" w:after="2" w:line="220" w:lineRule="auto"/>
+              <w:ind w:left="0" w:right="0" w:hanging="0"/>
+              <w:contextualSpacing w:val="1"/>
+              <w:jc w:val="center"/>
+              <w:rPr>
+                <w:rFonts w:ascii="Calibri" w:cs="Calibri" w:eastAsia="Calibri" w:hAnsi="Calibri"/>
+                <w:i w:val="1"/>
+                <w:iCs w:val="1"/>
+                <w:sz w:val="20"/>
+                <w:szCs w:val="20"/>
+              </w:rPr>
+            </w:pPr>
+            <w:r>
+              <w:rPr>
+                <w:rFonts w:ascii="Calibri" w:cs="Calibri" w:eastAsia="Calibri" w:hAnsi="Calibri"/>
+                <w:i w:val="1"/>
+                <w:iCs w:val="1"/>
+                <w:sz w:val="20"/>
+                <w:szCs w:val="20"/>
+                <w:rtl w:val="0"/>
+              </w:rPr>
+              <w:t xml:space="preserve">Transformer + Multitask CV</w:t>
+            </w:r>
+          </w:p>
+          <w:p>
+            <w:pPr>
+              <w:spacing w:before="0" w:after="2" w:line="220" w:lineRule="auto"/>
+              <w:ind w:left="0" w:right="0" w:hanging="0"/>
+              <w:contextualSpacing w:val="1"/>
+              <w:jc w:val="center"/>
+              <w:rPr>
+                <w:rFonts w:ascii="Calibri" w:cs="Calibri" w:eastAsia="Calibri" w:hAnsi="Calibri"/>
+                <w:i w:val="1"/>
+                <w:iCs w:val="1"/>
+                <w:sz w:val="20"/>
+                <w:szCs w:val="20"/>
+              </w:rPr>
+            </w:pPr>
+            <w:r>
+              <w:rPr>
+                <w:rFonts w:ascii="Calibri" w:cs="Calibri" w:eastAsia="Calibri" w:hAnsi="Calibri"/>
+                <w:i w:val="1"/>
+                <w:iCs w:val="1"/>
+                <w:sz w:val="20"/>
+                <w:szCs w:val="20"/>
+                <w:rtl w:val="0"/>
+              </w:rPr>
+              <w:t xml:space="preserve">(2026)</w:t>
+            </w:r>
+          </w:p>
+        </w:tc>
+        <w:tc>
+          <w:tcPr>
+            <w:tcW w:w="9200" w:type="dxa"/>
+            <w:gridSpan w:val="20"/>
+            <w:shd w:fill="EDF2FA" w:val="clear"/>
+            <w:vAlign w:val="top"/>
+          </w:tcPr>
+          <w:p>
+            <w:pPr>
+              <w:spacing w:before="0" w:after="2" w:line="220" w:lineRule="auto"/>
+              <w:ind w:left="0" w:right="0" w:hanging="0"/>
+              <w:contextualSpacing w:val="1"/>
+              <w:rPr>
+                <w:rFonts w:ascii="Calibri" w:cs="Calibri" w:eastAsia="Calibri" w:hAnsi="Calibri"/>
+                <w:b w:val="1"/>
+                <w:bCs w:val="1"/>
+                <w:i w:val="1"/>
+                <w:iCs w:val="1"/>
+                <w:sz w:val="20"/>
+                <w:szCs w:val="20"/>
+              </w:rPr>
+            </w:pPr>
+            <w:r>
+              <w:rPr>
+                <w:rFonts w:ascii="Calibri" w:cs="Calibri" w:eastAsia="Calibri" w:hAnsi="Calibri"/>
+                <w:b w:val="1"/>
+                <w:bCs w:val="1"/>
+                <w:i w:val="1"/>
+                <w:iCs w:val="1"/>
+                <w:sz w:val="20"/>
+                <w:szCs w:val="20"/>
+                <w:rtl w:val="0"/>
+              </w:rPr>
+              <w:t xml:space="preserve">From-scratch Transformer and shared-backbone multitask computer vision</w:t>
+            </w:r>
+          </w:p>
+          <w:p>
+            <w:pPr>
+              <w:numPr>
+                <w:ilvl w:val="0"/>
+                <w:numId w:val="3"/>
+              </w:numPr>
+              <w:spacing w:before="0" w:after="2" w:line="220" w:lineRule="auto"/>
+              <w:ind w:left="158" w:right="0" w:hanging="158"/>
+              <w:contextualSpacing w:val="1"/>
+              <w:rPr>
+                <w:rFonts w:ascii="Calibri" w:cs="Calibri" w:eastAsia="Calibri" w:hAnsi="Calibri"/>
+                <w:sz w:val="20"/>
+                <w:szCs w:val="20"/>
+              </w:rPr>
+            </w:pPr>
+            <w:r>
+              <w:rPr>
+                <w:rFonts w:ascii="Calibri" w:cs="Calibri" w:eastAsia="Calibri" w:hAnsi="Calibri"/>
+                <w:sz w:val="20"/>
+                <w:szCs w:val="20"/>
+                <w:rtl w:val="0"/>
+              </w:rPr>
+              <w:t xml:space="preserve">From-scratch </w:t>
+            </w:r>
+            <w:r>
+              <w:rPr>
+                <w:rFonts w:ascii="Calibri" w:cs="Calibri" w:eastAsia="Calibri" w:hAnsi="Calibri"/>
+                <w:b w:val="1"/>
+                <w:bCs w:val="1"/>
+                <w:sz w:val="20"/>
+                <w:szCs w:val="20"/>
+                <w:rtl w:val="0"/>
+              </w:rPr>
+              <w:t xml:space="preserve">Transformer</w:t>
+            </w:r>
+            <w:r>
+              <w:rPr>
+                <w:rFonts w:ascii="Calibri" w:cs="Calibri" w:eastAsia="Calibri" w:hAnsi="Calibri"/>
+                <w:sz w:val="20"/>
+                <w:szCs w:val="20"/>
+                <w:rtl w:val="0"/>
+              </w:rPr>
+              <w:t xml:space="preserve"> in PyTorch for Multi30k </w:t>
+            </w:r>
+            <w:r>
+              <w:rPr>
+                <w:rFonts w:ascii="Calibri" w:cs="Calibri" w:eastAsia="Calibri" w:hAnsi="Calibri"/>
+                <w:b w:val="1"/>
+                <w:bCs w:val="1"/>
+                <w:sz w:val="20"/>
+                <w:szCs w:val="20"/>
+                <w:rtl w:val="0"/>
+              </w:rPr>
+              <w:t xml:space="preserve">DE→EN</w:t>
+            </w:r>
+            <w:r>
+              <w:rPr>
+                <w:rFonts w:ascii="Calibri" w:cs="Calibri" w:eastAsia="Calibri" w:hAnsi="Calibri"/>
+                <w:sz w:val="20"/>
+                <w:szCs w:val="20"/>
+                <w:rtl w:val="0"/>
+              </w:rPr>
+              <w:t xml:space="preserve"> (Noam schedule, label smoothing, BLEU)</w:t>
+            </w:r>
+          </w:p>
+          <w:p>
+            <w:pPr>
+              <w:numPr>
+                <w:ilvl w:val="0"/>
+                <w:numId w:val="3"/>
+              </w:numPr>
+              <w:spacing w:before="0" w:after="2" w:line="220" w:lineRule="auto"/>
+              <w:ind w:left="158" w:right="0" w:hanging="158"/>
+              <w:contextualSpacing w:val="1"/>
+              <w:rPr>
+                <w:rFonts w:ascii="Calibri" w:cs="Calibri" w:eastAsia="Calibri" w:hAnsi="Calibri"/>
+                <w:sz w:val="20"/>
+                <w:szCs w:val="20"/>
+              </w:rPr>
+            </w:pPr>
+            <w:r>
+              <w:rPr>
+                <w:rFonts w:ascii="Calibri" w:cs="Calibri" w:eastAsia="Calibri" w:hAnsi="Calibri"/>
+                <w:sz w:val="20"/>
+                <w:szCs w:val="20"/>
+                <w:rtl w:val="0"/>
+              </w:rPr>
+              <w:t xml:space="preserve">Shared </w:t>
+            </w:r>
+            <w:r>
+              <w:rPr>
+                <w:rFonts w:ascii="Calibri" w:cs="Calibri" w:eastAsia="Calibri" w:hAnsi="Calibri"/>
+                <w:b w:val="1"/>
+                <w:bCs w:val="1"/>
+                <w:sz w:val="20"/>
+                <w:szCs w:val="20"/>
+                <w:rtl w:val="0"/>
+              </w:rPr>
+              <w:t xml:space="preserve">VGG11-BN</w:t>
+            </w:r>
+            <w:r>
+              <w:rPr>
+                <w:rFonts w:ascii="Calibri" w:cs="Calibri" w:eastAsia="Calibri" w:hAnsi="Calibri"/>
+                <w:sz w:val="20"/>
+                <w:szCs w:val="20"/>
+                <w:rtl w:val="0"/>
+              </w:rPr>
+              <w:t xml:space="preserve"> Pets model: </w:t>
+            </w:r>
+            <w:r>
+              <w:rPr>
+                <w:rFonts w:ascii="Calibri" w:cs="Calibri" w:eastAsia="Calibri" w:hAnsi="Calibri"/>
+                <w:b w:val="1"/>
+                <w:bCs w:val="1"/>
+                <w:sz w:val="20"/>
+                <w:szCs w:val="20"/>
+                <w:rtl w:val="0"/>
+              </w:rPr>
+              <w:t xml:space="preserve">F1 ≥ 0.93</w:t>
+            </w:r>
+            <w:r>
+              <w:rPr>
+                <w:rFonts w:ascii="Calibri" w:cs="Calibri" w:eastAsia="Calibri" w:hAnsi="Calibri"/>
+                <w:sz w:val="20"/>
+                <w:szCs w:val="20"/>
+                <w:rtl w:val="0"/>
+              </w:rPr>
+              <w:t xml:space="preserve">, </w:t>
+            </w:r>
+            <w:r>
+              <w:rPr>
+                <w:rFonts w:ascii="Calibri" w:cs="Calibri" w:eastAsia="Calibri" w:hAnsi="Calibri"/>
+                <w:b w:val="1"/>
+                <w:bCs w:val="1"/>
+                <w:sz w:val="20"/>
+                <w:szCs w:val="20"/>
+                <w:rtl w:val="0"/>
+              </w:rPr>
+              <w:t xml:space="preserve">Acc@IoU0.5 ≥ 91%</w:t>
+            </w:r>
+            <w:r>
+              <w:rPr>
+                <w:rFonts w:ascii="Calibri" w:cs="Calibri" w:eastAsia="Calibri" w:hAnsi="Calibri"/>
+                <w:sz w:val="20"/>
+                <w:szCs w:val="20"/>
+                <w:rtl w:val="0"/>
+              </w:rPr>
+              <w:t xml:space="preserve">, </w:t>
+            </w:r>
+            <w:r>
+              <w:rPr>
+                <w:rFonts w:ascii="Calibri" w:cs="Calibri" w:eastAsia="Calibri" w:hAnsi="Calibri"/>
+                <w:b w:val="1"/>
+                <w:bCs w:val="1"/>
+                <w:sz w:val="20"/>
+                <w:szCs w:val="20"/>
+                <w:rtl w:val="0"/>
+              </w:rPr>
+              <w:t xml:space="preserve">Dice ≥ 0.82</w:t>
             </w:r>
           </w:p>
         </w:tc>
@@ -4747,213 +5084,186 @@
         </w:trPr>
         <w:tc>
           <w:tcPr>
+            <w:tcW w:w="1380" w:type="dxa"/>
+            <w:gridSpan w:val="3"/>
+            <w:vMerge w:val="restart"/>
+            <w:shd w:fill="1F3864" w:val="clear"/>
+            <w:vAlign w:val="center"/>
+          </w:tcPr>
+          <w:p>
+            <w:pPr>
+              <w:spacing w:before="0" w:after="2" w:line="220" w:lineRule="auto"/>
+              <w:ind w:left="0" w:right="0" w:hanging="0"/>
+              <w:contextualSpacing w:val="1"/>
+              <w:jc w:val="center"/>
+              <w:rPr>
+                <w:rFonts w:ascii="Calibri" w:cs="Calibri" w:eastAsia="Calibri" w:hAnsi="Calibri"/>
+                <w:b w:val="1"/>
+                <w:bCs w:val="1"/>
+                <w:color w:val="ffffff"/>
+                <w:sz w:val="24"/>
+                <w:szCs w:val="24"/>
+              </w:rPr>
+            </w:pPr>
+            <w:r>
+              <w:rPr>
+                <w:rFonts w:ascii="Calibri" w:cs="Calibri" w:eastAsia="Calibri" w:hAnsi="Calibri"/>
+                <w:b w:val="1"/>
+                <w:bCs w:val="1"/>
+                <w:color w:val="ffffff"/>
+                <w:sz w:val="24"/>
+                <w:szCs w:val="24"/>
+                <w:rtl w:val="0"/>
+              </w:rPr>
+              <w:t xml:space="preserve">COURSES</w:t>
+            </w:r>
+          </w:p>
+        </w:tc>
+        <w:tc>
+          <w:tcPr>
+            <w:tcW w:w="3680" w:type="dxa"/>
+            <w:gridSpan w:val="8"/>
+            <w:vAlign w:val="center"/>
+          </w:tcPr>
+          <w:p>
+            <w:pPr>
+              <w:spacing w:before="0" w:after="2" w:line="220" w:lineRule="auto"/>
+              <w:ind w:left="0" w:right="0" w:hanging="0"/>
+              <w:contextualSpacing w:val="1"/>
+              <w:jc w:val="center"/>
+              <w:rPr>
+                <w:rFonts w:ascii="Calibri" w:cs="Calibri" w:eastAsia="Calibri" w:hAnsi="Calibri"/>
+                <w:b w:val="1"/>
+                <w:bCs w:val="1"/>
+                <w:i w:val="1"/>
+                <w:iCs w:val="1"/>
+                <w:sz w:val="20"/>
+                <w:szCs w:val="20"/>
+              </w:rPr>
+            </w:pPr>
+            <w:r>
+              <w:rPr>
+                <w:rFonts w:ascii="Calibri" w:cs="Calibri" w:eastAsia="Calibri" w:hAnsi="Calibri"/>
+                <w:b w:val="1"/>
+                <w:bCs w:val="1"/>
+                <w:i w:val="1"/>
+                <w:iCs w:val="1"/>
+                <w:sz w:val="20"/>
+                <w:szCs w:val="20"/>
+                <w:rtl w:val="0"/>
+              </w:rPr>
+              <w:t xml:space="preserve">Linear Algebra, Probability &amp; Statistics</w:t>
+            </w:r>
+          </w:p>
+        </w:tc>
+        <w:tc>
+          <w:tcPr>
+            <w:tcW w:w="3220" w:type="dxa"/>
+            <w:gridSpan w:val="7"/>
+            <w:vAlign w:val="center"/>
+          </w:tcPr>
+          <w:p>
+            <w:pPr>
+              <w:spacing w:before="0" w:after="2" w:line="220" w:lineRule="auto"/>
+              <w:ind w:left="0" w:right="0" w:hanging="0"/>
+              <w:contextualSpacing w:val="1"/>
+              <w:jc w:val="center"/>
+              <w:rPr>
+                <w:rFonts w:ascii="Calibri" w:cs="Calibri" w:eastAsia="Calibri" w:hAnsi="Calibri"/>
+                <w:b w:val="1"/>
+                <w:bCs w:val="1"/>
+                <w:i w:val="1"/>
+                <w:iCs w:val="1"/>
+                <w:sz w:val="20"/>
+                <w:szCs w:val="20"/>
+              </w:rPr>
+            </w:pPr>
+            <w:r>
+              <w:rPr>
+                <w:rFonts w:ascii="Calibri" w:cs="Calibri" w:eastAsia="Calibri" w:hAnsi="Calibri"/>
+                <w:b w:val="1"/>
+                <w:bCs w:val="1"/>
+                <w:i w:val="1"/>
+                <w:iCs w:val="1"/>
+                <w:sz w:val="20"/>
+                <w:szCs w:val="20"/>
+                <w:rtl w:val="0"/>
+              </w:rPr>
+              <w:t xml:space="preserve">Machine Learning &amp; Deep Learning</w:t>
+            </w:r>
+          </w:p>
+        </w:tc>
+        <w:tc>
+          <w:tcPr>
             <w:tcW w:w="1840" w:type="dxa"/>
             <w:gridSpan w:val="4"/>
-            <w:shd w:fill="D9E2F3" w:val="clear"/>
-            <w:vAlign w:val="center"/>
-          </w:tcPr>
-          <w:p>
-            <w:pPr>
-              <w:spacing w:before="0" w:after="8" w:line="240" w:lineRule="auto"/>
-              <w:ind w:left="0" w:right="0" w:hanging="0"/>
-              <w:contextualSpacing w:val="1"/>
-              <w:jc w:val="center"/>
-              <w:rPr>
-                <w:rFonts w:ascii="Calibri" w:cs="Calibri" w:eastAsia="Calibri" w:hAnsi="Calibri"/>
-                <w:b w:val="1"/>
-                <w:bCs w:val="1"/>
-                <w:sz w:val="20"/>
-                <w:szCs w:val="20"/>
-              </w:rPr>
-            </w:pPr>
-            <w:r>
-              <w:rPr>
-                <w:rFonts w:ascii="Calibri" w:cs="Calibri" w:eastAsia="Calibri" w:hAnsi="Calibri"/>
-                <w:b w:val="1"/>
-                <w:bCs w:val="1"/>
-                <w:sz w:val="20"/>
-                <w:szCs w:val="20"/>
-                <w:rtl w:val="0"/>
-              </w:rPr>
-              <w:t xml:space="preserve">2024 IEEE CONNECT</w:t>
-            </w:r>
-          </w:p>
-          <w:p>
-            <w:pPr>
-              <w:spacing w:before="0" w:after="8" w:line="240" w:lineRule="auto"/>
-              <w:ind w:left="0" w:right="0" w:hanging="0"/>
-              <w:contextualSpacing w:val="1"/>
-              <w:jc w:val="center"/>
-              <w:rPr>
-                <w:rFonts w:ascii="Calibri" w:cs="Calibri" w:eastAsia="Calibri" w:hAnsi="Calibri"/>
-                <w:i w:val="1"/>
-                <w:iCs w:val="1"/>
-                <w:sz w:val="20"/>
-                <w:szCs w:val="20"/>
-              </w:rPr>
-            </w:pPr>
-            <w:r>
-              <w:rPr>
-                <w:rFonts w:ascii="Calibri" w:cs="Calibri" w:eastAsia="Calibri" w:hAnsi="Calibri"/>
-                <w:i w:val="1"/>
-                <w:iCs w:val="1"/>
-                <w:sz w:val="20"/>
-                <w:szCs w:val="20"/>
-                <w:rtl w:val="0"/>
-              </w:rPr>
-              <w:t xml:space="preserve">Publication</w:t>
-            </w:r>
-          </w:p>
-          <w:p>
-            <w:pPr>
-              <w:spacing w:before="0" w:after="8" w:line="240" w:lineRule="auto"/>
-              <w:ind w:left="0" w:right="0" w:hanging="0"/>
-              <w:contextualSpacing w:val="1"/>
-              <w:jc w:val="center"/>
-              <w:rPr>
-                <w:rFonts w:ascii="Calibri" w:cs="Calibri" w:eastAsia="Calibri" w:hAnsi="Calibri"/>
-                <w:i w:val="1"/>
-                <w:iCs w:val="1"/>
-                <w:sz w:val="20"/>
-                <w:szCs w:val="20"/>
-              </w:rPr>
-            </w:pPr>
-            <w:r>
-              <w:rPr>
-                <w:rFonts w:ascii="Calibri" w:cs="Calibri" w:eastAsia="Calibri" w:hAnsi="Calibri"/>
-                <w:i w:val="1"/>
-                <w:iCs w:val="1"/>
-                <w:sz w:val="20"/>
-                <w:szCs w:val="20"/>
-                <w:rtl w:val="0"/>
-              </w:rPr>
-              <w:t xml:space="preserve">(Jul'24)</w:t>
-            </w:r>
-          </w:p>
-        </w:tc>
-        <w:tc>
-          <w:tcPr>
-            <w:tcW w:w="9200" w:type="dxa"/>
-            <w:gridSpan w:val="20"/>
-            <w:vAlign w:val="top"/>
-          </w:tcPr>
-          <w:p>
-            <w:pPr>
-              <w:spacing w:before="0" w:after="8" w:line="240" w:lineRule="auto"/>
-              <w:ind w:left="0" w:right="0" w:hanging="0"/>
-              <w:contextualSpacing w:val="1"/>
-              <w:rPr>
-                <w:rFonts w:ascii="Calibri" w:cs="Calibri" w:eastAsia="Calibri" w:hAnsi="Calibri"/>
-                <w:b w:val="1"/>
-                <w:bCs w:val="1"/>
-                <w:i w:val="1"/>
-                <w:iCs w:val="1"/>
-                <w:sz w:val="20"/>
-                <w:szCs w:val="20"/>
-              </w:rPr>
-            </w:pPr>
-            <w:r>
-              <w:rPr>
-                <w:rFonts w:ascii="Calibri" w:cs="Calibri" w:eastAsia="Calibri" w:hAnsi="Calibri"/>
-                <w:b w:val="1"/>
-                <w:bCs w:val="1"/>
-                <w:i w:val="1"/>
-                <w:iCs w:val="1"/>
-                <w:sz w:val="20"/>
-                <w:szCs w:val="20"/>
-                <w:rtl w:val="0"/>
-              </w:rPr>
-              <w:t xml:space="preserve">Comparative study of path-planning algorithms for autonomous mobile robots</w:t>
-            </w:r>
-          </w:p>
-          <w:p>
-            <w:pPr>
-              <w:numPr>
-                <w:ilvl w:val="0"/>
-                <w:numId w:val="3"/>
-              </w:numPr>
-              <w:spacing w:before="0" w:after="8" w:line="240" w:lineRule="auto"/>
-              <w:ind w:left="158" w:right="0" w:hanging="158"/>
-              <w:contextualSpacing w:val="1"/>
-              <w:rPr>
-                <w:rFonts w:ascii="Calibri" w:cs="Calibri" w:eastAsia="Calibri" w:hAnsi="Calibri"/>
-                <w:sz w:val="20"/>
-                <w:szCs w:val="20"/>
-              </w:rPr>
-            </w:pPr>
-            <w:r>
-              <w:rPr>
-                <w:rFonts w:ascii="Calibri" w:cs="Calibri" w:eastAsia="Calibri" w:hAnsi="Calibri"/>
-                <w:sz w:val="20"/>
-                <w:szCs w:val="20"/>
-                <w:rtl w:val="0"/>
-              </w:rPr>
-              <w:t xml:space="preserve">Co-authored a comparison of </w:t>
-            </w:r>
-            <w:r>
-              <w:rPr>
-                <w:rFonts w:ascii="Calibri" w:cs="Calibri" w:eastAsia="Calibri" w:hAnsi="Calibri"/>
-                <w:b w:val="1"/>
-                <w:bCs w:val="1"/>
-                <w:sz w:val="20"/>
-                <w:szCs w:val="20"/>
-                <w:rtl w:val="0"/>
-              </w:rPr>
-              <w:t xml:space="preserve">Bidirectional A*, D* and D* Lite</w:t>
-            </w:r>
-            <w:r>
-              <w:rPr>
-                <w:rFonts w:ascii="Calibri" w:cs="Calibri" w:eastAsia="Calibri" w:hAnsi="Calibri"/>
-                <w:sz w:val="20"/>
-                <w:szCs w:val="20"/>
-                <w:rtl w:val="0"/>
-              </w:rPr>
-              <w:t xml:space="preserve"> planners with Python simulations</w:t>
-            </w:r>
-          </w:p>
-          <w:p>
-            <w:pPr>
-              <w:numPr>
-                <w:ilvl w:val="0"/>
-                <w:numId w:val="3"/>
-              </w:numPr>
-              <w:spacing w:before="0" w:after="8" w:line="240" w:lineRule="auto"/>
-              <w:ind w:left="158" w:right="0" w:hanging="158"/>
-              <w:contextualSpacing w:val="1"/>
-              <w:rPr>
-                <w:rFonts w:ascii="Calibri" w:cs="Calibri" w:eastAsia="Calibri" w:hAnsi="Calibri"/>
-                <w:sz w:val="20"/>
-                <w:szCs w:val="20"/>
-              </w:rPr>
-            </w:pPr>
-            <w:r>
-              <w:rPr>
-                <w:rFonts w:ascii="Calibri" w:cs="Calibri" w:eastAsia="Calibri" w:hAnsi="Calibri"/>
-                <w:sz w:val="20"/>
-                <w:szCs w:val="20"/>
-                <w:rtl w:val="0"/>
-              </w:rPr>
-              <w:t xml:space="preserve">Validated the planners on hardware using a </w:t>
-            </w:r>
-            <w:r>
-              <w:rPr>
-                <w:rFonts w:ascii="Calibri" w:cs="Calibri" w:eastAsia="Calibri" w:hAnsi="Calibri"/>
-                <w:b w:val="1"/>
-                <w:bCs w:val="1"/>
-                <w:sz w:val="20"/>
-                <w:szCs w:val="20"/>
-                <w:rtl w:val="0"/>
-              </w:rPr>
-              <w:t xml:space="preserve">NodeMCU</w:t>
-            </w:r>
-            <w:r>
-              <w:rPr>
-                <w:rFonts w:ascii="Calibri" w:cs="Calibri" w:eastAsia="Calibri" w:hAnsi="Calibri"/>
-                <w:sz w:val="20"/>
-                <w:szCs w:val="20"/>
-                <w:rtl w:val="0"/>
-              </w:rPr>
-              <w:t xml:space="preserve">-controlled mecanum-wheel robot</w:t>
+            <w:vAlign w:val="center"/>
+          </w:tcPr>
+          <w:p>
+            <w:pPr>
+              <w:spacing w:before="0" w:after="2" w:line="220" w:lineRule="auto"/>
+              <w:ind w:left="0" w:right="0" w:hanging="0"/>
+              <w:contextualSpacing w:val="1"/>
+              <w:jc w:val="center"/>
+              <w:rPr>
+                <w:rFonts w:ascii="Calibri" w:cs="Calibri" w:eastAsia="Calibri" w:hAnsi="Calibri"/>
+                <w:b w:val="1"/>
+                <w:bCs w:val="1"/>
+                <w:i w:val="1"/>
+                <w:iCs w:val="1"/>
+                <w:sz w:val="20"/>
+                <w:szCs w:val="20"/>
+              </w:rPr>
+            </w:pPr>
+            <w:r>
+              <w:rPr>
+                <w:rFonts w:ascii="Calibri" w:cs="Calibri" w:eastAsia="Calibri" w:hAnsi="Calibri"/>
+                <w:b w:val="1"/>
+                <w:bCs w:val="1"/>
+                <w:i w:val="1"/>
+                <w:iCs w:val="1"/>
+                <w:sz w:val="20"/>
+                <w:szCs w:val="20"/>
+                <w:rtl w:val="0"/>
+              </w:rPr>
+              <w:t xml:space="preserve">Data Analytics Lab</w:t>
+            </w:r>
+          </w:p>
+        </w:tc>
+        <w:tc>
+          <w:tcPr>
+            <w:tcW w:w="920" w:type="dxa"/>
+            <w:gridSpan w:val="2"/>
+            <w:vAlign w:val="center"/>
+          </w:tcPr>
+          <w:p>
+            <w:pPr>
+              <w:spacing w:before="0" w:after="2" w:line="220" w:lineRule="auto"/>
+              <w:ind w:left="0" w:right="0" w:hanging="0"/>
+              <w:contextualSpacing w:val="1"/>
+              <w:jc w:val="center"/>
+              <w:rPr>
+                <w:rFonts w:ascii="Calibri" w:cs="Calibri" w:eastAsia="Calibri" w:hAnsi="Calibri"/>
+                <w:b w:val="1"/>
+                <w:bCs w:val="1"/>
+                <w:i w:val="1"/>
+                <w:iCs w:val="1"/>
+                <w:sz w:val="20"/>
+                <w:szCs w:val="20"/>
+              </w:rPr>
+            </w:pPr>
+            <w:r>
+              <w:rPr>
+                <w:rFonts w:ascii="Calibri" w:cs="Calibri" w:eastAsia="Calibri" w:hAnsi="Calibri"/>
+                <w:b w:val="1"/>
+                <w:bCs w:val="1"/>
+                <w:i w:val="1"/>
+                <w:iCs w:val="1"/>
+                <w:sz w:val="20"/>
+                <w:szCs w:val="20"/>
+                <w:rtl w:val="0"/>
+              </w:rPr>
+              <w:t xml:space="preserve">MLOps</w:t>
             </w:r>
           </w:p>
         </w:tc>
@@ -4965,194 +5275,178 @@
         </w:trPr>
         <w:tc>
           <w:tcPr>
-            <w:tcW w:w="1840" w:type="dxa"/>
-            <w:gridSpan w:val="4"/>
-            <w:shd w:fill="D9E2F3" w:val="clear"/>
-            <w:vAlign w:val="center"/>
-          </w:tcPr>
-          <w:p>
-            <w:pPr>
-              <w:spacing w:before="0" w:after="8" w:line="240" w:lineRule="auto"/>
-              <w:ind w:left="0" w:right="0" w:hanging="0"/>
-              <w:contextualSpacing w:val="1"/>
-              <w:jc w:val="center"/>
-              <w:rPr>
-                <w:rFonts w:ascii="Calibri" w:cs="Calibri" w:eastAsia="Calibri" w:hAnsi="Calibri"/>
-                <w:b w:val="1"/>
-                <w:bCs w:val="1"/>
-                <w:sz w:val="20"/>
-                <w:szCs w:val="20"/>
-              </w:rPr>
-            </w:pPr>
-            <w:r>
-              <w:rPr>
-                <w:rFonts w:ascii="Calibri" w:cs="Calibri" w:eastAsia="Calibri" w:hAnsi="Calibri"/>
-                <w:b w:val="1"/>
-                <w:bCs w:val="1"/>
-                <w:sz w:val="20"/>
-                <w:szCs w:val="20"/>
-                <w:rtl w:val="0"/>
-              </w:rPr>
-              <w:t xml:space="preserve">Deputy Placement</w:t>
-            </w:r>
-          </w:p>
-          <w:p>
-            <w:pPr>
-              <w:spacing w:before="0" w:after="8" w:line="240" w:lineRule="auto"/>
-              <w:ind w:left="0" w:right="0" w:hanging="0"/>
-              <w:contextualSpacing w:val="1"/>
-              <w:jc w:val="center"/>
-              <w:rPr>
-                <w:rFonts w:ascii="Calibri" w:cs="Calibri" w:eastAsia="Calibri" w:hAnsi="Calibri"/>
-                <w:b w:val="1"/>
-                <w:bCs w:val="1"/>
-                <w:sz w:val="20"/>
-                <w:szCs w:val="20"/>
-              </w:rPr>
-            </w:pPr>
-            <w:r>
-              <w:rPr>
-                <w:rFonts w:ascii="Calibri" w:cs="Calibri" w:eastAsia="Calibri" w:hAnsi="Calibri"/>
-                <w:b w:val="1"/>
-                <w:bCs w:val="1"/>
-                <w:sz w:val="20"/>
-                <w:szCs w:val="20"/>
-                <w:rtl w:val="0"/>
-              </w:rPr>
-              <w:t xml:space="preserve">Coordinator, IITM</w:t>
-            </w:r>
-          </w:p>
-          <w:p>
-            <w:pPr>
-              <w:spacing w:before="0" w:after="8" w:line="240" w:lineRule="auto"/>
-              <w:ind w:left="0" w:right="0" w:hanging="0"/>
-              <w:contextualSpacing w:val="1"/>
-              <w:jc w:val="center"/>
-              <w:rPr>
-                <w:rFonts w:ascii="Calibri" w:cs="Calibri" w:eastAsia="Calibri" w:hAnsi="Calibri"/>
-                <w:i w:val="1"/>
-                <w:iCs w:val="1"/>
-                <w:sz w:val="20"/>
-                <w:szCs w:val="20"/>
-              </w:rPr>
-            </w:pPr>
-            <w:r>
-              <w:rPr>
-                <w:rFonts w:ascii="Calibri" w:cs="Calibri" w:eastAsia="Calibri" w:hAnsi="Calibri"/>
-                <w:i w:val="1"/>
-                <w:iCs w:val="1"/>
-                <w:sz w:val="20"/>
-                <w:szCs w:val="20"/>
-                <w:rtl w:val="0"/>
-              </w:rPr>
-              <w:t xml:space="preserve">(Aug'25 – Present)</w:t>
-            </w:r>
-          </w:p>
-        </w:tc>
-        <w:tc>
-          <w:tcPr>
-            <w:tcW w:w="9200" w:type="dxa"/>
-            <w:gridSpan w:val="20"/>
-            <w:shd w:fill="EDF2FA" w:val="clear"/>
-            <w:vAlign w:val="top"/>
-          </w:tcPr>
-          <w:p>
-            <w:pPr>
-              <w:spacing w:before="0" w:after="8" w:line="240" w:lineRule="auto"/>
-              <w:ind w:left="0" w:right="0" w:hanging="0"/>
-              <w:contextualSpacing w:val="1"/>
-              <w:rPr>
-                <w:rFonts w:ascii="Calibri" w:cs="Calibri" w:eastAsia="Calibri" w:hAnsi="Calibri"/>
-                <w:b w:val="1"/>
-                <w:bCs w:val="1"/>
-                <w:i w:val="1"/>
-                <w:iCs w:val="1"/>
-                <w:sz w:val="20"/>
-                <w:szCs w:val="20"/>
-              </w:rPr>
-            </w:pPr>
-            <w:r>
-              <w:rPr>
-                <w:rFonts w:ascii="Calibri" w:cs="Calibri" w:eastAsia="Calibri" w:hAnsi="Calibri"/>
-                <w:b w:val="1"/>
-                <w:bCs w:val="1"/>
-                <w:i w:val="1"/>
-                <w:iCs w:val="1"/>
-                <w:sz w:val="20"/>
-                <w:szCs w:val="20"/>
-                <w:rtl w:val="0"/>
-              </w:rPr>
-              <w:t xml:space="preserve">Academic Affairs Secretary, Placement &amp; Internship Cell, Data Science and AI</w:t>
-            </w:r>
-          </w:p>
-          <w:p>
-            <w:pPr>
-              <w:numPr>
-                <w:ilvl w:val="0"/>
-                <w:numId w:val="3"/>
-              </w:numPr>
-              <w:spacing w:before="0" w:after="8" w:line="240" w:lineRule="auto"/>
-              <w:ind w:left="158" w:right="0" w:hanging="158"/>
-              <w:contextualSpacing w:val="1"/>
-              <w:rPr>
-                <w:rFonts w:ascii="Calibri" w:cs="Calibri" w:eastAsia="Calibri" w:hAnsi="Calibri"/>
-                <w:sz w:val="20"/>
-                <w:szCs w:val="20"/>
-              </w:rPr>
-            </w:pPr>
-            <w:r>
-              <w:rPr>
-                <w:rFonts w:ascii="Calibri" w:cs="Calibri" w:eastAsia="Calibri" w:hAnsi="Calibri"/>
-                <w:sz w:val="20"/>
-                <w:szCs w:val="20"/>
-                <w:rtl w:val="0"/>
-              </w:rPr>
-              <w:t xml:space="preserve">Handled industry outreach, campus logistics and </w:t>
-            </w:r>
-            <w:r>
-              <w:rPr>
-                <w:rFonts w:ascii="Calibri" w:cs="Calibri" w:eastAsia="Calibri" w:hAnsi="Calibri"/>
-                <w:b w:val="1"/>
-                <w:bCs w:val="1"/>
-                <w:sz w:val="20"/>
-                <w:szCs w:val="20"/>
-                <w:rtl w:val="0"/>
-              </w:rPr>
-              <w:t xml:space="preserve">end-to-end recruitment</w:t>
-            </w:r>
-            <w:r>
-              <w:rPr>
-                <w:rFonts w:ascii="Calibri" w:cs="Calibri" w:eastAsia="Calibri" w:hAnsi="Calibri"/>
-                <w:sz w:val="20"/>
-                <w:szCs w:val="20"/>
-                <w:rtl w:val="0"/>
-              </w:rPr>
-              <w:t xml:space="preserve"> for the 2025 season</w:t>
-            </w:r>
-          </w:p>
-          <w:p>
-            <w:pPr>
-              <w:numPr>
-                <w:ilvl w:val="0"/>
-                <w:numId w:val="3"/>
-              </w:numPr>
-              <w:spacing w:before="0" w:after="8" w:line="240" w:lineRule="auto"/>
-              <w:ind w:left="158" w:right="0" w:hanging="158"/>
-              <w:contextualSpacing w:val="1"/>
-              <w:rPr>
-                <w:rFonts w:ascii="Calibri" w:cs="Calibri" w:eastAsia="Calibri" w:hAnsi="Calibri"/>
-                <w:sz w:val="20"/>
-                <w:szCs w:val="20"/>
-              </w:rPr>
-            </w:pPr>
-            <w:r>
-              <w:rPr>
-                <w:rFonts w:ascii="Calibri" w:cs="Calibri" w:eastAsia="Calibri" w:hAnsi="Calibri"/>
-                <w:sz w:val="20"/>
-                <w:szCs w:val="20"/>
-                <w:rtl w:val="0"/>
-              </w:rPr>
-              <w:t xml:space="preserve">Built workflows that streamlined scheduling and coordination across the placement process</w:t>
+            <w:tcW w:w="1380" w:type="dxa"/>
+            <w:gridSpan w:val="3"/>
+            <w:vMerge w:val="continue"/>
+            <w:shd w:fill="1F3864" w:val="clear"/>
+            <w:vAlign w:val="center"/>
+          </w:tcPr>
+          <w:p>
+            <w:pPr>
+              <w:spacing w:before="0" w:after="2" w:line="220" w:lineRule="auto"/>
+              <w:ind w:left="0" w:right="0" w:hanging="0"/>
+              <w:contextualSpacing w:val="1"/>
+              <w:rPr>
+                <w:rFonts w:ascii="Calibri" w:cs="Calibri" w:eastAsia="Calibri" w:hAnsi="Calibri"/>
+                <w:sz w:val="20"/>
+                <w:szCs w:val="20"/>
+              </w:rPr>
+            </w:pPr>
+            <w:r>
+              <w:rPr>
+                <w:rFonts w:ascii="Calibri" w:cs="Calibri" w:eastAsia="Calibri" w:hAnsi="Calibri"/>
+                <w:sz w:val="20"/>
+                <w:szCs w:val="20"/>
+                <w:rtl w:val="0"/>
+              </w:rPr>
+            </w:r>
+          </w:p>
+        </w:tc>
+        <w:tc>
+          <w:tcPr>
+            <w:tcW w:w="2760" w:type="dxa"/>
+            <w:gridSpan w:val="6"/>
+            <w:vAlign w:val="center"/>
+          </w:tcPr>
+          <w:p>
+            <w:pPr>
+              <w:spacing w:before="0" w:after="2" w:line="220" w:lineRule="auto"/>
+              <w:ind w:left="0" w:right="0" w:hanging="0"/>
+              <w:contextualSpacing w:val="1"/>
+              <w:jc w:val="center"/>
+              <w:rPr>
+                <w:rFonts w:ascii="Calibri" w:cs="Calibri" w:eastAsia="Calibri" w:hAnsi="Calibri"/>
+                <w:b w:val="1"/>
+                <w:bCs w:val="1"/>
+                <w:i w:val="1"/>
+                <w:iCs w:val="1"/>
+                <w:sz w:val="20"/>
+                <w:szCs w:val="20"/>
+              </w:rPr>
+            </w:pPr>
+            <w:r>
+              <w:rPr>
+                <w:rFonts w:ascii="Calibri" w:cs="Calibri" w:eastAsia="Calibri" w:hAnsi="Calibri"/>
+                <w:b w:val="1"/>
+                <w:bCs w:val="1"/>
+                <w:i w:val="1"/>
+                <w:iCs w:val="1"/>
+                <w:sz w:val="20"/>
+                <w:szCs w:val="20"/>
+                <w:rtl w:val="0"/>
+              </w:rPr>
+              <w:t xml:space="preserve">Natural Language Processing</w:t>
+            </w:r>
+          </w:p>
+        </w:tc>
+        <w:tc>
+          <w:tcPr>
+            <w:tcW w:w="2300" w:type="dxa"/>
+            <w:gridSpan w:val="5"/>
+            <w:vAlign w:val="center"/>
+          </w:tcPr>
+          <w:p>
+            <w:pPr>
+              <w:spacing w:before="0" w:after="2" w:line="220" w:lineRule="auto"/>
+              <w:ind w:left="0" w:right="0" w:hanging="0"/>
+              <w:contextualSpacing w:val="1"/>
+              <w:jc w:val="center"/>
+              <w:rPr>
+                <w:rFonts w:ascii="Calibri" w:cs="Calibri" w:eastAsia="Calibri" w:hAnsi="Calibri"/>
+                <w:b w:val="1"/>
+                <w:bCs w:val="1"/>
+                <w:i w:val="1"/>
+                <w:iCs w:val="1"/>
+                <w:sz w:val="20"/>
+                <w:szCs w:val="20"/>
+              </w:rPr>
+            </w:pPr>
+            <w:r>
+              <w:rPr>
+                <w:rFonts w:ascii="Calibri" w:cs="Calibri" w:eastAsia="Calibri" w:hAnsi="Calibri"/>
+                <w:b w:val="1"/>
+                <w:bCs w:val="1"/>
+                <w:i w:val="1"/>
+                <w:iCs w:val="1"/>
+                <w:sz w:val="20"/>
+                <w:szCs w:val="20"/>
+                <w:rtl w:val="0"/>
+              </w:rPr>
+              <w:t xml:space="preserve">Modern Computer Vision</w:t>
+            </w:r>
+          </w:p>
+        </w:tc>
+        <w:tc>
+          <w:tcPr>
+            <w:tcW w:w="2300" w:type="dxa"/>
+            <w:gridSpan w:val="5"/>
+            <w:vAlign w:val="center"/>
+          </w:tcPr>
+          <w:p>
+            <w:pPr>
+              <w:spacing w:before="0" w:after="2" w:line="220" w:lineRule="auto"/>
+              <w:ind w:left="0" w:right="0" w:hanging="0"/>
+              <w:contextualSpacing w:val="1"/>
+              <w:jc w:val="center"/>
+              <w:rPr>
+                <w:rFonts w:ascii="Calibri" w:cs="Calibri" w:eastAsia="Calibri" w:hAnsi="Calibri"/>
+                <w:b w:val="1"/>
+                <w:bCs w:val="1"/>
+                <w:i w:val="1"/>
+                <w:iCs w:val="1"/>
+                <w:sz w:val="20"/>
+                <w:szCs w:val="20"/>
+              </w:rPr>
+            </w:pPr>
+            <w:r>
+              <w:rPr>
+                <w:rFonts w:ascii="Calibri" w:cs="Calibri" w:eastAsia="Calibri" w:hAnsi="Calibri"/>
+                <w:b w:val="1"/>
+                <w:bCs w:val="1"/>
+                <w:i w:val="1"/>
+                <w:iCs w:val="1"/>
+                <w:sz w:val="20"/>
+                <w:szCs w:val="20"/>
+                <w:rtl w:val="0"/>
+              </w:rPr>
+              <w:t xml:space="preserve">Data Science for Finance</w:t>
+            </w:r>
+          </w:p>
+        </w:tc>
+        <w:tc>
+          <w:tcPr>
+            <w:tcW w:w="2300" w:type="dxa"/>
+            <w:gridSpan w:val="5"/>
+            <w:vAlign w:val="center"/>
+          </w:tcPr>
+          <w:p>
+            <w:pPr>
+              <w:spacing w:before="0" w:after="2" w:line="220" w:lineRule="auto"/>
+              <w:ind w:left="0" w:right="0" w:hanging="0"/>
+              <w:contextualSpacing w:val="1"/>
+              <w:jc w:val="center"/>
+              <w:rPr>
+                <w:rFonts w:ascii="Calibri" w:cs="Calibri" w:eastAsia="Calibri" w:hAnsi="Calibri"/>
+                <w:b w:val="1"/>
+                <w:bCs w:val="1"/>
+                <w:i w:val="1"/>
+                <w:iCs w:val="1"/>
+                <w:sz w:val="20"/>
+                <w:szCs w:val="20"/>
+              </w:rPr>
+            </w:pPr>
+            <w:r>
+              <w:rPr>
+                <w:rFonts w:ascii="Calibri" w:cs="Calibri" w:eastAsia="Calibri" w:hAnsi="Calibri"/>
+                <w:b w:val="1"/>
+                <w:bCs w:val="1"/>
+                <w:i w:val="1"/>
+                <w:iCs w:val="1"/>
+                <w:sz w:val="20"/>
+                <w:szCs w:val="20"/>
+                <w:rtl w:val="0"/>
+              </w:rPr>
+              <w:t xml:space="preserve">Artificial Intelligence</w:t>
             </w:r>
           </w:p>
         </w:tc>
@@ -5164,233 +5458,37 @@
         </w:trPr>
         <w:tc>
           <w:tcPr>
-            <w:tcW w:w="1840" w:type="dxa"/>
-            <w:gridSpan w:val="4"/>
-            <w:shd w:fill="D9E2F3" w:val="clear"/>
-            <w:vAlign w:val="center"/>
-          </w:tcPr>
-          <w:p>
-            <w:pPr>
-              <w:spacing w:before="0" w:after="8" w:line="240" w:lineRule="auto"/>
-              <w:ind w:left="0" w:right="0" w:hanging="0"/>
-              <w:contextualSpacing w:val="1"/>
-              <w:jc w:val="center"/>
-              <w:rPr>
-                <w:rFonts w:ascii="Calibri" w:cs="Calibri" w:eastAsia="Calibri" w:hAnsi="Calibri"/>
-                <w:b w:val="1"/>
-                <w:bCs w:val="1"/>
-                <w:sz w:val="20"/>
-                <w:szCs w:val="20"/>
-              </w:rPr>
-            </w:pPr>
-            <w:r>
-              <w:rPr>
-                <w:rFonts w:ascii="Calibri" w:cs="Calibri" w:eastAsia="Calibri" w:hAnsi="Calibri"/>
-                <w:b w:val="1"/>
-                <w:bCs w:val="1"/>
-                <w:sz w:val="20"/>
-                <w:szCs w:val="20"/>
-                <w:rtl w:val="0"/>
-              </w:rPr>
-              <w:t xml:space="preserve">Lead Coordinator</w:t>
-            </w:r>
-          </w:p>
-          <w:p>
-            <w:pPr>
-              <w:spacing w:before="0" w:after="8" w:line="240" w:lineRule="auto"/>
-              <w:ind w:left="0" w:right="0" w:hanging="0"/>
-              <w:contextualSpacing w:val="1"/>
-              <w:jc w:val="center"/>
-              <w:rPr>
-                <w:rFonts w:ascii="Calibri" w:cs="Calibri" w:eastAsia="Calibri" w:hAnsi="Calibri"/>
-                <w:i w:val="1"/>
-                <w:iCs w:val="1"/>
-                <w:sz w:val="20"/>
-                <w:szCs w:val="20"/>
-              </w:rPr>
-            </w:pPr>
-            <w:r>
-              <w:rPr>
-                <w:rFonts w:ascii="Calibri" w:cs="Calibri" w:eastAsia="Calibri" w:hAnsi="Calibri"/>
-                <w:i w:val="1"/>
-                <w:iCs w:val="1"/>
-                <w:sz w:val="20"/>
-                <w:szCs w:val="20"/>
-                <w:rtl w:val="0"/>
-              </w:rPr>
-              <w:t xml:space="preserve">Gokulashtami</w:t>
-            </w:r>
-          </w:p>
-          <w:p>
-            <w:pPr>
-              <w:spacing w:before="0" w:after="8" w:line="240" w:lineRule="auto"/>
-              <w:ind w:left="0" w:right="0" w:hanging="0"/>
-              <w:contextualSpacing w:val="1"/>
-              <w:jc w:val="center"/>
-              <w:rPr>
-                <w:rFonts w:ascii="Calibri" w:cs="Calibri" w:eastAsia="Calibri" w:hAnsi="Calibri"/>
-                <w:i w:val="1"/>
-                <w:iCs w:val="1"/>
-                <w:sz w:val="20"/>
-                <w:szCs w:val="20"/>
-              </w:rPr>
-            </w:pPr>
-            <w:r>
-              <w:rPr>
-                <w:rFonts w:ascii="Calibri" w:cs="Calibri" w:eastAsia="Calibri" w:hAnsi="Calibri"/>
-                <w:i w:val="1"/>
-                <w:iCs w:val="1"/>
-                <w:sz w:val="20"/>
-                <w:szCs w:val="20"/>
-                <w:rtl w:val="0"/>
-              </w:rPr>
-              <w:t xml:space="preserve">(Oct'23 &amp; Oct'24)</w:t>
-            </w:r>
-          </w:p>
-        </w:tc>
-        <w:tc>
-          <w:tcPr>
-            <w:tcW w:w="9200" w:type="dxa"/>
-            <w:gridSpan w:val="20"/>
-            <w:vAlign w:val="top"/>
-          </w:tcPr>
-          <w:p>
-            <w:pPr>
-              <w:spacing w:before="0" w:after="8" w:line="240" w:lineRule="auto"/>
-              <w:ind w:left="0" w:right="0" w:hanging="0"/>
-              <w:contextualSpacing w:val="1"/>
-              <w:rPr>
-                <w:rFonts w:ascii="Calibri" w:cs="Calibri" w:eastAsia="Calibri" w:hAnsi="Calibri"/>
-                <w:b w:val="1"/>
-                <w:bCs w:val="1"/>
-                <w:i w:val="1"/>
-                <w:iCs w:val="1"/>
-                <w:sz w:val="20"/>
-                <w:szCs w:val="20"/>
-              </w:rPr>
-            </w:pPr>
-            <w:r>
-              <w:rPr>
-                <w:rFonts w:ascii="Calibri" w:cs="Calibri" w:eastAsia="Calibri" w:hAnsi="Calibri"/>
-                <w:b w:val="1"/>
-                <w:bCs w:val="1"/>
-                <w:i w:val="1"/>
-                <w:iCs w:val="1"/>
-                <w:sz w:val="20"/>
-                <w:szCs w:val="20"/>
-                <w:rtl w:val="0"/>
-              </w:rPr>
-              <w:t xml:space="preserve">Annual cultural fest, Amrita Vishwa Vidyapeetham</w:t>
-            </w:r>
-          </w:p>
-          <w:p>
-            <w:pPr>
-              <w:numPr>
-                <w:ilvl w:val="0"/>
-                <w:numId w:val="3"/>
-              </w:numPr>
-              <w:spacing w:before="0" w:after="8" w:line="240" w:lineRule="auto"/>
-              <w:ind w:left="158" w:right="0" w:hanging="158"/>
-              <w:contextualSpacing w:val="1"/>
-              <w:rPr>
-                <w:rFonts w:ascii="Calibri" w:cs="Calibri" w:eastAsia="Calibri" w:hAnsi="Calibri"/>
-                <w:sz w:val="20"/>
-                <w:szCs w:val="20"/>
-              </w:rPr>
-            </w:pPr>
-            <w:r>
-              <w:rPr>
-                <w:rFonts w:ascii="Calibri" w:cs="Calibri" w:eastAsia="Calibri" w:hAnsi="Calibri"/>
-                <w:sz w:val="20"/>
-                <w:szCs w:val="20"/>
-                <w:rtl w:val="0"/>
-              </w:rPr>
-              <w:t xml:space="preserve">Led the department contingent across two editions and won the </w:t>
-            </w:r>
-            <w:r>
-              <w:rPr>
-                <w:rFonts w:ascii="Calibri" w:cs="Calibri" w:eastAsia="Calibri" w:hAnsi="Calibri"/>
-                <w:b w:val="1"/>
-                <w:bCs w:val="1"/>
-                <w:sz w:val="20"/>
-                <w:szCs w:val="20"/>
-                <w:rtl w:val="0"/>
-              </w:rPr>
-              <w:t xml:space="preserve">Best Decoration</w:t>
-            </w:r>
-            <w:r>
-              <w:rPr>
-                <w:rFonts w:ascii="Calibri" w:cs="Calibri" w:eastAsia="Calibri" w:hAnsi="Calibri"/>
-                <w:sz w:val="20"/>
-                <w:szCs w:val="20"/>
-                <w:rtl w:val="0"/>
-              </w:rPr>
-              <w:t xml:space="preserve"> award</w:t>
-            </w:r>
-          </w:p>
-          <w:p>
-            <w:pPr>
-              <w:numPr>
-                <w:ilvl w:val="0"/>
-                <w:numId w:val="3"/>
-              </w:numPr>
-              <w:spacing w:before="0" w:after="8" w:line="240" w:lineRule="auto"/>
-              <w:ind w:left="158" w:right="0" w:hanging="158"/>
-              <w:contextualSpacing w:val="1"/>
-              <w:rPr>
-                <w:rFonts w:ascii="Calibri" w:cs="Calibri" w:eastAsia="Calibri" w:hAnsi="Calibri"/>
-                <w:sz w:val="20"/>
-                <w:szCs w:val="20"/>
-              </w:rPr>
-            </w:pPr>
-            <w:r>
-              <w:rPr>
-                <w:rFonts w:ascii="Calibri" w:cs="Calibri" w:eastAsia="Calibri" w:hAnsi="Calibri"/>
-                <w:sz w:val="20"/>
-                <w:szCs w:val="20"/>
-                <w:rtl w:val="0"/>
-              </w:rPr>
-              <w:t xml:space="preserve">Secured </w:t>
-            </w:r>
-            <w:r>
-              <w:rPr>
-                <w:rFonts w:ascii="Calibri" w:cs="Calibri" w:eastAsia="Calibri" w:hAnsi="Calibri"/>
-                <w:b w:val="1"/>
-                <w:bCs w:val="1"/>
-                <w:sz w:val="20"/>
-                <w:szCs w:val="20"/>
-                <w:rtl w:val="0"/>
-              </w:rPr>
-              <w:t xml:space="preserve">Runner-up (2023)</w:t>
-            </w:r>
-            <w:r>
-              <w:rPr>
-                <w:rFonts w:ascii="Calibri" w:cs="Calibri" w:eastAsia="Calibri" w:hAnsi="Calibri"/>
-                <w:sz w:val="20"/>
-                <w:szCs w:val="20"/>
-                <w:rtl w:val="0"/>
-              </w:rPr>
-              <w:t xml:space="preserve"> and </w:t>
-            </w:r>
-            <w:r>
-              <w:rPr>
-                <w:rFonts w:ascii="Calibri" w:cs="Calibri" w:eastAsia="Calibri" w:hAnsi="Calibri"/>
-                <w:b w:val="1"/>
-                <w:bCs w:val="1"/>
-                <w:sz w:val="20"/>
-                <w:szCs w:val="20"/>
-                <w:rtl w:val="0"/>
-              </w:rPr>
-              <w:t xml:space="preserve">Winner (2024)</w:t>
-            </w:r>
-            <w:r>
-              <w:rPr>
-                <w:rFonts w:ascii="Calibri" w:cs="Calibri" w:eastAsia="Calibri" w:hAnsi="Calibri"/>
-                <w:sz w:val="20"/>
-                <w:szCs w:val="20"/>
-                <w:rtl w:val="0"/>
-              </w:rPr>
-              <w:t xml:space="preserve"> for the department in the overall category</w:t>
+            <w:tcW w:w="11040" w:type="dxa"/>
+            <w:gridSpan w:val="24"/>
+            <w:shd w:fill="1F3864" w:val="clear"/>
+            <w:vAlign w:val="center"/>
+          </w:tcPr>
+          <w:p>
+            <w:pPr>
+              <w:spacing w:before="0" w:after="2" w:line="220" w:lineRule="auto"/>
+              <w:ind w:left="0" w:right="0" w:hanging="0"/>
+              <w:contextualSpacing w:val="1"/>
+              <w:jc w:val="center"/>
+              <w:rPr>
+                <w:rFonts w:ascii="Calibri" w:cs="Calibri" w:eastAsia="Calibri" w:hAnsi="Calibri"/>
+                <w:b w:val="1"/>
+                <w:bCs w:val="1"/>
+                <w:color w:val="ffffff"/>
+                <w:sz w:val="24"/>
+                <w:szCs w:val="24"/>
+              </w:rPr>
+            </w:pPr>
+            <w:r>
+              <w:rPr>
+                <w:rFonts w:ascii="Calibri" w:cs="Calibri" w:eastAsia="Calibri" w:hAnsi="Calibri"/>
+                <w:b w:val="1"/>
+                <w:bCs w:val="1"/>
+                <w:color w:val="ffffff"/>
+                <w:sz w:val="24"/>
+                <w:szCs w:val="24"/>
+                <w:rtl w:val="0"/>
+              </w:rPr>
+              <w:t xml:space="preserve">PUBLICATION AND POSITIONS OF RESPONSIBILITY</w:t>
             </w:r>
           </w:p>
         </w:tc>
@@ -5404,63 +5502,85 @@
           <w:tcPr>
             <w:tcW w:w="1840" w:type="dxa"/>
             <w:gridSpan w:val="4"/>
-            <w:shd w:fill="1F3864" w:val="clear"/>
-            <w:vAlign w:val="center"/>
-          </w:tcPr>
-          <w:p>
-            <w:pPr>
-              <w:spacing w:before="0" w:after="8" w:line="240" w:lineRule="auto"/>
-              <w:ind w:left="0" w:right="0" w:hanging="0"/>
-              <w:contextualSpacing w:val="1"/>
-              <w:jc w:val="center"/>
-              <w:rPr>
-                <w:rFonts w:ascii="Calibri" w:cs="Calibri" w:eastAsia="Calibri" w:hAnsi="Calibri"/>
-                <w:b w:val="1"/>
-                <w:bCs w:val="1"/>
-                <w:color w:val="ffffff"/>
-                <w:sz w:val="24"/>
-                <w:szCs w:val="24"/>
-              </w:rPr>
-            </w:pPr>
-            <w:r>
-              <w:rPr>
-                <w:rFonts w:ascii="Calibri" w:cs="Calibri" w:eastAsia="Calibri" w:hAnsi="Calibri"/>
-                <w:b w:val="1"/>
-                <w:bCs w:val="1"/>
-                <w:color w:val="ffffff"/>
-                <w:sz w:val="24"/>
-                <w:szCs w:val="24"/>
-                <w:rtl w:val="0"/>
-              </w:rPr>
-              <w:t xml:space="preserve">EXTRA-</w:t>
-            </w:r>
-          </w:p>
-          <w:p>
-            <w:pPr>
-              <w:spacing w:before="0" w:after="8" w:line="240" w:lineRule="auto"/>
-              <w:ind w:left="0" w:right="0" w:hanging="0"/>
-              <w:contextualSpacing w:val="1"/>
-              <w:jc w:val="center"/>
-              <w:rPr>
-                <w:rFonts w:ascii="Calibri" w:cs="Calibri" w:eastAsia="Calibri" w:hAnsi="Calibri"/>
-                <w:b w:val="1"/>
-                <w:bCs w:val="1"/>
-                <w:color w:val="ffffff"/>
-                <w:sz w:val="24"/>
-                <w:szCs w:val="24"/>
-              </w:rPr>
-            </w:pPr>
-            <w:r>
-              <w:rPr>
-                <w:rFonts w:ascii="Calibri" w:cs="Calibri" w:eastAsia="Calibri" w:hAnsi="Calibri"/>
-                <w:b w:val="1"/>
-                <w:bCs w:val="1"/>
-                <w:color w:val="ffffff"/>
-                <w:sz w:val="24"/>
-                <w:szCs w:val="24"/>
-                <w:rtl w:val="0"/>
-              </w:rPr>
-              <w:t xml:space="preserve">CURRICULARS</w:t>
+            <w:shd w:fill="D9E2F3" w:val="clear"/>
+            <w:vAlign w:val="center"/>
+          </w:tcPr>
+          <w:p>
+            <w:pPr>
+              <w:spacing w:before="0" w:after="2" w:line="220" w:lineRule="auto"/>
+              <w:ind w:left="0" w:right="0" w:hanging="0"/>
+              <w:contextualSpacing w:val="1"/>
+              <w:jc w:val="center"/>
+              <w:rPr>
+                <w:rFonts w:ascii="Calibri" w:cs="Calibri" w:eastAsia="Calibri" w:hAnsi="Calibri"/>
+                <w:b w:val="1"/>
+                <w:bCs w:val="1"/>
+                <w:sz w:val="20"/>
+                <w:szCs w:val="20"/>
+              </w:rPr>
+            </w:pPr>
+            <w:r>
+              <w:rPr>
+                <w:rFonts w:ascii="Calibri" w:cs="Calibri" w:eastAsia="Calibri" w:hAnsi="Calibri"/>
+                <w:b w:val="1"/>
+                <w:bCs w:val="1"/>
+                <w:sz w:val="20"/>
+                <w:szCs w:val="20"/>
+                <w:rtl w:val="0"/>
+              </w:rPr>
+              <w:t xml:space="preserve">2024 IEEE CONNECT</w:t>
+            </w:r>
+          </w:p>
+          <w:p>
+            <w:pPr>
+              <w:spacing w:before="0" w:after="2" w:line="220" w:lineRule="auto"/>
+              <w:ind w:left="0" w:right="0" w:hanging="0"/>
+              <w:contextualSpacing w:val="1"/>
+              <w:jc w:val="center"/>
+              <w:rPr>
+                <w:rFonts w:ascii="Calibri" w:cs="Calibri" w:eastAsia="Calibri" w:hAnsi="Calibri"/>
+                <w:i w:val="1"/>
+                <w:iCs w:val="1"/>
+                <w:sz w:val="20"/>
+                <w:szCs w:val="20"/>
+              </w:rPr>
+            </w:pPr>
+            <w:r>
+              <w:rPr>
+                <w:rFonts w:ascii="Calibri" w:cs="Calibri" w:eastAsia="Calibri" w:hAnsi="Calibri"/>
+                <w:i w:val="1"/>
+                <w:iCs w:val="1"/>
+                <w:sz w:val="20"/>
+                <w:szCs w:val="20"/>
+                <w:rtl w:val="0"/>
+              </w:rPr>
+              <w:t xml:space="preserve">Publication</w:t>
+            </w:r>
+          </w:p>
+          <w:p>
+            <w:pPr>
+              <w:spacing w:before="0" w:after="2" w:line="220" w:lineRule="auto"/>
+              <w:ind w:left="0" w:right="0" w:hanging="0"/>
+              <w:contextualSpacing w:val="1"/>
+              <w:jc w:val="center"/>
+              <w:rPr>
+                <w:rFonts w:ascii="Calibri" w:cs="Calibri" w:eastAsia="Calibri" w:hAnsi="Calibri"/>
+                <w:i w:val="1"/>
+                <w:iCs w:val="1"/>
+                <w:sz w:val="20"/>
+                <w:szCs w:val="20"/>
+              </w:rPr>
+            </w:pPr>
+            <w:r>
+              <w:rPr>
+                <w:rFonts w:ascii="Calibri" w:cs="Calibri" w:eastAsia="Calibri" w:hAnsi="Calibri"/>
+                <w:i w:val="1"/>
+                <w:iCs w:val="1"/>
+                <w:sz w:val="20"/>
+                <w:szCs w:val="20"/>
+                <w:rtl w:val="0"/>
+              </w:rPr>
+              <w:t xml:space="preserve">(Jul'24)</w:t>
             </w:r>
           </w:p>
         </w:tc>
@@ -5468,15 +5588,44 @@
           <w:tcPr>
             <w:tcW w:w="9200" w:type="dxa"/>
             <w:gridSpan w:val="20"/>
-            <w:vAlign w:val="center"/>
-          </w:tcPr>
+            <w:vAlign w:val="top"/>
+          </w:tcPr>
+          <w:p>
+            <w:pPr>
+              <w:spacing w:before="0" w:after="2" w:line="220" w:lineRule="auto"/>
+              <w:ind w:left="0" w:right="0" w:hanging="0"/>
+              <w:contextualSpacing w:val="1"/>
+              <w:rPr>
+                <w:rFonts w:ascii="Calibri" w:cs="Calibri" w:eastAsia="Calibri" w:hAnsi="Calibri"/>
+                <w:b w:val="1"/>
+                <w:bCs w:val="1"/>
+                <w:i w:val="1"/>
+                <w:iCs w:val="1"/>
+                <w:sz w:val="20"/>
+                <w:szCs w:val="20"/>
+              </w:rPr>
+            </w:pPr>
+            <w:r>
+              <w:rPr>
+                <w:rFonts w:ascii="Calibri" w:cs="Calibri" w:eastAsia="Calibri" w:hAnsi="Calibri"/>
+                <w:b w:val="1"/>
+                <w:bCs w:val="1"/>
+                <w:i w:val="1"/>
+                <w:iCs w:val="1"/>
+                <w:sz w:val="20"/>
+                <w:szCs w:val="20"/>
+                <w:rtl w:val="0"/>
+              </w:rPr>
+              <w:t xml:space="preserve">Comparative study of path-planning algorithms for autonomous mobile robots</w:t>
+            </w:r>
+          </w:p>
           <w:p>
             <w:pPr>
               <w:numPr>
                 <w:ilvl w:val="0"/>
                 <w:numId w:val="3"/>
               </w:numPr>
-              <w:spacing w:before="0" w:after="8" w:line="240" w:lineRule="auto"/>
+              <w:spacing w:before="0" w:after="2" w:line="220" w:lineRule="auto"/>
               <w:ind w:left="158" w:right="0" w:hanging="158"/>
               <w:contextualSpacing w:val="1"/>
               <w:rPr>
@@ -5492,92 +5641,47 @@
                 <w:szCs w:val="20"/>
                 <w:rtl w:val="0"/>
               </w:rPr>
-              <w:t xml:space="preserve">Won </w:t>
-            </w:r>
-            <w:r>
-              <w:rPr>
-                <w:rFonts w:ascii="Calibri" w:cs="Calibri" w:eastAsia="Calibri" w:hAnsi="Calibri"/>
-                <w:b w:val="1"/>
-                <w:bCs w:val="1"/>
-                <w:sz w:val="20"/>
-                <w:szCs w:val="20"/>
-                <w:rtl w:val="0"/>
-              </w:rPr>
-              <w:t xml:space="preserve">15+ medals</w:t>
-            </w:r>
-            <w:r>
-              <w:rPr>
-                <w:rFonts w:ascii="Calibri" w:cs="Calibri" w:eastAsia="Calibri" w:hAnsi="Calibri"/>
-                <w:sz w:val="20"/>
-                <w:szCs w:val="20"/>
-                <w:rtl w:val="0"/>
-              </w:rPr>
-              <w:t xml:space="preserve"> across all strokes at school and district level over </w:t>
-            </w:r>
-            <w:r>
-              <w:rPr>
-                <w:rFonts w:ascii="Calibri" w:cs="Calibri" w:eastAsia="Calibri" w:hAnsi="Calibri"/>
-                <w:b w:val="1"/>
-                <w:bCs w:val="1"/>
-                <w:sz w:val="20"/>
-                <w:szCs w:val="20"/>
-                <w:rtl w:val="0"/>
-              </w:rPr>
-              <w:t xml:space="preserve">5 years</w:t>
-            </w:r>
-            <w:r>
-              <w:rPr>
-                <w:rFonts w:ascii="Calibri" w:cs="Calibri" w:eastAsia="Calibri" w:hAnsi="Calibri"/>
-                <w:sz w:val="20"/>
-                <w:szCs w:val="20"/>
-                <w:rtl w:val="0"/>
-              </w:rPr>
-              <w:t xml:space="preserve"> of swimming</w:t>
-            </w:r>
-          </w:p>
-          <w:p>
-            <w:pPr>
-              <w:numPr>
-                <w:ilvl w:val="0"/>
-                <w:numId w:val="3"/>
-              </w:numPr>
-              <w:spacing w:before="0" w:after="8" w:line="240" w:lineRule="auto"/>
-              <w:ind w:left="158" w:right="0" w:hanging="158"/>
-              <w:contextualSpacing w:val="1"/>
-              <w:rPr>
-                <w:rFonts w:ascii="Calibri" w:cs="Calibri" w:eastAsia="Calibri" w:hAnsi="Calibri"/>
-                <w:sz w:val="20"/>
-                <w:szCs w:val="20"/>
-              </w:rPr>
-            </w:pPr>
-            <w:r>
-              <w:rPr>
-                <w:rFonts w:ascii="Calibri" w:cs="Calibri" w:eastAsia="Calibri" w:hAnsi="Calibri"/>
-                <w:sz w:val="20"/>
-                <w:szCs w:val="20"/>
-                <w:rtl w:val="0"/>
-              </w:rPr>
-              <w:t xml:space="preserve">Represented school and college </w:t>
-            </w:r>
-            <w:r>
-              <w:rPr>
-                <w:rFonts w:ascii="Calibri" w:cs="Calibri" w:eastAsia="Calibri" w:hAnsi="Calibri"/>
-                <w:b w:val="1"/>
-                <w:bCs w:val="1"/>
-                <w:sz w:val="20"/>
-                <w:szCs w:val="20"/>
-                <w:rtl w:val="0"/>
-              </w:rPr>
-              <w:t xml:space="preserve">cricket</w:t>
-            </w:r>
-            <w:r>
-              <w:rPr>
-                <w:rFonts w:ascii="Calibri" w:cs="Calibri" w:eastAsia="Calibri" w:hAnsi="Calibri"/>
-                <w:sz w:val="20"/>
-                <w:szCs w:val="20"/>
-                <w:rtl w:val="0"/>
-              </w:rPr>
-              <w:t xml:space="preserve"> teams at district and state-level tournaments</w:t>
+              <w:t xml:space="preserve">Co-authored </w:t>
+            </w:r>
+            <w:r>
+              <w:rPr>
+                <w:rFonts w:ascii="Calibri" w:cs="Calibri" w:eastAsia="Calibri" w:hAnsi="Calibri"/>
+                <w:b w:val="1"/>
+                <w:bCs w:val="1"/>
+                <w:sz w:val="20"/>
+                <w:szCs w:val="20"/>
+                <w:rtl w:val="0"/>
+              </w:rPr>
+              <w:t xml:space="preserve">Bidirectional A*, D* and D* Lite</w:t>
+            </w:r>
+            <w:r>
+              <w:rPr>
+                <w:rFonts w:ascii="Calibri" w:cs="Calibri" w:eastAsia="Calibri" w:hAnsi="Calibri"/>
+                <w:sz w:val="20"/>
+                <w:szCs w:val="20"/>
+                <w:rtl w:val="0"/>
+              </w:rPr>
+              <w:t xml:space="preserve"> comparison; validated on a </w:t>
+            </w:r>
+            <w:r>
+              <w:rPr>
+                <w:rFonts w:ascii="Calibri" w:cs="Calibri" w:eastAsia="Calibri" w:hAnsi="Calibri"/>
+                <w:b w:val="1"/>
+                <w:bCs w:val="1"/>
+                <w:sz w:val="20"/>
+                <w:szCs w:val="20"/>
+                <w:rtl w:val="0"/>
+              </w:rPr>
+              <w:t xml:space="preserve">NodeMCU</w:t>
+            </w:r>
+            <w:r>
+              <w:rPr>
+                <w:rFonts w:ascii="Calibri" w:cs="Calibri" w:eastAsia="Calibri" w:hAnsi="Calibri"/>
+                <w:sz w:val="20"/>
+                <w:szCs w:val="20"/>
+                <w:rtl w:val="0"/>
+              </w:rPr>
+              <w:t xml:space="preserve"> mecanum-wheel robot</w:t>
             </w:r>
           </w:p>
         </w:tc>
@@ -5589,13 +5693,533 @@
         </w:trPr>
         <w:tc>
           <w:tcPr>
+            <w:tcW w:w="1840" w:type="dxa"/>
+            <w:gridSpan w:val="4"/>
+            <w:shd w:fill="D9E2F3" w:val="clear"/>
+            <w:vAlign w:val="center"/>
+          </w:tcPr>
+          <w:p>
+            <w:pPr>
+              <w:spacing w:before="0" w:after="2" w:line="220" w:lineRule="auto"/>
+              <w:ind w:left="0" w:right="0" w:hanging="0"/>
+              <w:contextualSpacing w:val="1"/>
+              <w:jc w:val="center"/>
+              <w:rPr>
+                <w:rFonts w:ascii="Calibri" w:cs="Calibri" w:eastAsia="Calibri" w:hAnsi="Calibri"/>
+                <w:b w:val="1"/>
+                <w:bCs w:val="1"/>
+                <w:sz w:val="20"/>
+                <w:szCs w:val="20"/>
+              </w:rPr>
+            </w:pPr>
+            <w:r>
+              <w:rPr>
+                <w:rFonts w:ascii="Calibri" w:cs="Calibri" w:eastAsia="Calibri" w:hAnsi="Calibri"/>
+                <w:b w:val="1"/>
+                <w:bCs w:val="1"/>
+                <w:sz w:val="20"/>
+                <w:szCs w:val="20"/>
+                <w:rtl w:val="0"/>
+              </w:rPr>
+              <w:t xml:space="preserve">Deputy Placement</w:t>
+            </w:r>
+          </w:p>
+          <w:p>
+            <w:pPr>
+              <w:spacing w:before="0" w:after="2" w:line="220" w:lineRule="auto"/>
+              <w:ind w:left="0" w:right="0" w:hanging="0"/>
+              <w:contextualSpacing w:val="1"/>
+              <w:jc w:val="center"/>
+              <w:rPr>
+                <w:rFonts w:ascii="Calibri" w:cs="Calibri" w:eastAsia="Calibri" w:hAnsi="Calibri"/>
+                <w:b w:val="1"/>
+                <w:bCs w:val="1"/>
+                <w:sz w:val="20"/>
+                <w:szCs w:val="20"/>
+              </w:rPr>
+            </w:pPr>
+            <w:r>
+              <w:rPr>
+                <w:rFonts w:ascii="Calibri" w:cs="Calibri" w:eastAsia="Calibri" w:hAnsi="Calibri"/>
+                <w:b w:val="1"/>
+                <w:bCs w:val="1"/>
+                <w:sz w:val="20"/>
+                <w:szCs w:val="20"/>
+                <w:rtl w:val="0"/>
+              </w:rPr>
+              <w:t xml:space="preserve">Coordinator, IITM</w:t>
+            </w:r>
+          </w:p>
+          <w:p>
+            <w:pPr>
+              <w:spacing w:before="0" w:after="2" w:line="220" w:lineRule="auto"/>
+              <w:ind w:left="0" w:right="0" w:hanging="0"/>
+              <w:contextualSpacing w:val="1"/>
+              <w:jc w:val="center"/>
+              <w:rPr>
+                <w:rFonts w:ascii="Calibri" w:cs="Calibri" w:eastAsia="Calibri" w:hAnsi="Calibri"/>
+                <w:i w:val="1"/>
+                <w:iCs w:val="1"/>
+                <w:sz w:val="20"/>
+                <w:szCs w:val="20"/>
+              </w:rPr>
+            </w:pPr>
+            <w:r>
+              <w:rPr>
+                <w:rFonts w:ascii="Calibri" w:cs="Calibri" w:eastAsia="Calibri" w:hAnsi="Calibri"/>
+                <w:i w:val="1"/>
+                <w:iCs w:val="1"/>
+                <w:sz w:val="20"/>
+                <w:szCs w:val="20"/>
+                <w:rtl w:val="0"/>
+              </w:rPr>
+              <w:t xml:space="preserve">(Aug'25 – Present)</w:t>
+            </w:r>
+          </w:p>
+        </w:tc>
+        <w:tc>
+          <w:tcPr>
+            <w:tcW w:w="9200" w:type="dxa"/>
+            <w:gridSpan w:val="20"/>
+            <w:shd w:fill="EDF2FA" w:val="clear"/>
+            <w:vAlign w:val="top"/>
+          </w:tcPr>
+          <w:p>
+            <w:pPr>
+              <w:spacing w:before="0" w:after="2" w:line="220" w:lineRule="auto"/>
+              <w:ind w:left="0" w:right="0" w:hanging="0"/>
+              <w:contextualSpacing w:val="1"/>
+              <w:rPr>
+                <w:rFonts w:ascii="Calibri" w:cs="Calibri" w:eastAsia="Calibri" w:hAnsi="Calibri"/>
+                <w:b w:val="1"/>
+                <w:bCs w:val="1"/>
+                <w:i w:val="1"/>
+                <w:iCs w:val="1"/>
+                <w:sz w:val="20"/>
+                <w:szCs w:val="20"/>
+              </w:rPr>
+            </w:pPr>
+            <w:r>
+              <w:rPr>
+                <w:rFonts w:ascii="Calibri" w:cs="Calibri" w:eastAsia="Calibri" w:hAnsi="Calibri"/>
+                <w:b w:val="1"/>
+                <w:bCs w:val="1"/>
+                <w:i w:val="1"/>
+                <w:iCs w:val="1"/>
+                <w:sz w:val="20"/>
+                <w:szCs w:val="20"/>
+                <w:rtl w:val="0"/>
+              </w:rPr>
+              <w:t xml:space="preserve">Academic Affairs Secretary, Placement &amp; Internship Cell, Data Science and AI</w:t>
+            </w:r>
+          </w:p>
+          <w:p>
+            <w:pPr>
+              <w:numPr>
+                <w:ilvl w:val="0"/>
+                <w:numId w:val="3"/>
+              </w:numPr>
+              <w:spacing w:before="0" w:after="2" w:line="220" w:lineRule="auto"/>
+              <w:ind w:left="158" w:right="0" w:hanging="158"/>
+              <w:contextualSpacing w:val="1"/>
+              <w:rPr>
+                <w:rFonts w:ascii="Calibri" w:cs="Calibri" w:eastAsia="Calibri" w:hAnsi="Calibri"/>
+                <w:sz w:val="20"/>
+                <w:szCs w:val="20"/>
+              </w:rPr>
+            </w:pPr>
+            <w:r>
+              <w:rPr>
+                <w:rFonts w:ascii="Calibri" w:cs="Calibri" w:eastAsia="Calibri" w:hAnsi="Calibri"/>
+                <w:sz w:val="20"/>
+                <w:szCs w:val="20"/>
+                <w:rtl w:val="0"/>
+              </w:rPr>
+              <w:t xml:space="preserve">Industry outreach, campus logistics and </w:t>
+            </w:r>
+            <w:r>
+              <w:rPr>
+                <w:rFonts w:ascii="Calibri" w:cs="Calibri" w:eastAsia="Calibri" w:hAnsi="Calibri"/>
+                <w:b w:val="1"/>
+                <w:bCs w:val="1"/>
+                <w:sz w:val="20"/>
+                <w:szCs w:val="20"/>
+                <w:rtl w:val="0"/>
+              </w:rPr>
+              <w:t xml:space="preserve">end-to-end recruitment</w:t>
+            </w:r>
+            <w:r>
+              <w:rPr>
+                <w:rFonts w:ascii="Calibri" w:cs="Calibri" w:eastAsia="Calibri" w:hAnsi="Calibri"/>
+                <w:sz w:val="20"/>
+                <w:szCs w:val="20"/>
+                <w:rtl w:val="0"/>
+              </w:rPr>
+              <w:t xml:space="preserve">; workflows to streamline operations</w:t>
+            </w:r>
+          </w:p>
+        </w:tc>
+      </w:tr>
+      <w:tr>
+        <w:trPr>
+          <w:cantSplit w:val="1"/>
+          <w:tblHeader w:val="0"/>
+        </w:trPr>
+        <w:tc>
+          <w:tcPr>
+            <w:tcW w:w="1840" w:type="dxa"/>
+            <w:gridSpan w:val="4"/>
+            <w:shd w:fill="D9E2F3" w:val="clear"/>
+            <w:vAlign w:val="center"/>
+          </w:tcPr>
+          <w:p>
+            <w:pPr>
+              <w:spacing w:before="0" w:after="2" w:line="220" w:lineRule="auto"/>
+              <w:ind w:left="0" w:right="0" w:hanging="0"/>
+              <w:contextualSpacing w:val="1"/>
+              <w:jc w:val="center"/>
+              <w:rPr>
+                <w:rFonts w:ascii="Calibri" w:cs="Calibri" w:eastAsia="Calibri" w:hAnsi="Calibri"/>
+                <w:b w:val="1"/>
+                <w:bCs w:val="1"/>
+                <w:sz w:val="20"/>
+                <w:szCs w:val="20"/>
+              </w:rPr>
+            </w:pPr>
+            <w:r>
+              <w:rPr>
+                <w:rFonts w:ascii="Calibri" w:cs="Calibri" w:eastAsia="Calibri" w:hAnsi="Calibri"/>
+                <w:b w:val="1"/>
+                <w:bCs w:val="1"/>
+                <w:sz w:val="20"/>
+                <w:szCs w:val="20"/>
+                <w:rtl w:val="0"/>
+              </w:rPr>
+              <w:t xml:space="preserve">Lead Coordinator</w:t>
+            </w:r>
+          </w:p>
+          <w:p>
+            <w:pPr>
+              <w:spacing w:before="0" w:after="2" w:line="220" w:lineRule="auto"/>
+              <w:ind w:left="0" w:right="0" w:hanging="0"/>
+              <w:contextualSpacing w:val="1"/>
+              <w:jc w:val="center"/>
+              <w:rPr>
+                <w:rFonts w:ascii="Calibri" w:cs="Calibri" w:eastAsia="Calibri" w:hAnsi="Calibri"/>
+                <w:i w:val="1"/>
+                <w:iCs w:val="1"/>
+                <w:sz w:val="20"/>
+                <w:szCs w:val="20"/>
+              </w:rPr>
+            </w:pPr>
+            <w:r>
+              <w:rPr>
+                <w:rFonts w:ascii="Calibri" w:cs="Calibri" w:eastAsia="Calibri" w:hAnsi="Calibri"/>
+                <w:i w:val="1"/>
+                <w:iCs w:val="1"/>
+                <w:sz w:val="20"/>
+                <w:szCs w:val="20"/>
+                <w:rtl w:val="0"/>
+              </w:rPr>
+              <w:t xml:space="preserve">Gokulashtami</w:t>
+            </w:r>
+          </w:p>
+          <w:p>
+            <w:pPr>
+              <w:spacing w:before="0" w:after="2" w:line="220" w:lineRule="auto"/>
+              <w:ind w:left="0" w:right="0" w:hanging="0"/>
+              <w:contextualSpacing w:val="1"/>
+              <w:jc w:val="center"/>
+              <w:rPr>
+                <w:rFonts w:ascii="Calibri" w:cs="Calibri" w:eastAsia="Calibri" w:hAnsi="Calibri"/>
+                <w:i w:val="1"/>
+                <w:iCs w:val="1"/>
+                <w:sz w:val="20"/>
+                <w:szCs w:val="20"/>
+              </w:rPr>
+            </w:pPr>
+            <w:r>
+              <w:rPr>
+                <w:rFonts w:ascii="Calibri" w:cs="Calibri" w:eastAsia="Calibri" w:hAnsi="Calibri"/>
+                <w:i w:val="1"/>
+                <w:iCs w:val="1"/>
+                <w:sz w:val="20"/>
+                <w:szCs w:val="20"/>
+                <w:rtl w:val="0"/>
+              </w:rPr>
+              <w:t xml:space="preserve">(Oct'23 &amp; Oct'24)</w:t>
+            </w:r>
+          </w:p>
+        </w:tc>
+        <w:tc>
+          <w:tcPr>
+            <w:tcW w:w="9200" w:type="dxa"/>
+            <w:gridSpan w:val="20"/>
+            <w:vAlign w:val="top"/>
+          </w:tcPr>
+          <w:p>
+            <w:pPr>
+              <w:spacing w:before="0" w:after="2" w:line="220" w:lineRule="auto"/>
+              <w:ind w:left="0" w:right="0" w:hanging="0"/>
+              <w:contextualSpacing w:val="1"/>
+              <w:rPr>
+                <w:rFonts w:ascii="Calibri" w:cs="Calibri" w:eastAsia="Calibri" w:hAnsi="Calibri"/>
+                <w:b w:val="1"/>
+                <w:bCs w:val="1"/>
+                <w:i w:val="1"/>
+                <w:iCs w:val="1"/>
+                <w:sz w:val="20"/>
+                <w:szCs w:val="20"/>
+              </w:rPr>
+            </w:pPr>
+            <w:r>
+              <w:rPr>
+                <w:rFonts w:ascii="Calibri" w:cs="Calibri" w:eastAsia="Calibri" w:hAnsi="Calibri"/>
+                <w:b w:val="1"/>
+                <w:bCs w:val="1"/>
+                <w:i w:val="1"/>
+                <w:iCs w:val="1"/>
+                <w:sz w:val="20"/>
+                <w:szCs w:val="20"/>
+                <w:rtl w:val="0"/>
+              </w:rPr>
+              <w:t xml:space="preserve">Annual cultural fest, Amrita Vishwa Vidyapeetham</w:t>
+            </w:r>
+          </w:p>
+          <w:p>
+            <w:pPr>
+              <w:numPr>
+                <w:ilvl w:val="0"/>
+                <w:numId w:val="3"/>
+              </w:numPr>
+              <w:spacing w:before="0" w:after="2" w:line="220" w:lineRule="auto"/>
+              <w:ind w:left="158" w:right="0" w:hanging="158"/>
+              <w:contextualSpacing w:val="1"/>
+              <w:rPr>
+                <w:rFonts w:ascii="Calibri" w:cs="Calibri" w:eastAsia="Calibri" w:hAnsi="Calibri"/>
+                <w:sz w:val="20"/>
+                <w:szCs w:val="20"/>
+              </w:rPr>
+            </w:pPr>
+            <w:r>
+              <w:rPr>
+                <w:rFonts w:ascii="Calibri" w:cs="Calibri" w:eastAsia="Calibri" w:hAnsi="Calibri"/>
+                <w:sz w:val="20"/>
+                <w:szCs w:val="20"/>
+                <w:rtl w:val="0"/>
+              </w:rPr>
+              <w:t xml:space="preserve">Led two editions; </w:t>
+            </w:r>
+            <w:r>
+              <w:rPr>
+                <w:rFonts w:ascii="Calibri" w:cs="Calibri" w:eastAsia="Calibri" w:hAnsi="Calibri"/>
+                <w:b w:val="1"/>
+                <w:bCs w:val="1"/>
+                <w:sz w:val="20"/>
+                <w:szCs w:val="20"/>
+                <w:rtl w:val="0"/>
+              </w:rPr>
+              <w:t xml:space="preserve">Best Decoration</w:t>
+            </w:r>
+            <w:r>
+              <w:rPr>
+                <w:rFonts w:ascii="Calibri" w:cs="Calibri" w:eastAsia="Calibri" w:hAnsi="Calibri"/>
+                <w:sz w:val="20"/>
+                <w:szCs w:val="20"/>
+                <w:rtl w:val="0"/>
+              </w:rPr>
+              <w:t xml:space="preserve">; department </w:t>
+            </w:r>
+            <w:r>
+              <w:rPr>
+                <w:rFonts w:ascii="Calibri" w:cs="Calibri" w:eastAsia="Calibri" w:hAnsi="Calibri"/>
+                <w:b w:val="1"/>
+                <w:bCs w:val="1"/>
+                <w:sz w:val="20"/>
+                <w:szCs w:val="20"/>
+                <w:rtl w:val="0"/>
+              </w:rPr>
+              <w:t xml:space="preserve">Runner-up (2023)</w:t>
+            </w:r>
+            <w:r>
+              <w:rPr>
+                <w:rFonts w:ascii="Calibri" w:cs="Calibri" w:eastAsia="Calibri" w:hAnsi="Calibri"/>
+                <w:sz w:val="20"/>
+                <w:szCs w:val="20"/>
+                <w:rtl w:val="0"/>
+              </w:rPr>
+              <w:t xml:space="preserve"> and </w:t>
+            </w:r>
+            <w:r>
+              <w:rPr>
+                <w:rFonts w:ascii="Calibri" w:cs="Calibri" w:eastAsia="Calibri" w:hAnsi="Calibri"/>
+                <w:b w:val="1"/>
+                <w:bCs w:val="1"/>
+                <w:sz w:val="20"/>
+                <w:szCs w:val="20"/>
+                <w:rtl w:val="0"/>
+              </w:rPr>
+              <w:t xml:space="preserve">Winner (2024)</w:t>
+            </w:r>
+            <w:r>
+              <w:rPr>
+                <w:rFonts w:ascii="Calibri" w:cs="Calibri" w:eastAsia="Calibri" w:hAnsi="Calibri"/>
+                <w:sz w:val="20"/>
+                <w:szCs w:val="20"/>
+                <w:rtl w:val="0"/>
+              </w:rPr>
+              <w:t xml:space="preserve"> overall</w:t>
+            </w:r>
+          </w:p>
+        </w:tc>
+      </w:tr>
+      <w:tr>
+        <w:trPr>
+          <w:cantSplit w:val="1"/>
+          <w:tblHeader w:val="0"/>
+        </w:trPr>
+        <w:tc>
+          <w:tcPr>
+            <w:tcW w:w="1840" w:type="dxa"/>
+            <w:gridSpan w:val="4"/>
+            <w:shd w:fill="1F3864" w:val="clear"/>
+            <w:vAlign w:val="center"/>
+          </w:tcPr>
+          <w:p>
+            <w:pPr>
+              <w:spacing w:before="0" w:after="2" w:line="220" w:lineRule="auto"/>
+              <w:ind w:left="0" w:right="0" w:hanging="0"/>
+              <w:contextualSpacing w:val="1"/>
+              <w:jc w:val="center"/>
+              <w:rPr>
+                <w:rFonts w:ascii="Calibri" w:cs="Calibri" w:eastAsia="Calibri" w:hAnsi="Calibri"/>
+                <w:b w:val="1"/>
+                <w:bCs w:val="1"/>
+                <w:color w:val="ffffff"/>
+                <w:sz w:val="24"/>
+                <w:szCs w:val="24"/>
+              </w:rPr>
+            </w:pPr>
+            <w:r>
+              <w:rPr>
+                <w:rFonts w:ascii="Calibri" w:cs="Calibri" w:eastAsia="Calibri" w:hAnsi="Calibri"/>
+                <w:b w:val="1"/>
+                <w:bCs w:val="1"/>
+                <w:color w:val="ffffff"/>
+                <w:sz w:val="24"/>
+                <w:szCs w:val="24"/>
+                <w:rtl w:val="0"/>
+              </w:rPr>
+              <w:t xml:space="preserve">EXTRA-</w:t>
+            </w:r>
+          </w:p>
+          <w:p>
+            <w:pPr>
+              <w:spacing w:before="0" w:after="2" w:line="220" w:lineRule="auto"/>
+              <w:ind w:left="0" w:right="0" w:hanging="0"/>
+              <w:contextualSpacing w:val="1"/>
+              <w:jc w:val="center"/>
+              <w:rPr>
+                <w:rFonts w:ascii="Calibri" w:cs="Calibri" w:eastAsia="Calibri" w:hAnsi="Calibri"/>
+                <w:b w:val="1"/>
+                <w:bCs w:val="1"/>
+                <w:color w:val="ffffff"/>
+                <w:sz w:val="24"/>
+                <w:szCs w:val="24"/>
+              </w:rPr>
+            </w:pPr>
+            <w:r>
+              <w:rPr>
+                <w:rFonts w:ascii="Calibri" w:cs="Calibri" w:eastAsia="Calibri" w:hAnsi="Calibri"/>
+                <w:b w:val="1"/>
+                <w:bCs w:val="1"/>
+                <w:color w:val="ffffff"/>
+                <w:sz w:val="24"/>
+                <w:szCs w:val="24"/>
+                <w:rtl w:val="0"/>
+              </w:rPr>
+              <w:t xml:space="preserve">CURRICULARS</w:t>
+            </w:r>
+          </w:p>
+        </w:tc>
+        <w:tc>
+          <w:tcPr>
+            <w:tcW w:w="9200" w:type="dxa"/>
+            <w:gridSpan w:val="20"/>
+            <w:vAlign w:val="center"/>
+          </w:tcPr>
+          <w:p>
+            <w:pPr>
+              <w:numPr>
+                <w:ilvl w:val="0"/>
+                <w:numId w:val="3"/>
+              </w:numPr>
+              <w:spacing w:before="0" w:after="2" w:line="220" w:lineRule="auto"/>
+              <w:ind w:left="158" w:right="0" w:hanging="158"/>
+              <w:contextualSpacing w:val="1"/>
+              <w:rPr>
+                <w:rFonts w:ascii="Calibri" w:cs="Calibri" w:eastAsia="Calibri" w:hAnsi="Calibri"/>
+                <w:sz w:val="20"/>
+                <w:szCs w:val="20"/>
+              </w:rPr>
+            </w:pPr>
+            <w:r>
+              <w:rPr>
+                <w:rFonts w:ascii="Calibri" w:cs="Calibri" w:eastAsia="Calibri" w:hAnsi="Calibri"/>
+                <w:b w:val="1"/>
+                <w:bCs w:val="1"/>
+                <w:sz w:val="20"/>
+                <w:szCs w:val="20"/>
+                <w:rtl w:val="0"/>
+              </w:rPr>
+              <w:t xml:space="preserve">15+ swimming medals</w:t>
+            </w:r>
+            <w:r>
+              <w:rPr>
+                <w:rFonts w:ascii="Calibri" w:cs="Calibri" w:eastAsia="Calibri" w:hAnsi="Calibri"/>
+                <w:sz w:val="20"/>
+                <w:szCs w:val="20"/>
+                <w:rtl w:val="0"/>
+              </w:rPr>
+              <w:t xml:space="preserve"> over 5 years; school and college </w:t>
+            </w:r>
+            <w:r>
+              <w:rPr>
+                <w:rFonts w:ascii="Calibri" w:cs="Calibri" w:eastAsia="Calibri" w:hAnsi="Calibri"/>
+                <w:b w:val="1"/>
+                <w:bCs w:val="1"/>
+                <w:sz w:val="20"/>
+                <w:szCs w:val="20"/>
+                <w:rtl w:val="0"/>
+              </w:rPr>
+              <w:t xml:space="preserve">cricket</w:t>
+            </w:r>
+            <w:r>
+              <w:rPr>
+                <w:rFonts w:ascii="Calibri" w:cs="Calibri" w:eastAsia="Calibri" w:hAnsi="Calibri"/>
+                <w:sz w:val="20"/>
+                <w:szCs w:val="20"/>
+                <w:rtl w:val="0"/>
+              </w:rPr>
+              <w:t xml:space="preserve"> at district and state level</w:t>
+            </w:r>
+          </w:p>
+        </w:tc>
+      </w:tr>
+      <w:tr>
+        <w:trPr>
+          <w:cantSplit w:val="1"/>
+          <w:tblHeader w:val="0"/>
+        </w:trPr>
+        <w:tc>
+          <w:tcPr>
             <w:tcW w:w="11040" w:type="dxa"/>
             <w:gridSpan w:val="24"/>
             <w:vAlign w:val="center"/>
           </w:tcPr>
           <w:p>
             <w:pPr>
-              <w:spacing w:before="0" w:after="8" w:line="240" w:lineRule="auto"/>
+              <w:spacing w:before="0" w:after="2" w:line="220" w:lineRule="auto"/>
               <w:ind w:left="0" w:right="0" w:hanging="0"/>
               <w:contextualSpacing w:val="1"/>
               <w:rPr>

</xml_diff>